<commit_message>
Added both projects for the week 5 to source control.
</commit_message>
<xml_diff>
--- a/Activity5/CST-250-RS-T5-Activity5Guide.docx
+++ b/Activity5/CST-250-RS-T5-Activity5Guide.docx
@@ -1,6 +1,6 @@
 
 <file path=word/document.xml><?xml version="1.0" encoding="utf-8"?>
-<w:document xmlns:wpc="http://schemas.microsoft.com/office/word/2010/wordprocessingCanvas" xmlns:cx="http://schemas.microsoft.com/office/drawing/2014/chartex" xmlns:cx1="http://schemas.microsoft.com/office/drawing/2015/9/8/chartex" xmlns:cx2="http://schemas.microsoft.com/office/drawing/2015/10/21/chartex" xmlns:cx3="http://schemas.microsoft.com/office/drawing/2016/5/9/chartex" xmlns:cx4="http://schemas.microsoft.com/office/drawing/2016/5/10/chartex" xmlns:cx5="http://schemas.microsoft.com/office/drawing/2016/5/11/chartex" xmlns:cx6="http://schemas.microsoft.com/office/drawing/2016/5/12/chartex" xmlns:cx7="http://schemas.microsoft.com/office/drawing/2016/5/13/chartex" xmlns:cx8="http://schemas.microsoft.com/office/drawing/2016/5/14/chartex" xmlns:mc="http://schemas.openxmlformats.org/markup-compatibility/2006" xmlns:aink="http://schemas.microsoft.com/office/drawing/2016/ink" xmlns:am3d="http://schemas.microsoft.com/office/drawing/2017/model3d" xmlns:o="urn:schemas-microsoft-com:office:office" xmlns:oel="http://schemas.microsoft.com/office/2019/extlst" xmlns:r="http://schemas.openxmlformats.org/officeDocument/2006/relationships" xmlns:m="http://schemas.openxmlformats.org/officeDocument/2006/math" xmlns:v="urn:schemas-microsoft-com:vml" xmlns:wp14="http://schemas.microsoft.com/office/word/2010/wordprocessingDrawing" xmlns:wp="http://schemas.openxmlformats.org/drawingml/2006/wordprocessingDrawing" xmlns:w10="urn:schemas-microsoft-com:office:word" xmlns:w="http://schemas.openxmlformats.org/wordprocessingml/2006/main" xmlns:w14="http://schemas.microsoft.com/office/word/2010/wordml" xmlns:w15="http://schemas.microsoft.com/office/word/2012/wordml" xmlns:w16cex="http://schemas.microsoft.com/office/word/2018/wordml/cex" xmlns:w16cid="http://schemas.microsoft.com/office/word/2016/wordml/cid" xmlns:w16="http://schemas.microsoft.com/office/word/2018/wordml" xmlns:w16sdtdh="http://schemas.microsoft.com/office/word/2020/wordml/sdtdatahash" xmlns:w16se="http://schemas.microsoft.com/office/word/2015/wordml/symex" xmlns:wpg="http://schemas.microsoft.com/office/word/2010/wordprocessingGroup" xmlns:wpi="http://schemas.microsoft.com/office/word/2010/wordprocessingInk" xmlns:wne="http://schemas.microsoft.com/office/word/2006/wordml" xmlns:wps="http://schemas.microsoft.com/office/word/2010/wordprocessingShape" mc:Ignorable="w14 w15 w16se w16cid w16 w16cex w16sdtdh wp14">
+<w:document xmlns:wpc="http://schemas.microsoft.com/office/word/2010/wordprocessingCanvas" xmlns:cx="http://schemas.microsoft.com/office/drawing/2014/chartex" xmlns:cx1="http://schemas.microsoft.com/office/drawing/2015/9/8/chartex" xmlns:cx2="http://schemas.microsoft.com/office/drawing/2015/10/21/chartex" xmlns:cx3="http://schemas.microsoft.com/office/drawing/2016/5/9/chartex" xmlns:cx4="http://schemas.microsoft.com/office/drawing/2016/5/10/chartex" xmlns:cx5="http://schemas.microsoft.com/office/drawing/2016/5/11/chartex" xmlns:cx6="http://schemas.microsoft.com/office/drawing/2016/5/12/chartex" xmlns:cx7="http://schemas.microsoft.com/office/drawing/2016/5/13/chartex" xmlns:cx8="http://schemas.microsoft.com/office/drawing/2016/5/14/chartex" xmlns:mc="http://schemas.openxmlformats.org/markup-compatibility/2006" xmlns:aink="http://schemas.microsoft.com/office/drawing/2016/ink" xmlns:am3d="http://schemas.microsoft.com/office/drawing/2017/model3d" xmlns:o="urn:schemas-microsoft-com:office:office" xmlns:oel="http://schemas.microsoft.com/office/2019/extlst" xmlns:r="http://schemas.openxmlformats.org/officeDocument/2006/relationships" xmlns:m="http://schemas.openxmlformats.org/officeDocument/2006/math" xmlns:v="urn:schemas-microsoft-com:vml" xmlns:wp14="http://schemas.microsoft.com/office/word/2010/wordprocessingDrawing" xmlns:wp="http://schemas.openxmlformats.org/drawingml/2006/wordprocessingDrawing" xmlns:w10="urn:schemas-microsoft-com:office:word" xmlns:w="http://schemas.openxmlformats.org/wordprocessingml/2006/main" xmlns:w14="http://schemas.microsoft.com/office/word/2010/wordml" xmlns:w15="http://schemas.microsoft.com/office/word/2012/wordml" xmlns:w16cex="http://schemas.microsoft.com/office/word/2018/wordml/cex" xmlns:w16cid="http://schemas.microsoft.com/office/word/2016/wordml/cid" xmlns:w16="http://schemas.microsoft.com/office/word/2018/wordml" xmlns:w16du="http://schemas.microsoft.com/office/word/2023/wordml/word16du" xmlns:w16sdtdh="http://schemas.microsoft.com/office/word/2020/wordml/sdtdatahash" xmlns:w16sdtfl="http://schemas.microsoft.com/office/word/2024/wordml/sdtformatlock" xmlns:w16se="http://schemas.microsoft.com/office/word/2015/wordml/symex" xmlns:wpg="http://schemas.microsoft.com/office/word/2010/wordprocessingGroup" xmlns:wpi="http://schemas.microsoft.com/office/word/2010/wordprocessingInk" xmlns:wne="http://schemas.microsoft.com/office/word/2006/wordml" xmlns:wps="http://schemas.microsoft.com/office/word/2010/wordprocessingShape" mc:Ignorable="w14 w15 w16se w16cid w16 w16cex w16sdtdh w16sdtfl w16du wp14">
   <w:body>
     <w:p>
       <w:pPr>
@@ -9,12 +9,14 @@
         <w:rPr>
           <w:sz w:val="40"/>
           <w:szCs w:val="40"/>
+          <w:highlight w:val="yellow"/>
         </w:rPr>
       </w:pPr>
       <w:r>
         <w:rPr>
           <w:sz w:val="40"/>
           <w:szCs w:val="40"/>
+          <w:highlight w:val="yellow"/>
         </w:rPr>
         <w:t>Activity 5</w:t>
       </w:r>
@@ -22,6 +24,7 @@
         <w:rPr>
           <w:sz w:val="40"/>
           <w:szCs w:val="40"/>
+          <w:highlight w:val="yellow"/>
         </w:rPr>
         <w:t xml:space="preserve">: </w:t>
       </w:r>
@@ -29,6 +32,7 @@
         <w:rPr>
           <w:sz w:val="40"/>
           <w:szCs w:val="40"/>
+          <w:highlight w:val="yellow"/>
         </w:rPr>
         <w:t>Creating a Timer-Driven Game with Dynamic UI Controls</w:t>
       </w:r>
@@ -40,6 +44,7 @@
           <w:color w:val="auto"/>
           <w:sz w:val="24"/>
           <w:szCs w:val="24"/>
+          <w:highlight w:val="yellow"/>
         </w:rPr>
         <w:id w:val="-1325118389"/>
         <w:docPartObj>
@@ -61,6 +66,7 @@
             <w:spacing w:before="120" w:after="120" w:line="240" w:lineRule="auto"/>
             <w:rPr>
               <w:rFonts w:asciiTheme="minorHAnsi" w:hAnsiTheme="minorHAnsi"/>
+              <w:highlight w:val="yellow"/>
             </w:rPr>
           </w:pPr>
         </w:p>
@@ -78,24 +84,28 @@
               <w:kern w:val="2"/>
               <w:sz w:val="24"/>
               <w:szCs w:val="24"/>
+              <w:highlight w:val="yellow"/>
               <w14:ligatures w14:val="standardContextual"/>
             </w:rPr>
           </w:pPr>
           <w:r>
             <w:rPr>
               <w:caps w:val="0"/>
+              <w:highlight w:val="yellow"/>
             </w:rPr>
             <w:fldChar w:fldCharType="begin"/>
           </w:r>
           <w:r>
             <w:rPr>
               <w:caps w:val="0"/>
+              <w:highlight w:val="yellow"/>
             </w:rPr>
             <w:instrText xml:space="preserve"> TOC \o "1-3" \h \z \u </w:instrText>
           </w:r>
           <w:r>
             <w:rPr>
               <w:caps w:val="0"/>
+              <w:highlight w:val="yellow"/>
             </w:rPr>
             <w:fldChar w:fldCharType="separate"/>
           </w:r>
@@ -104,6 +114,7 @@
               <w:rPr>
                 <w:rStyle w:val="Hyperlink"/>
                 <w:noProof/>
+                <w:highlight w:val="yellow"/>
               </w:rPr>
               <w:t>Introduction</w:t>
             </w:r>
@@ -111,6 +122,7 @@
               <w:rPr>
                 <w:noProof/>
                 <w:webHidden/>
+                <w:highlight w:val="yellow"/>
               </w:rPr>
               <w:tab/>
             </w:r>
@@ -118,6 +130,7 @@
               <w:rPr>
                 <w:noProof/>
                 <w:webHidden/>
+                <w:highlight w:val="yellow"/>
               </w:rPr>
               <w:fldChar w:fldCharType="begin"/>
             </w:r>
@@ -125,6 +138,7 @@
               <w:rPr>
                 <w:noProof/>
                 <w:webHidden/>
+                <w:highlight w:val="yellow"/>
               </w:rPr>
               <w:instrText xml:space="preserve"> PAGEREF _Toc203031033 \h </w:instrText>
             </w:r>
@@ -132,12 +146,14 @@
               <w:rPr>
                 <w:noProof/>
                 <w:webHidden/>
+                <w:highlight w:val="yellow"/>
               </w:rPr>
             </w:r>
             <w:r>
               <w:rPr>
                 <w:noProof/>
                 <w:webHidden/>
+                <w:highlight w:val="yellow"/>
               </w:rPr>
               <w:fldChar w:fldCharType="separate"/>
             </w:r>
@@ -145,6 +161,7 @@
               <w:rPr>
                 <w:noProof/>
                 <w:webHidden/>
+                <w:highlight w:val="yellow"/>
               </w:rPr>
               <w:t>2</w:t>
             </w:r>
@@ -152,6 +169,7 @@
               <w:rPr>
                 <w:noProof/>
                 <w:webHidden/>
+                <w:highlight w:val="yellow"/>
               </w:rPr>
               <w:fldChar w:fldCharType="end"/>
             </w:r>
@@ -171,6 +189,7 @@
               <w:kern w:val="2"/>
               <w:sz w:val="24"/>
               <w:szCs w:val="24"/>
+              <w:highlight w:val="yellow"/>
               <w14:ligatures w14:val="standardContextual"/>
             </w:rPr>
           </w:pPr>
@@ -179,6 +198,7 @@
               <w:rPr>
                 <w:rStyle w:val="Hyperlink"/>
                 <w:noProof/>
+                <w:highlight w:val="yellow"/>
               </w:rPr>
               <w:t>Objectives</w:t>
             </w:r>
@@ -186,6 +206,7 @@
               <w:rPr>
                 <w:noProof/>
                 <w:webHidden/>
+                <w:highlight w:val="yellow"/>
               </w:rPr>
               <w:tab/>
             </w:r>
@@ -193,6 +214,7 @@
               <w:rPr>
                 <w:noProof/>
                 <w:webHidden/>
+                <w:highlight w:val="yellow"/>
               </w:rPr>
               <w:fldChar w:fldCharType="begin"/>
             </w:r>
@@ -200,6 +222,7 @@
               <w:rPr>
                 <w:noProof/>
                 <w:webHidden/>
+                <w:highlight w:val="yellow"/>
               </w:rPr>
               <w:instrText xml:space="preserve"> PAGEREF _Toc203031034 \h </w:instrText>
             </w:r>
@@ -207,12 +230,14 @@
               <w:rPr>
                 <w:noProof/>
                 <w:webHidden/>
+                <w:highlight w:val="yellow"/>
               </w:rPr>
             </w:r>
             <w:r>
               <w:rPr>
                 <w:noProof/>
                 <w:webHidden/>
+                <w:highlight w:val="yellow"/>
               </w:rPr>
               <w:fldChar w:fldCharType="separate"/>
             </w:r>
@@ -220,6 +245,7 @@
               <w:rPr>
                 <w:noProof/>
                 <w:webHidden/>
+                <w:highlight w:val="yellow"/>
               </w:rPr>
               <w:t>3</w:t>
             </w:r>
@@ -227,6 +253,7 @@
               <w:rPr>
                 <w:noProof/>
                 <w:webHidden/>
+                <w:highlight w:val="yellow"/>
               </w:rPr>
               <w:fldChar w:fldCharType="end"/>
             </w:r>
@@ -246,6 +273,7 @@
               <w:kern w:val="2"/>
               <w:sz w:val="24"/>
               <w:szCs w:val="24"/>
+              <w:highlight w:val="yellow"/>
               <w14:ligatures w14:val="standardContextual"/>
             </w:rPr>
           </w:pPr>
@@ -254,6 +282,7 @@
               <w:rPr>
                 <w:rStyle w:val="Hyperlink"/>
                 <w:noProof/>
+                <w:highlight w:val="yellow"/>
               </w:rPr>
               <w:t>Part 1 – Timer Control</w:t>
             </w:r>
@@ -261,6 +290,7 @@
               <w:rPr>
                 <w:noProof/>
                 <w:webHidden/>
+                <w:highlight w:val="yellow"/>
               </w:rPr>
               <w:tab/>
             </w:r>
@@ -268,6 +298,7 @@
               <w:rPr>
                 <w:noProof/>
                 <w:webHidden/>
+                <w:highlight w:val="yellow"/>
               </w:rPr>
               <w:fldChar w:fldCharType="begin"/>
             </w:r>
@@ -275,6 +306,7 @@
               <w:rPr>
                 <w:noProof/>
                 <w:webHidden/>
+                <w:highlight w:val="yellow"/>
               </w:rPr>
               <w:instrText xml:space="preserve"> PAGEREF _Toc203031035 \h </w:instrText>
             </w:r>
@@ -282,12 +314,14 @@
               <w:rPr>
                 <w:noProof/>
                 <w:webHidden/>
+                <w:highlight w:val="yellow"/>
               </w:rPr>
             </w:r>
             <w:r>
               <w:rPr>
                 <w:noProof/>
                 <w:webHidden/>
+                <w:highlight w:val="yellow"/>
               </w:rPr>
               <w:fldChar w:fldCharType="separate"/>
             </w:r>
@@ -295,6 +329,7 @@
               <w:rPr>
                 <w:noProof/>
                 <w:webHidden/>
+                <w:highlight w:val="yellow"/>
               </w:rPr>
               <w:t>4</w:t>
             </w:r>
@@ -302,6 +337,7 @@
               <w:rPr>
                 <w:noProof/>
                 <w:webHidden/>
+                <w:highlight w:val="yellow"/>
               </w:rPr>
               <w:fldChar w:fldCharType="end"/>
             </w:r>
@@ -321,6 +357,7 @@
               <w:kern w:val="2"/>
               <w:sz w:val="24"/>
               <w:szCs w:val="24"/>
+              <w:highlight w:val="yellow"/>
               <w14:ligatures w14:val="standardContextual"/>
             </w:rPr>
           </w:pPr>
@@ -329,6 +366,7 @@
               <w:rPr>
                 <w:rStyle w:val="Hyperlink"/>
                 <w:noProof/>
+                <w:highlight w:val="yellow"/>
               </w:rPr>
               <w:t>Part 2 – Create a "Whack-a-Mole" Game</w:t>
             </w:r>
@@ -336,6 +374,7 @@
               <w:rPr>
                 <w:noProof/>
                 <w:webHidden/>
+                <w:highlight w:val="yellow"/>
               </w:rPr>
               <w:tab/>
             </w:r>
@@ -343,6 +382,7 @@
               <w:rPr>
                 <w:noProof/>
                 <w:webHidden/>
+                <w:highlight w:val="yellow"/>
               </w:rPr>
               <w:fldChar w:fldCharType="begin"/>
             </w:r>
@@ -350,6 +390,7 @@
               <w:rPr>
                 <w:noProof/>
                 <w:webHidden/>
+                <w:highlight w:val="yellow"/>
               </w:rPr>
               <w:instrText xml:space="preserve"> PAGEREF _Toc203031036 \h </w:instrText>
             </w:r>
@@ -357,12 +398,14 @@
               <w:rPr>
                 <w:noProof/>
                 <w:webHidden/>
+                <w:highlight w:val="yellow"/>
               </w:rPr>
             </w:r>
             <w:r>
               <w:rPr>
                 <w:noProof/>
                 <w:webHidden/>
+                <w:highlight w:val="yellow"/>
               </w:rPr>
               <w:fldChar w:fldCharType="separate"/>
             </w:r>
@@ -370,6 +413,7 @@
               <w:rPr>
                 <w:noProof/>
                 <w:webHidden/>
+                <w:highlight w:val="yellow"/>
               </w:rPr>
               <w:t>12</w:t>
             </w:r>
@@ -377,6 +421,7 @@
               <w:rPr>
                 <w:noProof/>
                 <w:webHidden/>
+                <w:highlight w:val="yellow"/>
               </w:rPr>
               <w:fldChar w:fldCharType="end"/>
             </w:r>
@@ -396,6 +441,7 @@
               <w:kern w:val="2"/>
               <w:sz w:val="24"/>
               <w:szCs w:val="24"/>
+              <w:highlight w:val="yellow"/>
               <w14:ligatures w14:val="standardContextual"/>
             </w:rPr>
           </w:pPr>
@@ -404,6 +450,7 @@
               <w:rPr>
                 <w:rStyle w:val="Hyperlink"/>
                 <w:noProof/>
+                <w:highlight w:val="yellow"/>
               </w:rPr>
               <w:t>Part 3 – Whack-A-Mole Challenges</w:t>
             </w:r>
@@ -411,6 +458,7 @@
               <w:rPr>
                 <w:noProof/>
                 <w:webHidden/>
+                <w:highlight w:val="yellow"/>
               </w:rPr>
               <w:tab/>
             </w:r>
@@ -418,6 +466,7 @@
               <w:rPr>
                 <w:noProof/>
                 <w:webHidden/>
+                <w:highlight w:val="yellow"/>
               </w:rPr>
               <w:fldChar w:fldCharType="begin"/>
             </w:r>
@@ -425,6 +474,7 @@
               <w:rPr>
                 <w:noProof/>
                 <w:webHidden/>
+                <w:highlight w:val="yellow"/>
               </w:rPr>
               <w:instrText xml:space="preserve"> PAGEREF _Toc203031037 \h </w:instrText>
             </w:r>
@@ -432,12 +482,14 @@
               <w:rPr>
                 <w:noProof/>
                 <w:webHidden/>
+                <w:highlight w:val="yellow"/>
               </w:rPr>
             </w:r>
             <w:r>
               <w:rPr>
                 <w:noProof/>
                 <w:webHidden/>
+                <w:highlight w:val="yellow"/>
               </w:rPr>
               <w:fldChar w:fldCharType="separate"/>
             </w:r>
@@ -445,6 +497,7 @@
               <w:rPr>
                 <w:noProof/>
                 <w:webHidden/>
+                <w:highlight w:val="yellow"/>
               </w:rPr>
               <w:t>16</w:t>
             </w:r>
@@ -452,6 +505,7 @@
               <w:rPr>
                 <w:noProof/>
                 <w:webHidden/>
+                <w:highlight w:val="yellow"/>
               </w:rPr>
               <w:fldChar w:fldCharType="end"/>
             </w:r>
@@ -471,6 +525,7 @@
               <w:kern w:val="2"/>
               <w:sz w:val="24"/>
               <w:szCs w:val="24"/>
+              <w:highlight w:val="yellow"/>
               <w14:ligatures w14:val="standardContextual"/>
             </w:rPr>
           </w:pPr>
@@ -479,6 +534,7 @@
               <w:rPr>
                 <w:rStyle w:val="Hyperlink"/>
                 <w:noProof/>
+                <w:highlight w:val="yellow"/>
               </w:rPr>
               <w:t>What You Learned in This Lesson</w:t>
             </w:r>
@@ -486,6 +542,7 @@
               <w:rPr>
                 <w:noProof/>
                 <w:webHidden/>
+                <w:highlight w:val="yellow"/>
               </w:rPr>
               <w:tab/>
             </w:r>
@@ -493,6 +550,7 @@
               <w:rPr>
                 <w:noProof/>
                 <w:webHidden/>
+                <w:highlight w:val="yellow"/>
               </w:rPr>
               <w:fldChar w:fldCharType="begin"/>
             </w:r>
@@ -500,6 +558,7 @@
               <w:rPr>
                 <w:noProof/>
                 <w:webHidden/>
+                <w:highlight w:val="yellow"/>
               </w:rPr>
               <w:instrText xml:space="preserve"> PAGEREF _Toc203031038 \h </w:instrText>
             </w:r>
@@ -507,12 +566,14 @@
               <w:rPr>
                 <w:noProof/>
                 <w:webHidden/>
+                <w:highlight w:val="yellow"/>
               </w:rPr>
             </w:r>
             <w:r>
               <w:rPr>
                 <w:noProof/>
                 <w:webHidden/>
+                <w:highlight w:val="yellow"/>
               </w:rPr>
               <w:fldChar w:fldCharType="separate"/>
             </w:r>
@@ -520,6 +581,7 @@
               <w:rPr>
                 <w:noProof/>
                 <w:webHidden/>
+                <w:highlight w:val="yellow"/>
               </w:rPr>
               <w:t>18</w:t>
             </w:r>
@@ -527,6 +589,7 @@
               <w:rPr>
                 <w:noProof/>
                 <w:webHidden/>
+                <w:highlight w:val="yellow"/>
               </w:rPr>
               <w:fldChar w:fldCharType="end"/>
             </w:r>
@@ -546,6 +609,7 @@
               <w:kern w:val="2"/>
               <w:sz w:val="24"/>
               <w:szCs w:val="24"/>
+              <w:highlight w:val="yellow"/>
               <w14:ligatures w14:val="standardContextual"/>
             </w:rPr>
           </w:pPr>
@@ -554,6 +618,7 @@
               <w:rPr>
                 <w:rStyle w:val="Hyperlink"/>
                 <w:noProof/>
+                <w:highlight w:val="yellow"/>
               </w:rPr>
               <w:t>Check for Understanding</w:t>
             </w:r>
@@ -561,6 +626,7 @@
               <w:rPr>
                 <w:noProof/>
                 <w:webHidden/>
+                <w:highlight w:val="yellow"/>
               </w:rPr>
               <w:tab/>
             </w:r>
@@ -568,6 +634,7 @@
               <w:rPr>
                 <w:noProof/>
                 <w:webHidden/>
+                <w:highlight w:val="yellow"/>
               </w:rPr>
               <w:fldChar w:fldCharType="begin"/>
             </w:r>
@@ -575,6 +642,7 @@
               <w:rPr>
                 <w:noProof/>
                 <w:webHidden/>
+                <w:highlight w:val="yellow"/>
               </w:rPr>
               <w:instrText xml:space="preserve"> PAGEREF _Toc203031039 \h </w:instrText>
             </w:r>
@@ -582,12 +650,14 @@
               <w:rPr>
                 <w:noProof/>
                 <w:webHidden/>
+                <w:highlight w:val="yellow"/>
               </w:rPr>
             </w:r>
             <w:r>
               <w:rPr>
                 <w:noProof/>
                 <w:webHidden/>
+                <w:highlight w:val="yellow"/>
               </w:rPr>
               <w:fldChar w:fldCharType="separate"/>
             </w:r>
@@ -595,6 +665,7 @@
               <w:rPr>
                 <w:noProof/>
                 <w:webHidden/>
+                <w:highlight w:val="yellow"/>
               </w:rPr>
               <w:t>19</w:t>
             </w:r>
@@ -602,6 +673,7 @@
               <w:rPr>
                 <w:noProof/>
                 <w:webHidden/>
+                <w:highlight w:val="yellow"/>
               </w:rPr>
               <w:fldChar w:fldCharType="end"/>
             </w:r>
@@ -621,6 +693,7 @@
               <w:kern w:val="2"/>
               <w:sz w:val="24"/>
               <w:szCs w:val="24"/>
+              <w:highlight w:val="yellow"/>
               <w14:ligatures w14:val="standardContextual"/>
             </w:rPr>
           </w:pPr>
@@ -629,6 +702,7 @@
               <w:rPr>
                 <w:rStyle w:val="Hyperlink"/>
                 <w:noProof/>
+                <w:highlight w:val="yellow"/>
               </w:rPr>
               <w:t>Deliverables</w:t>
             </w:r>
@@ -636,6 +710,7 @@
               <w:rPr>
                 <w:noProof/>
                 <w:webHidden/>
+                <w:highlight w:val="yellow"/>
               </w:rPr>
               <w:tab/>
             </w:r>
@@ -643,6 +718,7 @@
               <w:rPr>
                 <w:noProof/>
                 <w:webHidden/>
+                <w:highlight w:val="yellow"/>
               </w:rPr>
               <w:fldChar w:fldCharType="begin"/>
             </w:r>
@@ -650,6 +726,7 @@
               <w:rPr>
                 <w:noProof/>
                 <w:webHidden/>
+                <w:highlight w:val="yellow"/>
               </w:rPr>
               <w:instrText xml:space="preserve"> PAGEREF _Toc203031040 \h </w:instrText>
             </w:r>
@@ -657,12 +734,14 @@
               <w:rPr>
                 <w:noProof/>
                 <w:webHidden/>
+                <w:highlight w:val="yellow"/>
               </w:rPr>
             </w:r>
             <w:r>
               <w:rPr>
                 <w:noProof/>
                 <w:webHidden/>
+                <w:highlight w:val="yellow"/>
               </w:rPr>
               <w:fldChar w:fldCharType="separate"/>
             </w:r>
@@ -670,6 +749,7 @@
               <w:rPr>
                 <w:noProof/>
                 <w:webHidden/>
+                <w:highlight w:val="yellow"/>
               </w:rPr>
               <w:t>21</w:t>
             </w:r>
@@ -677,6 +757,7 @@
               <w:rPr>
                 <w:noProof/>
                 <w:webHidden/>
+                <w:highlight w:val="yellow"/>
               </w:rPr>
               <w:fldChar w:fldCharType="end"/>
             </w:r>
@@ -685,12 +766,16 @@
         <w:p>
           <w:pPr>
             <w:spacing w:before="120" w:after="120"/>
+            <w:rPr>
+              <w:highlight w:val="yellow"/>
+            </w:rPr>
           </w:pPr>
           <w:r>
             <w:rPr>
               <w:caps/>
               <w:sz w:val="20"/>
               <w:szCs w:val="20"/>
+              <w:highlight w:val="yellow"/>
             </w:rPr>
             <w:fldChar w:fldCharType="end"/>
           </w:r>
@@ -707,9 +792,13 @@
           <w:color w:val="345A8A" w:themeColor="accent1" w:themeShade="B5"/>
           <w:sz w:val="32"/>
           <w:szCs w:val="32"/>
-        </w:rPr>
-      </w:pPr>
-      <w:r>
+          <w:highlight w:val="yellow"/>
+        </w:rPr>
+      </w:pPr>
+      <w:r>
+        <w:rPr>
+          <w:highlight w:val="yellow"/>
+        </w:rPr>
         <w:br w:type="page"/>
       </w:r>
     </w:p>
@@ -719,12 +808,14 @@
         <w:spacing w:before="120" w:after="480"/>
         <w:rPr>
           <w:rFonts w:asciiTheme="minorHAnsi" w:hAnsiTheme="minorHAnsi"/>
+          <w:highlight w:val="yellow"/>
         </w:rPr>
       </w:pPr>
       <w:bookmarkStart w:id="0" w:name="_Toc203031033"/>
       <w:r>
         <w:rPr>
           <w:rFonts w:asciiTheme="minorHAnsi" w:hAnsiTheme="minorHAnsi"/>
+          <w:highlight w:val="yellow"/>
         </w:rPr>
         <w:lastRenderedPageBreak/>
         <w:t>Introduction</w:t>
@@ -734,119 +825,206 @@
     <w:p>
       <w:pPr>
         <w:spacing w:before="120" w:after="480"/>
-      </w:pPr>
-      <w:r>
+        <w:rPr>
+          <w:highlight w:val="yellow"/>
+        </w:rPr>
+      </w:pPr>
+      <w:r>
+        <w:rPr>
+          <w:highlight w:val="yellow"/>
+        </w:rPr>
         <w:t>In this activity</w:t>
       </w:r>
       <w:r>
+        <w:rPr>
+          <w:highlight w:val="yellow"/>
+        </w:rPr>
         <w:t>,</w:t>
       </w:r>
       <w:r>
+        <w:rPr>
+          <w:highlight w:val="yellow"/>
+        </w:rPr>
         <w:t xml:space="preserve"> we'll explore timer events and game features in WinForms applications. In this lesson, you'll learn how to manage timers and use them to create a </w:t>
       </w:r>
       <w:r>
+        <w:rPr>
+          <w:highlight w:val="yellow"/>
+        </w:rPr>
         <w:t>"</w:t>
       </w:r>
       <w:r>
+        <w:rPr>
+          <w:highlight w:val="yellow"/>
+        </w:rPr>
         <w:t>Whack</w:t>
       </w:r>
       <w:r>
+        <w:rPr>
+          <w:highlight w:val="yellow"/>
+        </w:rPr>
         <w:t>-</w:t>
       </w:r>
       <w:r>
+        <w:rPr>
+          <w:highlight w:val="yellow"/>
+        </w:rPr>
         <w:t>a</w:t>
       </w:r>
       <w:r>
+        <w:rPr>
+          <w:highlight w:val="yellow"/>
+        </w:rPr>
         <w:t>-</w:t>
       </w:r>
       <w:r>
+        <w:rPr>
+          <w:highlight w:val="yellow"/>
+        </w:rPr>
         <w:t>Mole</w:t>
       </w:r>
       <w:r>
+        <w:rPr>
+          <w:highlight w:val="yellow"/>
+        </w:rPr>
         <w:t>"</w:t>
       </w:r>
       <w:r>
+        <w:rPr>
+          <w:highlight w:val="yellow"/>
+        </w:rPr>
         <w:t xml:space="preserve"> game. We'll start by setting up basic timer functions, then move on to dynamically controlling game elements and adding features </w:t>
       </w:r>
       <w:r>
-        <w:t>such as</w:t>
-      </w:r>
-      <w:r>
-        <w:t xml:space="preserve"> </w:t>
-      </w:r>
-      <w:r>
+        <w:rPr>
+          <w:highlight w:val="yellow"/>
+        </w:rPr>
+        <w:t xml:space="preserve">such as </w:t>
+      </w:r>
+      <w:r>
+        <w:rPr>
+          <w:highlight w:val="yellow"/>
+        </w:rPr>
         <w:t xml:space="preserve">scoring and custom graphics. By the end, you'll not only have built an engaging game but also gained valuable skills in handling events and </w:t>
       </w:r>
       <w:r>
+        <w:rPr>
+          <w:highlight w:val="yellow"/>
+        </w:rPr>
         <w:t>user interface (</w:t>
       </w:r>
       <w:r>
+        <w:rPr>
+          <w:highlight w:val="yellow"/>
+        </w:rPr>
         <w:t>UI</w:t>
       </w:r>
       <w:r>
+        <w:rPr>
+          <w:highlight w:val="yellow"/>
+        </w:rPr>
         <w:t>)</w:t>
       </w:r>
       <w:r>
+        <w:rPr>
+          <w:highlight w:val="yellow"/>
+        </w:rPr>
         <w:t xml:space="preserve"> controls in a .NET environment.</w:t>
       </w:r>
     </w:p>
     <w:p>
       <w:pPr>
         <w:spacing w:before="120" w:after="360"/>
+        <w:rPr>
+          <w:highlight w:val="yellow"/>
+        </w:rPr>
       </w:pPr>
       <w:r>
         <w:rPr>
           <w:rStyle w:val="Strong"/>
+          <w:highlight w:val="yellow"/>
         </w:rPr>
         <w:t xml:space="preserve">The GCU College of </w:t>
       </w:r>
       <w:r>
         <w:rPr>
           <w:rStyle w:val="Strong"/>
+          <w:highlight w:val="yellow"/>
         </w:rPr>
         <w:t xml:space="preserve">Engineering and </w:t>
       </w:r>
       <w:r>
         <w:rPr>
           <w:rStyle w:val="Strong"/>
+          <w:highlight w:val="yellow"/>
         </w:rPr>
         <w:t>Technology Coding Guidelines and Best Practices for C#</w:t>
       </w:r>
       <w:r>
+        <w:rPr>
+          <w:highlight w:val="yellow"/>
+        </w:rPr>
         <w:t xml:space="preserve">, available in the </w:t>
       </w:r>
       <w:r>
+        <w:rPr>
+          <w:highlight w:val="yellow"/>
+        </w:rPr>
         <w:t>C</w:t>
       </w:r>
       <w:r>
+        <w:rPr>
+          <w:highlight w:val="yellow"/>
+        </w:rPr>
         <w:t xml:space="preserve">lass </w:t>
       </w:r>
       <w:r>
+        <w:rPr>
+          <w:highlight w:val="yellow"/>
+        </w:rPr>
         <w:t>R</w:t>
       </w:r>
       <w:r>
+        <w:rPr>
+          <w:highlight w:val="yellow"/>
+        </w:rPr>
         <w:t xml:space="preserve">esources, must be followed in all CST-250 projects to ensure consistency, readability, and professionalism in student code. These guidelines promote a clear separation of concerns by organizing code into the Models, </w:t>
       </w:r>
       <w:proofErr w:type="spellStart"/>
       <w:r>
+        <w:rPr>
+          <w:highlight w:val="yellow"/>
+        </w:rPr>
         <w:t>BusinessLogicLayer</w:t>
       </w:r>
       <w:proofErr w:type="spellEnd"/>
       <w:r>
+        <w:rPr>
+          <w:highlight w:val="yellow"/>
+        </w:rPr>
         <w:t xml:space="preserve">, and </w:t>
       </w:r>
       <w:proofErr w:type="spellStart"/>
       <w:r>
+        <w:rPr>
+          <w:highlight w:val="yellow"/>
+        </w:rPr>
         <w:t>DataAccessLayer</w:t>
       </w:r>
       <w:proofErr w:type="spellEnd"/>
       <w:r>
+        <w:rPr>
+          <w:highlight w:val="yellow"/>
+        </w:rPr>
         <w:t xml:space="preserve"> folders. The document also outlines essential standards for casing, naming conventions, code structure, commenting, and organization. Additionally, it emphasizes best practices in object-oriented design, exception handling, and the use of design patterns. Adhering to these expectations is required for successful completion of course assignments.</w:t>
       </w:r>
     </w:p>
     <w:p>
       <w:pPr>
         <w:spacing w:before="120" w:after="480"/>
+        <w:rPr>
+          <w:highlight w:val="yellow"/>
+        </w:rPr>
       </w:pPr>
     </w:p>
     <w:p>
@@ -858,9 +1036,13 @@
           <w:color w:val="345A8A" w:themeColor="accent1" w:themeShade="B5"/>
           <w:sz w:val="32"/>
           <w:szCs w:val="32"/>
-        </w:rPr>
-      </w:pPr>
-      <w:r>
+          <w:highlight w:val="yellow"/>
+        </w:rPr>
+      </w:pPr>
+      <w:r>
+        <w:rPr>
+          <w:highlight w:val="yellow"/>
+        </w:rPr>
         <w:br w:type="page"/>
       </w:r>
     </w:p>
@@ -870,18 +1052,22 @@
         <w:spacing w:before="120" w:after="360"/>
         <w:rPr>
           <w:rFonts w:asciiTheme="minorHAnsi" w:hAnsiTheme="minorHAnsi"/>
+          <w:highlight w:val="yellow"/>
         </w:rPr>
       </w:pPr>
       <w:bookmarkStart w:id="1" w:name="_Toc203031034"/>
       <w:r>
         <w:rPr>
           <w:rFonts w:asciiTheme="minorHAnsi" w:hAnsiTheme="minorHAnsi"/>
-        </w:rPr>
+          <w:highlight w:val="yellow"/>
+        </w:rPr>
+        <w:lastRenderedPageBreak/>
         <w:t>Objective</w:t>
       </w:r>
       <w:r>
         <w:rPr>
           <w:rFonts w:asciiTheme="minorHAnsi" w:hAnsiTheme="minorHAnsi"/>
+          <w:highlight w:val="yellow"/>
         </w:rPr>
         <w:t>s</w:t>
       </w:r>
@@ -896,11 +1082,20 @@
         </w:numPr>
         <w:spacing w:before="120" w:after="360"/>
         <w:contextualSpacing w:val="0"/>
-      </w:pPr>
-      <w:r>
+        <w:rPr>
+          <w:highlight w:val="yellow"/>
+        </w:rPr>
+      </w:pPr>
+      <w:r>
+        <w:rPr>
+          <w:highlight w:val="yellow"/>
+        </w:rPr>
         <w:t>Configure and user a timer control</w:t>
       </w:r>
       <w:r>
+        <w:rPr>
+          <w:highlight w:val="yellow"/>
+        </w:rPr>
         <w:t>.</w:t>
       </w:r>
     </w:p>
@@ -913,11 +1108,20 @@
         </w:numPr>
         <w:spacing w:before="120" w:after="360"/>
         <w:contextualSpacing w:val="0"/>
-      </w:pPr>
-      <w:r>
+        <w:rPr>
+          <w:highlight w:val="yellow"/>
+        </w:rPr>
+      </w:pPr>
+      <w:r>
+        <w:rPr>
+          <w:highlight w:val="yellow"/>
+        </w:rPr>
         <w:t>Describe the purpose of a timer in controlling periodic events within a WinForms application</w:t>
       </w:r>
       <w:r>
+        <w:rPr>
+          <w:highlight w:val="yellow"/>
+        </w:rPr>
         <w:t>.</w:t>
       </w:r>
     </w:p>
@@ -930,23 +1134,44 @@
         </w:numPr>
         <w:spacing w:before="120" w:after="360"/>
         <w:contextualSpacing w:val="0"/>
-      </w:pPr>
-      <w:r>
+        <w:rPr>
+          <w:highlight w:val="yellow"/>
+        </w:rPr>
+      </w:pPr>
+      <w:r>
+        <w:rPr>
+          <w:highlight w:val="yellow"/>
+        </w:rPr>
         <w:t>Configure a timer's properties</w:t>
       </w:r>
       <w:r>
+        <w:rPr>
+          <w:highlight w:val="yellow"/>
+        </w:rPr>
         <w:t>,</w:t>
       </w:r>
       <w:r>
+        <w:rPr>
+          <w:highlight w:val="yellow"/>
+        </w:rPr>
         <w:t xml:space="preserve"> such as interval and enabled status</w:t>
       </w:r>
       <w:r>
+        <w:rPr>
+          <w:highlight w:val="yellow"/>
+        </w:rPr>
         <w:t>,</w:t>
       </w:r>
       <w:r>
+        <w:rPr>
+          <w:highlight w:val="yellow"/>
+        </w:rPr>
         <w:t xml:space="preserve"> to control event timing</w:t>
       </w:r>
       <w:r>
+        <w:rPr>
+          <w:highlight w:val="yellow"/>
+        </w:rPr>
         <w:t>.</w:t>
       </w:r>
     </w:p>
@@ -959,11 +1184,20 @@
         </w:numPr>
         <w:spacing w:before="120" w:after="360"/>
         <w:contextualSpacing w:val="0"/>
-      </w:pPr>
-      <w:r>
+        <w:rPr>
+          <w:highlight w:val="yellow"/>
+        </w:rPr>
+      </w:pPr>
+      <w:r>
+        <w:rPr>
+          <w:highlight w:val="yellow"/>
+        </w:rPr>
         <w:t>Develop event handlers that respond to timer events to update application state or UI components such as labels</w:t>
       </w:r>
       <w:r>
+        <w:rPr>
+          <w:highlight w:val="yellow"/>
+        </w:rPr>
         <w:t>.</w:t>
       </w:r>
     </w:p>
@@ -976,17 +1210,32 @@
         </w:numPr>
         <w:spacing w:before="120" w:after="360"/>
         <w:contextualSpacing w:val="0"/>
-      </w:pPr>
-      <w:r>
+        <w:rPr>
+          <w:highlight w:val="yellow"/>
+        </w:rPr>
+      </w:pPr>
+      <w:r>
+        <w:rPr>
+          <w:highlight w:val="yellow"/>
+        </w:rPr>
         <w:t>Create a</w:t>
       </w:r>
       <w:r>
+        <w:rPr>
+          <w:highlight w:val="yellow"/>
+        </w:rPr>
         <w:t>nd</w:t>
       </w:r>
       <w:r>
+        <w:rPr>
+          <w:highlight w:val="yellow"/>
+        </w:rPr>
         <w:t xml:space="preserve"> manipulate UI controls dynamically</w:t>
       </w:r>
       <w:r>
+        <w:rPr>
+          <w:highlight w:val="yellow"/>
+        </w:rPr>
         <w:t>.</w:t>
       </w:r>
     </w:p>
@@ -999,11 +1248,20 @@
         </w:numPr>
         <w:spacing w:before="120" w:after="360"/>
         <w:contextualSpacing w:val="0"/>
-      </w:pPr>
-      <w:r>
+        <w:rPr>
+          <w:highlight w:val="yellow"/>
+        </w:rPr>
+      </w:pPr>
+      <w:r>
+        <w:rPr>
+          <w:highlight w:val="yellow"/>
+        </w:rPr>
         <w:t>Dynamically add and position controls on a form based on runtime conditions</w:t>
       </w:r>
       <w:r>
+        <w:rPr>
+          <w:highlight w:val="yellow"/>
+        </w:rPr>
         <w:t>.</w:t>
       </w:r>
     </w:p>
@@ -1016,23 +1274,44 @@
         </w:numPr>
         <w:spacing w:before="120" w:after="360"/>
         <w:contextualSpacing w:val="0"/>
-      </w:pPr>
-      <w:r>
+        <w:rPr>
+          <w:highlight w:val="yellow"/>
+        </w:rPr>
+      </w:pPr>
+      <w:r>
+        <w:rPr>
+          <w:highlight w:val="yellow"/>
+        </w:rPr>
         <w:t>Modify properties of controls</w:t>
       </w:r>
       <w:r>
+        <w:rPr>
+          <w:highlight w:val="yellow"/>
+        </w:rPr>
         <w:t>,</w:t>
       </w:r>
       <w:r>
+        <w:rPr>
+          <w:highlight w:val="yellow"/>
+        </w:rPr>
         <w:t xml:space="preserve"> such as visibility and position</w:t>
       </w:r>
       <w:r>
+        <w:rPr>
+          <w:highlight w:val="yellow"/>
+        </w:rPr>
         <w:t>,</w:t>
       </w:r>
       <w:r>
+        <w:rPr>
+          <w:highlight w:val="yellow"/>
+        </w:rPr>
         <w:t xml:space="preserve"> in response to events</w:t>
       </w:r>
       <w:r>
+        <w:rPr>
+          <w:highlight w:val="yellow"/>
+        </w:rPr>
         <w:t>.</w:t>
       </w:r>
     </w:p>
@@ -1045,8 +1324,14 @@
         </w:numPr>
         <w:spacing w:before="120" w:after="360"/>
         <w:contextualSpacing w:val="0"/>
-      </w:pPr>
-      <w:r>
+        <w:rPr>
+          <w:highlight w:val="yellow"/>
+        </w:rPr>
+      </w:pPr>
+      <w:r>
+        <w:rPr>
+          <w:highlight w:val="yellow"/>
+        </w:rPr>
         <w:t>Construct a simple interactive game using timer events to move a target randomly across the form.</w:t>
       </w:r>
     </w:p>
@@ -1059,8 +1344,14 @@
         </w:numPr>
         <w:spacing w:before="120" w:after="360"/>
         <w:contextualSpacing w:val="0"/>
-      </w:pPr>
-      <w:r>
+        <w:rPr>
+          <w:highlight w:val="yellow"/>
+        </w:rPr>
+      </w:pPr>
+      <w:r>
+        <w:rPr>
+          <w:highlight w:val="yellow"/>
+        </w:rPr>
         <w:t>Implement event handlers that adjust the placement and size of UI controls when the form is resized to maintain layout consistency</w:t>
       </w:r>
     </w:p>
@@ -1073,11 +1364,20 @@
         </w:numPr>
         <w:spacing w:before="120" w:after="360"/>
         <w:contextualSpacing w:val="0"/>
-      </w:pPr>
-      <w:r>
+        <w:rPr>
+          <w:highlight w:val="yellow"/>
+        </w:rPr>
+      </w:pPr>
+      <w:r>
+        <w:rPr>
+          <w:highlight w:val="yellow"/>
+        </w:rPr>
         <w:t>Create game functionality</w:t>
       </w:r>
       <w:r>
+        <w:rPr>
+          <w:highlight w:val="yellow"/>
+        </w:rPr>
         <w:t>.</w:t>
       </w:r>
     </w:p>
@@ -1090,11 +1390,20 @@
         </w:numPr>
         <w:spacing w:before="120" w:after="360"/>
         <w:contextualSpacing w:val="0"/>
-      </w:pPr>
-      <w:r>
+        <w:rPr>
+          <w:highlight w:val="yellow"/>
+        </w:rPr>
+      </w:pPr>
+      <w:r>
+        <w:rPr>
+          <w:highlight w:val="yellow"/>
+        </w:rPr>
         <w:t>Implement game mechanics such as scoring and target visibility toggling upon user interactions</w:t>
       </w:r>
       <w:r>
+        <w:rPr>
+          <w:highlight w:val="yellow"/>
+        </w:rPr>
         <w:t>.</w:t>
       </w:r>
     </w:p>
@@ -1107,11 +1416,20 @@
         </w:numPr>
         <w:spacing w:before="120" w:after="360"/>
         <w:contextualSpacing w:val="0"/>
-      </w:pPr>
-      <w:r>
+        <w:rPr>
+          <w:highlight w:val="yellow"/>
+        </w:rPr>
+      </w:pPr>
+      <w:r>
+        <w:rPr>
+          <w:highlight w:val="yellow"/>
+        </w:rPr>
         <w:t>Add complexity to the game by introducing levels, penalties, custom graphics, and form resizing responsiveness</w:t>
       </w:r>
       <w:r>
+        <w:rPr>
+          <w:highlight w:val="yellow"/>
+        </w:rPr>
         <w:t>.</w:t>
       </w:r>
     </w:p>
@@ -1124,11 +1442,20 @@
         </w:numPr>
         <w:spacing w:before="120" w:after="360"/>
         <w:contextualSpacing w:val="0"/>
-      </w:pPr>
-      <w:r>
+        <w:rPr>
+          <w:highlight w:val="yellow"/>
+        </w:rPr>
+      </w:pPr>
+      <w:r>
+        <w:rPr>
+          <w:highlight w:val="yellow"/>
+        </w:rPr>
         <w:t>Design and implement a scoring system and manage game statistics using files</w:t>
       </w:r>
       <w:r>
+        <w:rPr>
+          <w:highlight w:val="yellow"/>
+        </w:rPr>
         <w:t>.</w:t>
       </w:r>
     </w:p>
@@ -1141,11 +1468,20 @@
         </w:numPr>
         <w:spacing w:before="120" w:after="360"/>
         <w:contextualSpacing w:val="0"/>
-      </w:pPr>
-      <w:r>
+        <w:rPr>
+          <w:highlight w:val="yellow"/>
+        </w:rPr>
+      </w:pPr>
+      <w:r>
+        <w:rPr>
+          <w:highlight w:val="yellow"/>
+        </w:rPr>
         <w:t>Create additional forms for user interaction, such as inputting a player name or displaying high scores</w:t>
       </w:r>
       <w:r>
+        <w:rPr>
+          <w:highlight w:val="yellow"/>
+        </w:rPr>
         <w:t>.</w:t>
       </w:r>
     </w:p>
@@ -1159,9 +1495,13 @@
           <w:color w:val="345A8A" w:themeColor="accent1" w:themeShade="B5"/>
           <w:sz w:val="32"/>
           <w:szCs w:val="32"/>
-        </w:rPr>
-      </w:pPr>
-      <w:r>
+          <w:highlight w:val="yellow"/>
+        </w:rPr>
+      </w:pPr>
+      <w:r>
+        <w:rPr>
+          <w:highlight w:val="yellow"/>
+        </w:rPr>
         <w:br w:type="page"/>
       </w:r>
     </w:p>
@@ -1171,13 +1511,16 @@
         <w:spacing w:before="120" w:after="480"/>
         <w:rPr>
           <w:rFonts w:asciiTheme="minorHAnsi" w:hAnsiTheme="minorHAnsi"/>
+          <w:highlight w:val="yellow"/>
         </w:rPr>
       </w:pPr>
       <w:bookmarkStart w:id="2" w:name="_Toc203031035"/>
       <w:r>
         <w:rPr>
           <w:rFonts w:asciiTheme="minorHAnsi" w:hAnsiTheme="minorHAnsi"/>
-        </w:rPr>
+          <w:highlight w:val="yellow"/>
+        </w:rPr>
+        <w:lastRenderedPageBreak/>
         <w:t>Part 1 – Timer Control</w:t>
       </w:r>
       <w:bookmarkEnd w:id="2"/>
@@ -1192,55 +1535,106 @@
         <w:spacing w:before="120" w:after="480"/>
         <w:ind w:left="360" w:hanging="360"/>
         <w:contextualSpacing w:val="0"/>
-      </w:pPr>
-      <w:r>
+        <w:rPr>
+          <w:highlight w:val="yellow"/>
+        </w:rPr>
+      </w:pPr>
+      <w:r>
+        <w:rPr>
+          <w:highlight w:val="yellow"/>
+        </w:rPr>
         <w:t xml:space="preserve">Create a new </w:t>
       </w:r>
       <w:r>
+        <w:rPr>
+          <w:highlight w:val="yellow"/>
+        </w:rPr>
         <w:t>WinForms</w:t>
       </w:r>
       <w:r>
+        <w:rPr>
+          <w:highlight w:val="yellow"/>
+        </w:rPr>
         <w:t xml:space="preserve"> </w:t>
       </w:r>
       <w:r>
+        <w:rPr>
+          <w:highlight w:val="yellow"/>
+        </w:rPr>
         <w:t>application</w:t>
       </w:r>
       <w:r>
+        <w:rPr>
+          <w:highlight w:val="yellow"/>
+        </w:rPr>
         <w:t xml:space="preserve"> with the name </w:t>
       </w:r>
       <w:r>
+        <w:rPr>
+          <w:highlight w:val="yellow"/>
+        </w:rPr>
         <w:t>"</w:t>
       </w:r>
       <w:proofErr w:type="spellStart"/>
       <w:r>
+        <w:rPr>
+          <w:highlight w:val="yellow"/>
+        </w:rPr>
         <w:t>WhackAMole</w:t>
       </w:r>
       <w:proofErr w:type="spellEnd"/>
       <w:r>
+        <w:rPr>
+          <w:highlight w:val="yellow"/>
+        </w:rPr>
         <w:t>"</w:t>
       </w:r>
       <w:r>
+        <w:rPr>
+          <w:highlight w:val="yellow"/>
+        </w:rPr>
         <w:t xml:space="preserve"> </w:t>
       </w:r>
       <w:r>
+        <w:rPr>
+          <w:highlight w:val="yellow"/>
+        </w:rPr>
         <w:t>using the most recent long</w:t>
       </w:r>
       <w:r>
+        <w:rPr>
+          <w:highlight w:val="yellow"/>
+        </w:rPr>
         <w:t>-</w:t>
       </w:r>
       <w:r>
+        <w:rPr>
+          <w:highlight w:val="yellow"/>
+        </w:rPr>
         <w:t>term support version of .NET</w:t>
       </w:r>
       <w:r>
+        <w:rPr>
+          <w:highlight w:val="yellow"/>
+        </w:rPr>
         <w:t>,</w:t>
       </w:r>
       <w:r>
+        <w:rPr>
+          <w:highlight w:val="yellow"/>
+        </w:rPr>
         <w:t xml:space="preserve"> </w:t>
       </w:r>
       <w:r>
+        <w:rPr>
+          <w:highlight w:val="yellow"/>
+        </w:rPr>
         <w:t>as shown in</w:t>
       </w:r>
       <w:r>
+        <w:rPr>
+          <w:highlight w:val="yellow"/>
+        </w:rPr>
         <w:t xml:space="preserve"> Figure 1.</w:t>
       </w:r>
     </w:p>
@@ -1248,10 +1642,14 @@
       <w:pPr>
         <w:keepNext/>
         <w:spacing w:before="120" w:after="120"/>
+        <w:rPr>
+          <w:highlight w:val="yellow"/>
+        </w:rPr>
       </w:pPr>
       <w:r>
         <w:rPr>
           <w:noProof/>
+          <w:highlight w:val="yellow"/>
         </w:rPr>
         <w:drawing>
           <wp:inline distT="0" distB="0" distL="0" distR="0" wp14:anchorId="023173B8" wp14:editId="1A31C143">
@@ -1297,39 +1695,62 @@
       </w:pPr>
       <w:bookmarkStart w:id="3" w:name="_Ref191902445"/>
       <w:r>
+        <w:rPr>
+          <w:highlight w:val="yellow"/>
+        </w:rPr>
         <w:t xml:space="preserve">Figure </w:t>
       </w:r>
       <w:r>
+        <w:rPr>
+          <w:highlight w:val="yellow"/>
+        </w:rPr>
         <w:fldChar w:fldCharType="begin"/>
       </w:r>
       <w:r>
+        <w:rPr>
+          <w:highlight w:val="yellow"/>
+        </w:rPr>
         <w:instrText xml:space="preserve"> SEQ Figure \* ARABIC </w:instrText>
       </w:r>
       <w:r>
+        <w:rPr>
+          <w:highlight w:val="yellow"/>
+        </w:rPr>
         <w:fldChar w:fldCharType="separate"/>
       </w:r>
       <w:r>
         <w:rPr>
           <w:noProof/>
+          <w:highlight w:val="yellow"/>
         </w:rPr>
         <w:t>1</w:t>
       </w:r>
       <w:r>
         <w:rPr>
           <w:noProof/>
+          <w:highlight w:val="yellow"/>
         </w:rPr>
         <w:fldChar w:fldCharType="end"/>
       </w:r>
       <w:bookmarkEnd w:id="3"/>
       <w:r>
+        <w:rPr>
+          <w:highlight w:val="yellow"/>
+        </w:rPr>
         <w:t xml:space="preserve">: Creating the </w:t>
       </w:r>
       <w:proofErr w:type="spellStart"/>
       <w:r>
+        <w:rPr>
+          <w:highlight w:val="yellow"/>
+        </w:rPr>
         <w:t>WhackAMole</w:t>
       </w:r>
       <w:proofErr w:type="spellEnd"/>
       <w:r>
+        <w:rPr>
+          <w:highlight w:val="yellow"/>
+        </w:rPr>
         <w:t xml:space="preserve"> project</w:t>
       </w:r>
     </w:p>
@@ -1750,27 +2171,14 @@
       <w:r>
         <w:t xml:space="preserve">Figure </w:t>
       </w:r>
-      <w:r>
-        <w:fldChar w:fldCharType="begin"/>
-      </w:r>
-      <w:r>
-        <w:instrText xml:space="preserve"> SEQ Figure \* ARABIC </w:instrText>
-      </w:r>
-      <w:r>
-        <w:fldChar w:fldCharType="separate"/>
-      </w:r>
-      <w:r>
-        <w:rPr>
-          <w:noProof/>
-        </w:rPr>
-        <w:t>2</w:t>
-      </w:r>
-      <w:r>
-        <w:rPr>
-          <w:noProof/>
-        </w:rPr>
-        <w:fldChar w:fldCharType="end"/>
-      </w:r>
+      <w:fldSimple w:instr=" SEQ Figure \* ARABIC ">
+        <w:r>
+          <w:rPr>
+            <w:noProof/>
+          </w:rPr>
+          <w:t>2</w:t>
+        </w:r>
+      </w:fldSimple>
       <w:bookmarkEnd w:id="4"/>
       <w:r>
         <w:rPr>
@@ -1799,6 +2207,7 @@
         <w:contextualSpacing w:val="0"/>
       </w:pPr>
       <w:r>
+        <w:lastRenderedPageBreak/>
         <w:t xml:space="preserve">Create a Presentation folder under your project and name it </w:t>
       </w:r>
       <w:r>
@@ -1891,27 +2300,14 @@
       <w:r>
         <w:t xml:space="preserve">Figure </w:t>
       </w:r>
-      <w:r>
-        <w:fldChar w:fldCharType="begin"/>
-      </w:r>
-      <w:r>
-        <w:instrText xml:space="preserve"> SEQ Figure \* ARABIC </w:instrText>
-      </w:r>
-      <w:r>
-        <w:fldChar w:fldCharType="separate"/>
-      </w:r>
-      <w:r>
-        <w:rPr>
-          <w:noProof/>
-        </w:rPr>
-        <w:t>3</w:t>
-      </w:r>
-      <w:r>
-        <w:rPr>
-          <w:noProof/>
-        </w:rPr>
-        <w:fldChar w:fldCharType="end"/>
-      </w:r>
+      <w:fldSimple w:instr=" SEQ Figure \* ARABIC ">
+        <w:r>
+          <w:rPr>
+            <w:noProof/>
+          </w:rPr>
+          <w:t>3</w:t>
+        </w:r>
+      </w:fldSimple>
       <w:bookmarkEnd w:id="5"/>
       <w:r>
         <w:t xml:space="preserve">: Moving </w:t>
@@ -2037,27 +2433,14 @@
       <w:r>
         <w:t xml:space="preserve">Figure </w:t>
       </w:r>
-      <w:r>
-        <w:fldChar w:fldCharType="begin"/>
-      </w:r>
-      <w:r>
-        <w:instrText xml:space="preserve"> SEQ Figure \* ARABIC </w:instrText>
-      </w:r>
-      <w:r>
-        <w:fldChar w:fldCharType="separate"/>
-      </w:r>
-      <w:r>
-        <w:rPr>
-          <w:noProof/>
-        </w:rPr>
-        <w:t>4</w:t>
-      </w:r>
-      <w:r>
-        <w:rPr>
-          <w:noProof/>
-        </w:rPr>
-        <w:fldChar w:fldCharType="end"/>
-      </w:r>
+      <w:fldSimple w:instr=" SEQ Figure \* ARABIC ">
+        <w:r>
+          <w:rPr>
+            <w:noProof/>
+          </w:rPr>
+          <w:t>4</w:t>
+        </w:r>
+      </w:fldSimple>
       <w:bookmarkEnd w:id="6"/>
       <w:r>
         <w:t xml:space="preserve">: Updating the name of the form to </w:t>
@@ -2085,6 +2468,7 @@
         <w:contextualSpacing w:val="0"/>
       </w:pPr>
       <w:r>
+        <w:lastRenderedPageBreak/>
         <w:t xml:space="preserve">Resize </w:t>
       </w:r>
       <w:proofErr w:type="spellStart"/>
@@ -2163,27 +2547,14 @@
       <w:r>
         <w:t xml:space="preserve">Figure </w:t>
       </w:r>
-      <w:r>
-        <w:fldChar w:fldCharType="begin"/>
-      </w:r>
-      <w:r>
-        <w:instrText xml:space="preserve"> SEQ Figure \* ARABIC </w:instrText>
-      </w:r>
-      <w:r>
-        <w:fldChar w:fldCharType="separate"/>
-      </w:r>
-      <w:r>
-        <w:rPr>
-          <w:noProof/>
-        </w:rPr>
-        <w:t>5</w:t>
-      </w:r>
-      <w:r>
-        <w:rPr>
-          <w:noProof/>
-        </w:rPr>
-        <w:fldChar w:fldCharType="end"/>
-      </w:r>
+      <w:fldSimple w:instr=" SEQ Figure \* ARABIC ">
+        <w:r>
+          <w:rPr>
+            <w:noProof/>
+          </w:rPr>
+          <w:t>5</w:t>
+        </w:r>
+      </w:fldSimple>
       <w:bookmarkEnd w:id="7"/>
       <w:r>
         <w:t xml:space="preserve">: Adding buttons and a label to </w:t>
@@ -2302,27 +2673,14 @@
       <w:r>
         <w:t xml:space="preserve">Figure </w:t>
       </w:r>
-      <w:r>
-        <w:fldChar w:fldCharType="begin"/>
-      </w:r>
-      <w:r>
-        <w:instrText xml:space="preserve"> SEQ Figure \* ARABIC </w:instrText>
-      </w:r>
-      <w:r>
-        <w:fldChar w:fldCharType="separate"/>
-      </w:r>
-      <w:r>
-        <w:rPr>
-          <w:noProof/>
-        </w:rPr>
-        <w:t>6</w:t>
-      </w:r>
-      <w:r>
-        <w:rPr>
-          <w:noProof/>
-        </w:rPr>
-        <w:fldChar w:fldCharType="end"/>
-      </w:r>
+      <w:fldSimple w:instr=" SEQ Figure \* ARABIC ">
+        <w:r>
+          <w:rPr>
+            <w:noProof/>
+          </w:rPr>
+          <w:t>6</w:t>
+        </w:r>
+      </w:fldSimple>
       <w:bookmarkEnd w:id="8"/>
       <w:r>
         <w:t xml:space="preserve">: </w:t>
@@ -2348,6 +2706,7 @@
         <w:contextualSpacing w:val="0"/>
       </w:pPr>
       <w:r>
+        <w:lastRenderedPageBreak/>
         <w:t xml:space="preserve">Next, add a Timer control to </w:t>
       </w:r>
       <w:proofErr w:type="spellStart"/>
@@ -2429,27 +2788,14 @@
       <w:r>
         <w:t xml:space="preserve">Figure </w:t>
       </w:r>
-      <w:r>
-        <w:fldChar w:fldCharType="begin"/>
-      </w:r>
-      <w:r>
-        <w:instrText xml:space="preserve"> SEQ Figure \* ARABIC </w:instrText>
-      </w:r>
-      <w:r>
-        <w:fldChar w:fldCharType="separate"/>
-      </w:r>
-      <w:r>
-        <w:rPr>
-          <w:noProof/>
-        </w:rPr>
-        <w:t>7</w:t>
-      </w:r>
-      <w:r>
-        <w:rPr>
-          <w:noProof/>
-        </w:rPr>
-        <w:fldChar w:fldCharType="end"/>
-      </w:r>
+      <w:fldSimple w:instr=" SEQ Figure \* ARABIC ">
+        <w:r>
+          <w:rPr>
+            <w:noProof/>
+          </w:rPr>
+          <w:t>7</w:t>
+        </w:r>
+      </w:fldSimple>
       <w:bookmarkEnd w:id="9"/>
       <w:r>
         <w:t xml:space="preserve">: Adding a timer control to </w:t>
@@ -2558,27 +2904,14 @@
       <w:r>
         <w:t xml:space="preserve">Figure </w:t>
       </w:r>
-      <w:r>
-        <w:fldChar w:fldCharType="begin"/>
-      </w:r>
-      <w:r>
-        <w:instrText xml:space="preserve"> SEQ Figure \* ARABIC </w:instrText>
-      </w:r>
-      <w:r>
-        <w:fldChar w:fldCharType="separate"/>
-      </w:r>
-      <w:r>
-        <w:rPr>
-          <w:noProof/>
-        </w:rPr>
-        <w:t>8</w:t>
-      </w:r>
-      <w:r>
-        <w:rPr>
-          <w:noProof/>
-        </w:rPr>
-        <w:fldChar w:fldCharType="end"/>
-      </w:r>
+      <w:fldSimple w:instr=" SEQ Figure \* ARABIC ">
+        <w:r>
+          <w:rPr>
+            <w:noProof/>
+          </w:rPr>
+          <w:t>8</w:t>
+        </w:r>
+      </w:fldSimple>
       <w:bookmarkEnd w:id="10"/>
       <w:r>
         <w:t>: Updating the timer properties</w:t>
@@ -2601,6 +2934,7 @@
         <w:contextualSpacing w:val="0"/>
       </w:pPr>
       <w:r>
+        <w:lastRenderedPageBreak/>
         <w:t xml:space="preserve">Right click on </w:t>
       </w:r>
       <w:proofErr w:type="spellStart"/>
@@ -2673,27 +3007,14 @@
       <w:r>
         <w:t xml:space="preserve">Figure </w:t>
       </w:r>
-      <w:r>
-        <w:fldChar w:fldCharType="begin"/>
-      </w:r>
-      <w:r>
-        <w:instrText xml:space="preserve"> SEQ Figure \* ARABIC </w:instrText>
-      </w:r>
-      <w:r>
-        <w:fldChar w:fldCharType="separate"/>
-      </w:r>
-      <w:r>
-        <w:rPr>
-          <w:noProof/>
-        </w:rPr>
-        <w:t>9</w:t>
-      </w:r>
-      <w:r>
-        <w:rPr>
-          <w:noProof/>
-        </w:rPr>
-        <w:fldChar w:fldCharType="end"/>
-      </w:r>
+      <w:fldSimple w:instr=" SEQ Figure \* ARABIC ">
+        <w:r>
+          <w:rPr>
+            <w:noProof/>
+          </w:rPr>
+          <w:t>9</w:t>
+        </w:r>
+      </w:fldSimple>
       <w:bookmarkEnd w:id="11"/>
       <w:r>
         <w:t xml:space="preserve">: Citation for </w:t>
@@ -2802,27 +3123,14 @@
       <w:r>
         <w:t xml:space="preserve">Figure </w:t>
       </w:r>
-      <w:r>
-        <w:fldChar w:fldCharType="begin"/>
-      </w:r>
-      <w:r>
-        <w:instrText xml:space="preserve"> SEQ Figure \* ARABIC </w:instrText>
-      </w:r>
-      <w:r>
-        <w:fldChar w:fldCharType="separate"/>
-      </w:r>
-      <w:r>
-        <w:rPr>
-          <w:noProof/>
-        </w:rPr>
-        <w:t>10</w:t>
-      </w:r>
-      <w:r>
-        <w:rPr>
-          <w:noProof/>
-        </w:rPr>
-        <w:fldChar w:fldCharType="end"/>
-      </w:r>
+      <w:fldSimple w:instr=" SEQ Figure \* ARABIC ">
+        <w:r>
+          <w:rPr>
+            <w:noProof/>
+          </w:rPr>
+          <w:t>10</w:t>
+        </w:r>
+      </w:fldSimple>
       <w:bookmarkEnd w:id="12"/>
       <w:r>
         <w:t xml:space="preserve">: Click event handler for </w:t>
@@ -2934,45 +3242,33 @@
       <w:r>
         <w:t xml:space="preserve">Figure </w:t>
       </w:r>
-      <w:r>
-        <w:fldChar w:fldCharType="begin"/>
-      </w:r>
-      <w:r>
-        <w:instrText xml:space="preserve"> SEQ Figure \* ARABIC </w:instrText>
-      </w:r>
-      <w:r>
-        <w:fldChar w:fldCharType="separate"/>
-      </w:r>
+      <w:fldSimple w:instr=" SEQ Figure \* ARABIC ">
+        <w:r>
+          <w:rPr>
+            <w:noProof/>
+          </w:rPr>
+          <w:t>11</w:t>
+        </w:r>
+      </w:fldSimple>
+      <w:bookmarkEnd w:id="13"/>
+      <w:r>
+        <w:t xml:space="preserve">: Click event handler for </w:t>
+      </w:r>
+      <w:proofErr w:type="spellStart"/>
+      <w:r>
+        <w:t>btnStop</w:t>
+      </w:r>
+      <w:proofErr w:type="spellEnd"/>
+    </w:p>
+    <w:p>
+      <w:pPr>
+        <w:spacing w:before="120" w:after="480"/>
+      </w:pPr>
       <w:r>
         <w:rPr>
           <w:noProof/>
         </w:rPr>
-        <w:t>11</w:t>
-      </w:r>
-      <w:r>
-        <w:rPr>
-          <w:noProof/>
-        </w:rPr>
-        <w:fldChar w:fldCharType="end"/>
-      </w:r>
-      <w:bookmarkEnd w:id="13"/>
-      <w:r>
-        <w:t xml:space="preserve">: Click event handler for </w:t>
-      </w:r>
-      <w:proofErr w:type="spellStart"/>
-      <w:r>
-        <w:t>btnStop</w:t>
-      </w:r>
-      <w:proofErr w:type="spellEnd"/>
-    </w:p>
-    <w:p>
-      <w:pPr>
-        <w:spacing w:before="120" w:after="480"/>
-      </w:pPr>
-      <w:r>
-        <w:rPr>
-          <w:noProof/>
-        </w:rPr>
+        <w:lastRenderedPageBreak/>
         <mc:AlternateContent>
           <mc:Choice Requires="wpg">
             <w:drawing>
@@ -3328,27 +3624,14 @@
       <w:r>
         <w:t xml:space="preserve">Figure </w:t>
       </w:r>
-      <w:r>
-        <w:fldChar w:fldCharType="begin"/>
-      </w:r>
-      <w:r>
-        <w:instrText xml:space="preserve"> SEQ Figure \* ARABIC </w:instrText>
-      </w:r>
-      <w:r>
-        <w:fldChar w:fldCharType="separate"/>
-      </w:r>
-      <w:r>
-        <w:rPr>
-          <w:noProof/>
-        </w:rPr>
-        <w:t>12</w:t>
-      </w:r>
-      <w:r>
-        <w:rPr>
-          <w:noProof/>
-        </w:rPr>
-        <w:fldChar w:fldCharType="end"/>
-      </w:r>
+      <w:fldSimple w:instr=" SEQ Figure \* ARABIC ">
+        <w:r>
+          <w:rPr>
+            <w:noProof/>
+          </w:rPr>
+          <w:t>12</w:t>
+        </w:r>
+      </w:fldSimple>
       <w:bookmarkEnd w:id="14"/>
       <w:r>
         <w:t xml:space="preserve">: Adding the </w:t>
@@ -3469,27 +3752,14 @@
       <w:r>
         <w:t xml:space="preserve">Figure </w:t>
       </w:r>
-      <w:r>
-        <w:fldChar w:fldCharType="begin"/>
-      </w:r>
-      <w:r>
-        <w:instrText xml:space="preserve"> SEQ Figure \* ARABIC </w:instrText>
-      </w:r>
-      <w:r>
-        <w:fldChar w:fldCharType="separate"/>
-      </w:r>
-      <w:r>
-        <w:rPr>
-          <w:noProof/>
-        </w:rPr>
-        <w:t>13</w:t>
-      </w:r>
-      <w:r>
-        <w:rPr>
-          <w:noProof/>
-        </w:rPr>
-        <w:fldChar w:fldCharType="end"/>
-      </w:r>
+      <w:fldSimple w:instr=" SEQ Figure \* ARABIC ">
+        <w:r>
+          <w:rPr>
+            <w:noProof/>
+          </w:rPr>
+          <w:t>13</w:t>
+        </w:r>
+      </w:fldSimple>
       <w:bookmarkEnd w:id="15"/>
       <w:r>
         <w:t xml:space="preserve">: Adding a Tick event handler to </w:t>
@@ -3555,27 +3825,14 @@
       <w:r>
         <w:t xml:space="preserve">Figure </w:t>
       </w:r>
-      <w:r>
-        <w:fldChar w:fldCharType="begin"/>
-      </w:r>
-      <w:r>
-        <w:instrText xml:space="preserve"> SEQ Figure \* ARABIC </w:instrText>
-      </w:r>
-      <w:r>
-        <w:fldChar w:fldCharType="separate"/>
-      </w:r>
-      <w:r>
-        <w:rPr>
-          <w:noProof/>
-        </w:rPr>
-        <w:t>14</w:t>
-      </w:r>
-      <w:r>
-        <w:rPr>
-          <w:noProof/>
-        </w:rPr>
-        <w:fldChar w:fldCharType="end"/>
-      </w:r>
+      <w:fldSimple w:instr=" SEQ Figure \* ARABIC ">
+        <w:r>
+          <w:rPr>
+            <w:noProof/>
+          </w:rPr>
+          <w:t>14</w:t>
+        </w:r>
+      </w:fldSimple>
       <w:bookmarkEnd w:id="16"/>
       <w:r>
         <w:t xml:space="preserve">: </w:t>
@@ -3601,6 +3858,7 @@
         <w:contextualSpacing w:val="0"/>
       </w:pPr>
       <w:r>
+        <w:lastRenderedPageBreak/>
         <w:t xml:space="preserve">To update the </w:t>
       </w:r>
       <w:proofErr w:type="spellStart"/>
@@ -3730,27 +3988,14 @@
       <w:r>
         <w:t xml:space="preserve">Figure </w:t>
       </w:r>
-      <w:r>
-        <w:fldChar w:fldCharType="begin"/>
-      </w:r>
-      <w:r>
-        <w:instrText xml:space="preserve"> SEQ Figure \* ARABIC </w:instrText>
-      </w:r>
-      <w:r>
-        <w:fldChar w:fldCharType="separate"/>
-      </w:r>
-      <w:r>
-        <w:rPr>
-          <w:noProof/>
-        </w:rPr>
-        <w:t>15</w:t>
-      </w:r>
-      <w:r>
-        <w:rPr>
-          <w:noProof/>
-        </w:rPr>
-        <w:fldChar w:fldCharType="end"/>
-      </w:r>
+      <w:fldSimple w:instr=" SEQ Figure \* ARABIC ">
+        <w:r>
+          <w:rPr>
+            <w:noProof/>
+          </w:rPr>
+          <w:t>15</w:t>
+        </w:r>
+      </w:fldSimple>
       <w:bookmarkEnd w:id="17"/>
       <w:r>
         <w:t xml:space="preserve">: Logic to update </w:t>
@@ -3867,27 +4112,14 @@
       <w:r>
         <w:t xml:space="preserve">Figure </w:t>
       </w:r>
-      <w:r>
-        <w:fldChar w:fldCharType="begin"/>
-      </w:r>
-      <w:r>
-        <w:instrText xml:space="preserve"> SEQ Figure \* ARABIC </w:instrText>
-      </w:r>
-      <w:r>
-        <w:fldChar w:fldCharType="separate"/>
-      </w:r>
-      <w:r>
-        <w:rPr>
-          <w:noProof/>
-        </w:rPr>
-        <w:t>16</w:t>
-      </w:r>
-      <w:r>
-        <w:rPr>
-          <w:noProof/>
-        </w:rPr>
-        <w:fldChar w:fldCharType="end"/>
-      </w:r>
+      <w:fldSimple w:instr=" SEQ Figure \* ARABIC ">
+        <w:r>
+          <w:rPr>
+            <w:noProof/>
+          </w:rPr>
+          <w:t>16</w:t>
+        </w:r>
+      </w:fldSimple>
       <w:bookmarkEnd w:id="18"/>
       <w:r>
         <w:t xml:space="preserve">: </w:t>
@@ -3918,6 +4150,7 @@
         <w:contextualSpacing w:val="0"/>
       </w:pPr>
       <w:r>
+        <w:lastRenderedPageBreak/>
         <w:t xml:space="preserve">Add logic to the method to stop the timer, reset </w:t>
       </w:r>
       <w:proofErr w:type="spellStart"/>
@@ -4015,27 +4248,14 @@
       <w:r>
         <w:t xml:space="preserve">Figure </w:t>
       </w:r>
-      <w:r>
-        <w:fldChar w:fldCharType="begin"/>
-      </w:r>
-      <w:r>
-        <w:instrText xml:space="preserve"> SEQ Figure \* ARABIC </w:instrText>
-      </w:r>
-      <w:r>
-        <w:fldChar w:fldCharType="separate"/>
-      </w:r>
-      <w:r>
-        <w:rPr>
-          <w:noProof/>
-        </w:rPr>
-        <w:t>17</w:t>
-      </w:r>
-      <w:r>
-        <w:rPr>
-          <w:noProof/>
-        </w:rPr>
-        <w:fldChar w:fldCharType="end"/>
-      </w:r>
+      <w:fldSimple w:instr=" SEQ Figure \* ARABIC ">
+        <w:r>
+          <w:rPr>
+            <w:noProof/>
+          </w:rPr>
+          <w:t>17</w:t>
+        </w:r>
+      </w:fldSimple>
       <w:bookmarkEnd w:id="19"/>
       <w:r>
         <w:t>: Adding logic to reset the stopwatch</w:t>
@@ -4464,21 +4684,12 @@
                                 </w:rPr>
                                 <w:t xml:space="preserve"> for </w:t>
                               </w:r>
-                              <w:proofErr w:type="spellStart"/>
                               <w:r>
                                 <w:rPr>
                                   <w:sz w:val="20"/>
                                   <w:szCs w:val="20"/>
                                 </w:rPr>
-                                <w:t>FrmStopwatch</w:t>
-                              </w:r>
-                              <w:proofErr w:type="spellEnd"/>
-                              <w:r>
-                                <w:rPr>
-                                  <w:sz w:val="20"/>
-                                  <w:szCs w:val="20"/>
-                                </w:rPr>
-                                <w:t>. Make sure to include the class declaration in the image.</w:t>
+                                <w:t>FrmStopwatch. Make sure to include the class declaration in the image.</w:t>
                               </w:r>
                             </w:p>
                             <w:p>
@@ -4506,41 +4717,8 @@
                                   <w:sz w:val="20"/>
                                   <w:szCs w:val="20"/>
                                 </w:rPr>
-                                <w:t xml:space="preserve">the </w:t>
+                                <w:t xml:space="preserve">the BtnStartClickEH, BtnStopClickEH, </w:t>
                               </w:r>
-                              <w:proofErr w:type="spellStart"/>
-                              <w:r>
-                                <w:rPr>
-                                  <w:sz w:val="20"/>
-                                  <w:szCs w:val="20"/>
-                                </w:rPr>
-                                <w:t>BtnStartClickEH</w:t>
-                              </w:r>
-                              <w:proofErr w:type="spellEnd"/>
-                              <w:r>
-                                <w:rPr>
-                                  <w:sz w:val="20"/>
-                                  <w:szCs w:val="20"/>
-                                </w:rPr>
-                                <w:t xml:space="preserve">, </w:t>
-                              </w:r>
-                              <w:proofErr w:type="spellStart"/>
-                              <w:r>
-                                <w:rPr>
-                                  <w:sz w:val="20"/>
-                                  <w:szCs w:val="20"/>
-                                </w:rPr>
-                                <w:t>BtnStopClickEH</w:t>
-                              </w:r>
-                              <w:proofErr w:type="spellEnd"/>
-                              <w:r>
-                                <w:rPr>
-                                  <w:sz w:val="20"/>
-                                  <w:szCs w:val="20"/>
-                                </w:rPr>
-                                <w:t xml:space="preserve">, </w:t>
-                              </w:r>
-                              <w:proofErr w:type="spellStart"/>
                               <w:r>
                                 <w:rPr>
                                   <w:sz w:val="20"/>
@@ -4548,7 +4726,6 @@
                                 </w:rPr>
                                 <w:t>TmrStopwatchTickEH</w:t>
                               </w:r>
-                              <w:proofErr w:type="spellEnd"/>
                               <w:r>
                                 <w:rPr>
                                   <w:sz w:val="20"/>
@@ -4556,21 +4733,12 @@
                                 </w:rPr>
                                 <w:t xml:space="preserve">, and </w:t>
                               </w:r>
-                              <w:proofErr w:type="spellStart"/>
                               <w:r>
                                 <w:rPr>
                                   <w:sz w:val="20"/>
                                   <w:szCs w:val="20"/>
                                 </w:rPr>
-                                <w:t>BtnResetClickEH</w:t>
-                              </w:r>
-                              <w:proofErr w:type="spellEnd"/>
-                              <w:r>
-                                <w:rPr>
-                                  <w:sz w:val="20"/>
-                                  <w:szCs w:val="20"/>
-                                </w:rPr>
-                                <w:t xml:space="preserve"> </w:t>
+                                <w:t xml:space="preserve">BtnResetClickEH </w:t>
                               </w:r>
                               <w:r>
                                 <w:rPr>
@@ -4605,23 +4773,7 @@
                                   <w:sz w:val="20"/>
                                   <w:szCs w:val="20"/>
                                 </w:rPr>
-                                <w:t xml:space="preserve">Take a screen shot of the UML for the </w:t>
-                              </w:r>
-                              <w:proofErr w:type="spellStart"/>
-                              <w:r>
-                                <w:rPr>
-                                  <w:sz w:val="20"/>
-                                  <w:szCs w:val="20"/>
-                                </w:rPr>
-                                <w:t>FrmStopwatch</w:t>
-                              </w:r>
-                              <w:proofErr w:type="spellEnd"/>
-                              <w:r>
-                                <w:rPr>
-                                  <w:sz w:val="20"/>
-                                  <w:szCs w:val="20"/>
-                                </w:rPr>
-                                <w:t xml:space="preserve"> class.</w:t>
+                                <w:t>Take a screen shot of the UML for the FrmStopwatch class.</w:t>
                               </w:r>
                             </w:p>
                             <w:p>
@@ -4794,21 +4946,12 @@
                           </w:rPr>
                           <w:t xml:space="preserve"> for </w:t>
                         </w:r>
-                        <w:proofErr w:type="spellStart"/>
                         <w:r>
                           <w:rPr>
                             <w:sz w:val="20"/>
                             <w:szCs w:val="20"/>
                           </w:rPr>
-                          <w:t>FrmStopwatch</w:t>
-                        </w:r>
-                        <w:proofErr w:type="spellEnd"/>
-                        <w:r>
-                          <w:rPr>
-                            <w:sz w:val="20"/>
-                            <w:szCs w:val="20"/>
-                          </w:rPr>
-                          <w:t>. Make sure to include the class declaration in the image.</w:t>
+                          <w:t>FrmStopwatch. Make sure to include the class declaration in the image.</w:t>
                         </w:r>
                       </w:p>
                       <w:p>
@@ -4836,41 +4979,8 @@
                             <w:sz w:val="20"/>
                             <w:szCs w:val="20"/>
                           </w:rPr>
-                          <w:t xml:space="preserve">the </w:t>
+                          <w:t xml:space="preserve">the BtnStartClickEH, BtnStopClickEH, </w:t>
                         </w:r>
-                        <w:proofErr w:type="spellStart"/>
-                        <w:r>
-                          <w:rPr>
-                            <w:sz w:val="20"/>
-                            <w:szCs w:val="20"/>
-                          </w:rPr>
-                          <w:t>BtnStartClickEH</w:t>
-                        </w:r>
-                        <w:proofErr w:type="spellEnd"/>
-                        <w:r>
-                          <w:rPr>
-                            <w:sz w:val="20"/>
-                            <w:szCs w:val="20"/>
-                          </w:rPr>
-                          <w:t xml:space="preserve">, </w:t>
-                        </w:r>
-                        <w:proofErr w:type="spellStart"/>
-                        <w:r>
-                          <w:rPr>
-                            <w:sz w:val="20"/>
-                            <w:szCs w:val="20"/>
-                          </w:rPr>
-                          <w:t>BtnStopClickEH</w:t>
-                        </w:r>
-                        <w:proofErr w:type="spellEnd"/>
-                        <w:r>
-                          <w:rPr>
-                            <w:sz w:val="20"/>
-                            <w:szCs w:val="20"/>
-                          </w:rPr>
-                          <w:t xml:space="preserve">, </w:t>
-                        </w:r>
-                        <w:proofErr w:type="spellStart"/>
                         <w:r>
                           <w:rPr>
                             <w:sz w:val="20"/>
@@ -4878,7 +4988,6 @@
                           </w:rPr>
                           <w:t>TmrStopwatchTickEH</w:t>
                         </w:r>
-                        <w:proofErr w:type="spellEnd"/>
                         <w:r>
                           <w:rPr>
                             <w:sz w:val="20"/>
@@ -4886,21 +4995,12 @@
                           </w:rPr>
                           <w:t xml:space="preserve">, and </w:t>
                         </w:r>
-                        <w:proofErr w:type="spellStart"/>
                         <w:r>
                           <w:rPr>
                             <w:sz w:val="20"/>
                             <w:szCs w:val="20"/>
                           </w:rPr>
-                          <w:t>BtnResetClickEH</w:t>
-                        </w:r>
-                        <w:proofErr w:type="spellEnd"/>
-                        <w:r>
-                          <w:rPr>
-                            <w:sz w:val="20"/>
-                            <w:szCs w:val="20"/>
-                          </w:rPr>
-                          <w:t xml:space="preserve"> </w:t>
+                          <w:t xml:space="preserve">BtnResetClickEH </w:t>
                         </w:r>
                         <w:r>
                           <w:rPr>
@@ -4935,23 +5035,7 @@
                             <w:sz w:val="20"/>
                             <w:szCs w:val="20"/>
                           </w:rPr>
-                          <w:t xml:space="preserve">Take a screen shot of the UML for the </w:t>
-                        </w:r>
-                        <w:proofErr w:type="spellStart"/>
-                        <w:r>
-                          <w:rPr>
-                            <w:sz w:val="20"/>
-                            <w:szCs w:val="20"/>
-                          </w:rPr>
-                          <w:t>FrmStopwatch</w:t>
-                        </w:r>
-                        <w:proofErr w:type="spellEnd"/>
-                        <w:r>
-                          <w:rPr>
-                            <w:sz w:val="20"/>
-                            <w:szCs w:val="20"/>
-                          </w:rPr>
-                          <w:t xml:space="preserve"> class.</w:t>
+                          <w:t>Take a screen shot of the UML for the FrmStopwatch class.</w:t>
                         </w:r>
                       </w:p>
                       <w:p>
@@ -5063,6 +5147,7 @@
         <w:rPr>
           <w:rFonts w:asciiTheme="minorHAnsi" w:hAnsiTheme="minorHAnsi"/>
         </w:rPr>
+        <w:lastRenderedPageBreak/>
         <w:t xml:space="preserve">Part 2 – Create a </w:t>
       </w:r>
       <w:r>
@@ -5235,27 +5320,14 @@
       <w:r>
         <w:t xml:space="preserve">Figure </w:t>
       </w:r>
-      <w:r>
-        <w:fldChar w:fldCharType="begin"/>
-      </w:r>
-      <w:r>
-        <w:instrText xml:space="preserve"> SEQ Figure \* ARABIC </w:instrText>
-      </w:r>
-      <w:r>
-        <w:fldChar w:fldCharType="separate"/>
-      </w:r>
-      <w:r>
-        <w:rPr>
-          <w:noProof/>
-        </w:rPr>
-        <w:t>18</w:t>
-      </w:r>
-      <w:r>
-        <w:rPr>
-          <w:noProof/>
-        </w:rPr>
-        <w:fldChar w:fldCharType="end"/>
-      </w:r>
+      <w:fldSimple w:instr=" SEQ Figure \* ARABIC ">
+        <w:r>
+          <w:rPr>
+            <w:noProof/>
+          </w:rPr>
+          <w:t>18</w:t>
+        </w:r>
+      </w:fldSimple>
       <w:bookmarkEnd w:id="21"/>
       <w:r>
         <w:t xml:space="preserve">: Reconfiguring </w:t>
@@ -5283,6 +5355,7 @@
         <w:contextualSpacing w:val="0"/>
       </w:pPr>
       <w:r>
+        <w:lastRenderedPageBreak/>
         <w:t xml:space="preserve">Add a new button named </w:t>
       </w:r>
       <w:proofErr w:type="spellStart"/>
@@ -5379,27 +5452,14 @@
       <w:r>
         <w:t xml:space="preserve">Figure </w:t>
       </w:r>
-      <w:r>
-        <w:fldChar w:fldCharType="begin"/>
-      </w:r>
-      <w:r>
-        <w:instrText xml:space="preserve"> SEQ Figure \* ARABIC </w:instrText>
-      </w:r>
-      <w:r>
-        <w:fldChar w:fldCharType="separate"/>
-      </w:r>
-      <w:r>
-        <w:rPr>
-          <w:noProof/>
-        </w:rPr>
-        <w:t>19</w:t>
-      </w:r>
-      <w:r>
-        <w:rPr>
-          <w:noProof/>
-        </w:rPr>
-        <w:fldChar w:fldCharType="end"/>
-      </w:r>
+      <w:fldSimple w:instr=" SEQ Figure \* ARABIC ">
+        <w:r>
+          <w:rPr>
+            <w:noProof/>
+          </w:rPr>
+          <w:t>19</w:t>
+        </w:r>
+      </w:fldSimple>
       <w:bookmarkEnd w:id="22"/>
       <w:r>
         <w:t xml:space="preserve">: Adding a target button to </w:t>
@@ -5763,27 +5823,14 @@
       <w:r>
         <w:t xml:space="preserve">Figure </w:t>
       </w:r>
-      <w:r>
-        <w:fldChar w:fldCharType="begin"/>
-      </w:r>
-      <w:r>
-        <w:instrText xml:space="preserve"> SEQ Figure \* ARABIC </w:instrText>
-      </w:r>
-      <w:r>
-        <w:fldChar w:fldCharType="separate"/>
-      </w:r>
-      <w:r>
-        <w:rPr>
-          <w:noProof/>
-        </w:rPr>
-        <w:t>20</w:t>
-      </w:r>
-      <w:r>
-        <w:rPr>
-          <w:noProof/>
-        </w:rPr>
-        <w:fldChar w:fldCharType="end"/>
-      </w:r>
+      <w:fldSimple w:instr=" SEQ Figure \* ARABIC ">
+        <w:r>
+          <w:rPr>
+            <w:noProof/>
+          </w:rPr>
+          <w:t>20</w:t>
+        </w:r>
+      </w:fldSimple>
       <w:bookmarkEnd w:id="24"/>
       <w:r>
         <w:t xml:space="preserve">: Click event handler for </w:t>
@@ -5807,6 +5854,7 @@
         <w:contextualSpacing w:val="0"/>
       </w:pPr>
       <w:r>
+        <w:lastRenderedPageBreak/>
         <w:t xml:space="preserve">To move the target button around the screen, we will need to create a </w:t>
       </w:r>
       <w:r>
@@ -5894,27 +5942,14 @@
       <w:r>
         <w:t xml:space="preserve">Figure </w:t>
       </w:r>
-      <w:r>
-        <w:fldChar w:fldCharType="begin"/>
-      </w:r>
-      <w:r>
-        <w:instrText xml:space="preserve"> SEQ Figure \* ARABIC </w:instrText>
-      </w:r>
-      <w:r>
-        <w:fldChar w:fldCharType="separate"/>
-      </w:r>
-      <w:r>
-        <w:rPr>
-          <w:noProof/>
-        </w:rPr>
-        <w:t>21</w:t>
-      </w:r>
-      <w:r>
-        <w:rPr>
-          <w:noProof/>
-        </w:rPr>
-        <w:fldChar w:fldCharType="end"/>
-      </w:r>
+      <w:fldSimple w:instr=" SEQ Figure \* ARABIC ">
+        <w:r>
+          <w:rPr>
+            <w:noProof/>
+          </w:rPr>
+          <w:t>21</w:t>
+        </w:r>
+      </w:fldSimple>
       <w:bookmarkEnd w:id="25"/>
       <w:r>
         <w:t>: Adding a random object to generate numbers</w:t>
@@ -6018,27 +6053,14 @@
       <w:r>
         <w:t xml:space="preserve">Figure </w:t>
       </w:r>
-      <w:r>
-        <w:fldChar w:fldCharType="begin"/>
-      </w:r>
-      <w:r>
-        <w:instrText xml:space="preserve"> SEQ Figure \* ARABIC </w:instrText>
-      </w:r>
-      <w:r>
-        <w:fldChar w:fldCharType="separate"/>
-      </w:r>
-      <w:r>
-        <w:rPr>
-          <w:noProof/>
-        </w:rPr>
-        <w:t>22</w:t>
-      </w:r>
-      <w:r>
-        <w:rPr>
-          <w:noProof/>
-        </w:rPr>
-        <w:fldChar w:fldCharType="end"/>
-      </w:r>
+      <w:fldSimple w:instr=" SEQ Figure \* ARABIC ">
+        <w:r>
+          <w:rPr>
+            <w:noProof/>
+          </w:rPr>
+          <w:t>22</w:t>
+        </w:r>
+      </w:fldSimple>
       <w:bookmarkEnd w:id="26"/>
       <w:r>
         <w:t xml:space="preserve">: Updated summary comment and end-of-method comment for </w:t>
@@ -6066,6 +6088,7 @@
         <w:contextualSpacing w:val="0"/>
       </w:pPr>
       <w:r>
+        <w:lastRenderedPageBreak/>
         <w:t>We will relocate the target button every 3 seconds</w:t>
       </w:r>
       <w:r>
@@ -6156,27 +6179,14 @@
       <w:r>
         <w:t xml:space="preserve">Figure </w:t>
       </w:r>
-      <w:r>
-        <w:fldChar w:fldCharType="begin"/>
-      </w:r>
-      <w:r>
-        <w:instrText xml:space="preserve"> SEQ Figure \* ARABIC </w:instrText>
-      </w:r>
-      <w:r>
-        <w:fldChar w:fldCharType="separate"/>
-      </w:r>
-      <w:r>
-        <w:rPr>
-          <w:noProof/>
-        </w:rPr>
-        <w:t>23</w:t>
-      </w:r>
-      <w:r>
-        <w:rPr>
-          <w:noProof/>
-        </w:rPr>
-        <w:fldChar w:fldCharType="end"/>
-      </w:r>
+      <w:fldSimple w:instr=" SEQ Figure \* ARABIC ">
+        <w:r>
+          <w:rPr>
+            <w:noProof/>
+          </w:rPr>
+          <w:t>23</w:t>
+        </w:r>
+      </w:fldSimple>
       <w:bookmarkEnd w:id="27"/>
       <w:r>
         <w:t xml:space="preserve">: Adding logic to </w:t>
@@ -6583,21 +6593,12 @@
                                 </w:rPr>
                                 <w:t xml:space="preserve">Take a screenshot of the </w:t>
                               </w:r>
-                              <w:proofErr w:type="spellStart"/>
                               <w:r>
                                 <w:rPr>
                                   <w:sz w:val="20"/>
                                   <w:szCs w:val="20"/>
                                 </w:rPr>
-                                <w:t>BtnTargetClickEH</w:t>
-                              </w:r>
-                              <w:proofErr w:type="spellEnd"/>
-                              <w:r>
-                                <w:rPr>
-                                  <w:sz w:val="20"/>
-                                  <w:szCs w:val="20"/>
-                                </w:rPr>
-                                <w:t xml:space="preserve"> </w:t>
+                                <w:t xml:space="preserve">BtnTargetClickEH </w:t>
                               </w:r>
                               <w:r>
                                 <w:rPr>
@@ -6606,21 +6607,12 @@
                                 </w:rPr>
                                 <w:t xml:space="preserve">and </w:t>
                               </w:r>
-                              <w:proofErr w:type="spellStart"/>
                               <w:r>
                                 <w:rPr>
                                   <w:sz w:val="20"/>
                                   <w:szCs w:val="20"/>
                                 </w:rPr>
-                                <w:t>TmrStopwatchTickEH</w:t>
-                              </w:r>
-                              <w:proofErr w:type="spellEnd"/>
-                              <w:r>
-                                <w:rPr>
-                                  <w:sz w:val="20"/>
-                                  <w:szCs w:val="20"/>
-                                </w:rPr>
-                                <w:t xml:space="preserve"> </w:t>
+                                <w:t xml:space="preserve">TmrStopwatchTickEH </w:t>
                               </w:r>
                               <w:r>
                                 <w:rPr>
@@ -6648,23 +6640,7 @@
                                   <w:sz w:val="20"/>
                                   <w:szCs w:val="20"/>
                                 </w:rPr>
-                                <w:t xml:space="preserve">Take a screenshot of the UML for the </w:t>
-                              </w:r>
-                              <w:proofErr w:type="spellStart"/>
-                              <w:r>
-                                <w:rPr>
-                                  <w:sz w:val="20"/>
-                                  <w:szCs w:val="20"/>
-                                </w:rPr>
-                                <w:t>FrmStopwatch</w:t>
-                              </w:r>
-                              <w:proofErr w:type="spellEnd"/>
-                              <w:r>
-                                <w:rPr>
-                                  <w:sz w:val="20"/>
-                                  <w:szCs w:val="20"/>
-                                </w:rPr>
-                                <w:t xml:space="preserve"> class.</w:t>
+                                <w:t>Take a screenshot of the UML for the FrmStopwatch class.</w:t>
                               </w:r>
                             </w:p>
                             <w:p>
@@ -6823,21 +6799,12 @@
                           </w:rPr>
                           <w:t xml:space="preserve">Take a screenshot of the </w:t>
                         </w:r>
-                        <w:proofErr w:type="spellStart"/>
                         <w:r>
                           <w:rPr>
                             <w:sz w:val="20"/>
                             <w:szCs w:val="20"/>
                           </w:rPr>
-                          <w:t>BtnTargetClickEH</w:t>
-                        </w:r>
-                        <w:proofErr w:type="spellEnd"/>
-                        <w:r>
-                          <w:rPr>
-                            <w:sz w:val="20"/>
-                            <w:szCs w:val="20"/>
-                          </w:rPr>
-                          <w:t xml:space="preserve"> </w:t>
+                          <w:t xml:space="preserve">BtnTargetClickEH </w:t>
                         </w:r>
                         <w:r>
                           <w:rPr>
@@ -6846,21 +6813,12 @@
                           </w:rPr>
                           <w:t xml:space="preserve">and </w:t>
                         </w:r>
-                        <w:proofErr w:type="spellStart"/>
                         <w:r>
                           <w:rPr>
                             <w:sz w:val="20"/>
                             <w:szCs w:val="20"/>
                           </w:rPr>
-                          <w:t>TmrStopwatchTickEH</w:t>
-                        </w:r>
-                        <w:proofErr w:type="spellEnd"/>
-                        <w:r>
-                          <w:rPr>
-                            <w:sz w:val="20"/>
-                            <w:szCs w:val="20"/>
-                          </w:rPr>
-                          <w:t xml:space="preserve"> </w:t>
+                          <w:t xml:space="preserve">TmrStopwatchTickEH </w:t>
                         </w:r>
                         <w:r>
                           <w:rPr>
@@ -6888,23 +6846,7 @@
                             <w:sz w:val="20"/>
                             <w:szCs w:val="20"/>
                           </w:rPr>
-                          <w:t xml:space="preserve">Take a screenshot of the UML for the </w:t>
-                        </w:r>
-                        <w:proofErr w:type="spellStart"/>
-                        <w:r>
-                          <w:rPr>
-                            <w:sz w:val="20"/>
-                            <w:szCs w:val="20"/>
-                          </w:rPr>
-                          <w:t>FrmStopwatch</w:t>
-                        </w:r>
-                        <w:proofErr w:type="spellEnd"/>
-                        <w:r>
-                          <w:rPr>
-                            <w:sz w:val="20"/>
-                            <w:szCs w:val="20"/>
-                          </w:rPr>
-                          <w:t xml:space="preserve"> class.</w:t>
+                          <w:t>Take a screenshot of the UML for the FrmStopwatch class.</w:t>
                         </w:r>
                       </w:p>
                       <w:p>
@@ -7015,6 +6957,7 @@
         <w:rPr>
           <w:rFonts w:asciiTheme="minorHAnsi" w:hAnsiTheme="minorHAnsi"/>
         </w:rPr>
+        <w:lastRenderedPageBreak/>
         <w:t>Part 3</w:t>
       </w:r>
       <w:r>
@@ -7450,6 +7393,7 @@
           <w:b/>
           <w:bCs/>
         </w:rPr>
+        <w:lastRenderedPageBreak/>
         <w:t>Custom Graphics</w:t>
       </w:r>
     </w:p>
@@ -8400,6 +8344,7 @@
         <w:rPr>
           <w:rFonts w:asciiTheme="minorHAnsi" w:hAnsiTheme="minorHAnsi"/>
         </w:rPr>
+        <w:lastRenderedPageBreak/>
         <w:t xml:space="preserve">What </w:t>
       </w:r>
       <w:r>
@@ -8590,6 +8535,7 @@
         <w:rPr>
           <w:rFonts w:asciiTheme="minorHAnsi" w:hAnsiTheme="minorHAnsi"/>
         </w:rPr>
+        <w:lastRenderedPageBreak/>
         <w:t xml:space="preserve">Check for </w:t>
       </w:r>
       <w:r>
@@ -8955,6 +8901,7 @@
         <w:spacing w:before="120" w:after="240"/>
       </w:pPr>
       <w:r>
+        <w:lastRenderedPageBreak/>
         <w:t>Answer Key:</w:t>
       </w:r>
     </w:p>
@@ -9133,6 +9080,7 @@
           <w:rFonts w:asciiTheme="minorHAnsi" w:hAnsiTheme="minorHAnsi"/>
           <w:color w:val="345A8A"/>
         </w:rPr>
+        <w:lastRenderedPageBreak/>
         <w:t>Deliverables</w:t>
       </w:r>
       <w:bookmarkEnd w:id="32"/>
@@ -9560,6 +9508,7 @@
         <w:spacing w:before="240" w:after="120"/>
       </w:pPr>
       <w:r>
+        <w:lastRenderedPageBreak/>
         <w:t>Part 2: Activity Challenges</w:t>
       </w:r>
     </w:p>
@@ -9911,7 +9860,7 @@
 </file>
 
 <file path=word/endnotes.xml><?xml version="1.0" encoding="utf-8"?>
-<w:endnotes xmlns:wpc="http://schemas.microsoft.com/office/word/2010/wordprocessingCanvas" xmlns:cx="http://schemas.microsoft.com/office/drawing/2014/chartex" xmlns:cx1="http://schemas.microsoft.com/office/drawing/2015/9/8/chartex" xmlns:cx2="http://schemas.microsoft.com/office/drawing/2015/10/21/chartex" xmlns:cx3="http://schemas.microsoft.com/office/drawing/2016/5/9/chartex" xmlns:cx4="http://schemas.microsoft.com/office/drawing/2016/5/10/chartex" xmlns:cx5="http://schemas.microsoft.com/office/drawing/2016/5/11/chartex" xmlns:cx6="http://schemas.microsoft.com/office/drawing/2016/5/12/chartex" xmlns:cx7="http://schemas.microsoft.com/office/drawing/2016/5/13/chartex" xmlns:cx8="http://schemas.microsoft.com/office/drawing/2016/5/14/chartex" xmlns:mc="http://schemas.openxmlformats.org/markup-compatibility/2006" xmlns:aink="http://schemas.microsoft.com/office/drawing/2016/ink" xmlns:am3d="http://schemas.microsoft.com/office/drawing/2017/model3d" xmlns:o="urn:schemas-microsoft-com:office:office" xmlns:oel="http://schemas.microsoft.com/office/2019/extlst" xmlns:r="http://schemas.openxmlformats.org/officeDocument/2006/relationships" xmlns:m="http://schemas.openxmlformats.org/officeDocument/2006/math" xmlns:v="urn:schemas-microsoft-com:vml" xmlns:wp14="http://schemas.microsoft.com/office/word/2010/wordprocessingDrawing" xmlns:wp="http://schemas.openxmlformats.org/drawingml/2006/wordprocessingDrawing" xmlns:w10="urn:schemas-microsoft-com:office:word" xmlns:w="http://schemas.openxmlformats.org/wordprocessingml/2006/main" xmlns:w14="http://schemas.microsoft.com/office/word/2010/wordml" xmlns:w15="http://schemas.microsoft.com/office/word/2012/wordml" xmlns:w16cex="http://schemas.microsoft.com/office/word/2018/wordml/cex" xmlns:w16cid="http://schemas.microsoft.com/office/word/2016/wordml/cid" xmlns:w16="http://schemas.microsoft.com/office/word/2018/wordml" xmlns:w16sdtdh="http://schemas.microsoft.com/office/word/2020/wordml/sdtdatahash" xmlns:w16se="http://schemas.microsoft.com/office/word/2015/wordml/symex" xmlns:wpg="http://schemas.microsoft.com/office/word/2010/wordprocessingGroup" xmlns:wpi="http://schemas.microsoft.com/office/word/2010/wordprocessingInk" xmlns:wne="http://schemas.microsoft.com/office/word/2006/wordml" xmlns:wps="http://schemas.microsoft.com/office/word/2010/wordprocessingShape" mc:Ignorable="w14 w15 w16se w16cid w16 w16cex w16sdtdh wp14">
+<w:endnotes xmlns:wpc="http://schemas.microsoft.com/office/word/2010/wordprocessingCanvas" xmlns:cx="http://schemas.microsoft.com/office/drawing/2014/chartex" xmlns:cx1="http://schemas.microsoft.com/office/drawing/2015/9/8/chartex" xmlns:cx2="http://schemas.microsoft.com/office/drawing/2015/10/21/chartex" xmlns:cx3="http://schemas.microsoft.com/office/drawing/2016/5/9/chartex" xmlns:cx4="http://schemas.microsoft.com/office/drawing/2016/5/10/chartex" xmlns:cx5="http://schemas.microsoft.com/office/drawing/2016/5/11/chartex" xmlns:cx6="http://schemas.microsoft.com/office/drawing/2016/5/12/chartex" xmlns:cx7="http://schemas.microsoft.com/office/drawing/2016/5/13/chartex" xmlns:cx8="http://schemas.microsoft.com/office/drawing/2016/5/14/chartex" xmlns:mc="http://schemas.openxmlformats.org/markup-compatibility/2006" xmlns:aink="http://schemas.microsoft.com/office/drawing/2016/ink" xmlns:am3d="http://schemas.microsoft.com/office/drawing/2017/model3d" xmlns:o="urn:schemas-microsoft-com:office:office" xmlns:oel="http://schemas.microsoft.com/office/2019/extlst" xmlns:r="http://schemas.openxmlformats.org/officeDocument/2006/relationships" xmlns:m="http://schemas.openxmlformats.org/officeDocument/2006/math" xmlns:v="urn:schemas-microsoft-com:vml" xmlns:wp14="http://schemas.microsoft.com/office/word/2010/wordprocessingDrawing" xmlns:wp="http://schemas.openxmlformats.org/drawingml/2006/wordprocessingDrawing" xmlns:w10="urn:schemas-microsoft-com:office:word" xmlns:w="http://schemas.openxmlformats.org/wordprocessingml/2006/main" xmlns:w14="http://schemas.microsoft.com/office/word/2010/wordml" xmlns:w15="http://schemas.microsoft.com/office/word/2012/wordml" xmlns:w16cex="http://schemas.microsoft.com/office/word/2018/wordml/cex" xmlns:w16cid="http://schemas.microsoft.com/office/word/2016/wordml/cid" xmlns:w16="http://schemas.microsoft.com/office/word/2018/wordml" xmlns:w16du="http://schemas.microsoft.com/office/word/2023/wordml/word16du" xmlns:w16sdtdh="http://schemas.microsoft.com/office/word/2020/wordml/sdtdatahash" xmlns:w16sdtfl="http://schemas.microsoft.com/office/word/2024/wordml/sdtformatlock" xmlns:w16se="http://schemas.microsoft.com/office/word/2015/wordml/symex" xmlns:wpg="http://schemas.microsoft.com/office/word/2010/wordprocessingGroup" xmlns:wpi="http://schemas.microsoft.com/office/word/2010/wordprocessingInk" xmlns:wne="http://schemas.microsoft.com/office/word/2006/wordml" xmlns:wps="http://schemas.microsoft.com/office/word/2010/wordprocessingShape" mc:Ignorable="w14 w15 w16se w16cid w16 w16cex w16sdtdh w16sdtfl w16du wp14">
   <w:endnote w:type="separator" w:id="-1">
     <w:p>
       <w:r>
@@ -9930,7 +9879,7 @@
 </file>
 
 <file path=word/footer1.xml><?xml version="1.0" encoding="utf-8"?>
-<w:ftr xmlns:wpc="http://schemas.microsoft.com/office/word/2010/wordprocessingCanvas" xmlns:cx="http://schemas.microsoft.com/office/drawing/2014/chartex" xmlns:cx1="http://schemas.microsoft.com/office/drawing/2015/9/8/chartex" xmlns:cx2="http://schemas.microsoft.com/office/drawing/2015/10/21/chartex" xmlns:cx3="http://schemas.microsoft.com/office/drawing/2016/5/9/chartex" xmlns:cx4="http://schemas.microsoft.com/office/drawing/2016/5/10/chartex" xmlns:cx5="http://schemas.microsoft.com/office/drawing/2016/5/11/chartex" xmlns:cx6="http://schemas.microsoft.com/office/drawing/2016/5/12/chartex" xmlns:cx7="http://schemas.microsoft.com/office/drawing/2016/5/13/chartex" xmlns:cx8="http://schemas.microsoft.com/office/drawing/2016/5/14/chartex" xmlns:mc="http://schemas.openxmlformats.org/markup-compatibility/2006" xmlns:aink="http://schemas.microsoft.com/office/drawing/2016/ink" xmlns:am3d="http://schemas.microsoft.com/office/drawing/2017/model3d" xmlns:o="urn:schemas-microsoft-com:office:office" xmlns:oel="http://schemas.microsoft.com/office/2019/extlst" xmlns:r="http://schemas.openxmlformats.org/officeDocument/2006/relationships" xmlns:m="http://schemas.openxmlformats.org/officeDocument/2006/math" xmlns:v="urn:schemas-microsoft-com:vml" xmlns:wp14="http://schemas.microsoft.com/office/word/2010/wordprocessingDrawing" xmlns:wp="http://schemas.openxmlformats.org/drawingml/2006/wordprocessingDrawing" xmlns:w10="urn:schemas-microsoft-com:office:word" xmlns:w="http://schemas.openxmlformats.org/wordprocessingml/2006/main" xmlns:w14="http://schemas.microsoft.com/office/word/2010/wordml" xmlns:w15="http://schemas.microsoft.com/office/word/2012/wordml" xmlns:w16cex="http://schemas.microsoft.com/office/word/2018/wordml/cex" xmlns:w16cid="http://schemas.microsoft.com/office/word/2016/wordml/cid" xmlns:w16="http://schemas.microsoft.com/office/word/2018/wordml" xmlns:w16sdtdh="http://schemas.microsoft.com/office/word/2020/wordml/sdtdatahash" xmlns:w16se="http://schemas.microsoft.com/office/word/2015/wordml/symex" xmlns:wpg="http://schemas.microsoft.com/office/word/2010/wordprocessingGroup" xmlns:wpi="http://schemas.microsoft.com/office/word/2010/wordprocessingInk" xmlns:wne="http://schemas.microsoft.com/office/word/2006/wordml" xmlns:wps="http://schemas.microsoft.com/office/word/2010/wordprocessingShape" mc:Ignorable="w14 w15 w16se w16cid w16 w16cex w16sdtdh wp14">
+<w:ftr xmlns:wpc="http://schemas.microsoft.com/office/word/2010/wordprocessingCanvas" xmlns:cx="http://schemas.microsoft.com/office/drawing/2014/chartex" xmlns:cx1="http://schemas.microsoft.com/office/drawing/2015/9/8/chartex" xmlns:cx2="http://schemas.microsoft.com/office/drawing/2015/10/21/chartex" xmlns:cx3="http://schemas.microsoft.com/office/drawing/2016/5/9/chartex" xmlns:cx4="http://schemas.microsoft.com/office/drawing/2016/5/10/chartex" xmlns:cx5="http://schemas.microsoft.com/office/drawing/2016/5/11/chartex" xmlns:cx6="http://schemas.microsoft.com/office/drawing/2016/5/12/chartex" xmlns:cx7="http://schemas.microsoft.com/office/drawing/2016/5/13/chartex" xmlns:cx8="http://schemas.microsoft.com/office/drawing/2016/5/14/chartex" xmlns:mc="http://schemas.openxmlformats.org/markup-compatibility/2006" xmlns:aink="http://schemas.microsoft.com/office/drawing/2016/ink" xmlns:am3d="http://schemas.microsoft.com/office/drawing/2017/model3d" xmlns:o="urn:schemas-microsoft-com:office:office" xmlns:oel="http://schemas.microsoft.com/office/2019/extlst" xmlns:r="http://schemas.openxmlformats.org/officeDocument/2006/relationships" xmlns:m="http://schemas.openxmlformats.org/officeDocument/2006/math" xmlns:v="urn:schemas-microsoft-com:vml" xmlns:wp14="http://schemas.microsoft.com/office/word/2010/wordprocessingDrawing" xmlns:wp="http://schemas.openxmlformats.org/drawingml/2006/wordprocessingDrawing" xmlns:w10="urn:schemas-microsoft-com:office:word" xmlns:w="http://schemas.openxmlformats.org/wordprocessingml/2006/main" xmlns:w14="http://schemas.microsoft.com/office/word/2010/wordml" xmlns:w15="http://schemas.microsoft.com/office/word/2012/wordml" xmlns:w16cex="http://schemas.microsoft.com/office/word/2018/wordml/cex" xmlns:w16cid="http://schemas.microsoft.com/office/word/2016/wordml/cid" xmlns:w16="http://schemas.microsoft.com/office/word/2018/wordml" xmlns:w16du="http://schemas.microsoft.com/office/word/2023/wordml/word16du" xmlns:w16sdtdh="http://schemas.microsoft.com/office/word/2020/wordml/sdtdatahash" xmlns:w16sdtfl="http://schemas.microsoft.com/office/word/2024/wordml/sdtformatlock" xmlns:w16se="http://schemas.microsoft.com/office/word/2015/wordml/symex" xmlns:wpg="http://schemas.microsoft.com/office/word/2010/wordprocessingGroup" xmlns:wpi="http://schemas.microsoft.com/office/word/2010/wordprocessingInk" xmlns:wne="http://schemas.microsoft.com/office/word/2006/wordml" xmlns:wps="http://schemas.microsoft.com/office/word/2010/wordprocessingShape" mc:Ignorable="w14 w15 w16se w16cid w16 w16cex w16sdtdh w16sdtfl w16du wp14">
   <w:p>
     <w:pPr>
       <w:pStyle w:val="Footer"/>
@@ -9968,7 +9917,7 @@
 </file>
 
 <file path=word/footer2.xml><?xml version="1.0" encoding="utf-8"?>
-<w:ftr xmlns:wpc="http://schemas.microsoft.com/office/word/2010/wordprocessingCanvas" xmlns:cx="http://schemas.microsoft.com/office/drawing/2014/chartex" xmlns:cx1="http://schemas.microsoft.com/office/drawing/2015/9/8/chartex" xmlns:cx2="http://schemas.microsoft.com/office/drawing/2015/10/21/chartex" xmlns:cx3="http://schemas.microsoft.com/office/drawing/2016/5/9/chartex" xmlns:cx4="http://schemas.microsoft.com/office/drawing/2016/5/10/chartex" xmlns:cx5="http://schemas.microsoft.com/office/drawing/2016/5/11/chartex" xmlns:cx6="http://schemas.microsoft.com/office/drawing/2016/5/12/chartex" xmlns:cx7="http://schemas.microsoft.com/office/drawing/2016/5/13/chartex" xmlns:cx8="http://schemas.microsoft.com/office/drawing/2016/5/14/chartex" xmlns:mc="http://schemas.openxmlformats.org/markup-compatibility/2006" xmlns:aink="http://schemas.microsoft.com/office/drawing/2016/ink" xmlns:am3d="http://schemas.microsoft.com/office/drawing/2017/model3d" xmlns:o="urn:schemas-microsoft-com:office:office" xmlns:oel="http://schemas.microsoft.com/office/2019/extlst" xmlns:r="http://schemas.openxmlformats.org/officeDocument/2006/relationships" xmlns:m="http://schemas.openxmlformats.org/officeDocument/2006/math" xmlns:v="urn:schemas-microsoft-com:vml" xmlns:wp14="http://schemas.microsoft.com/office/word/2010/wordprocessingDrawing" xmlns:wp="http://schemas.openxmlformats.org/drawingml/2006/wordprocessingDrawing" xmlns:w10="urn:schemas-microsoft-com:office:word" xmlns:w="http://schemas.openxmlformats.org/wordprocessingml/2006/main" xmlns:w14="http://schemas.microsoft.com/office/word/2010/wordml" xmlns:w15="http://schemas.microsoft.com/office/word/2012/wordml" xmlns:w16cex="http://schemas.microsoft.com/office/word/2018/wordml/cex" xmlns:w16cid="http://schemas.microsoft.com/office/word/2016/wordml/cid" xmlns:w16="http://schemas.microsoft.com/office/word/2018/wordml" xmlns:w16sdtdh="http://schemas.microsoft.com/office/word/2020/wordml/sdtdatahash" xmlns:w16se="http://schemas.microsoft.com/office/word/2015/wordml/symex" xmlns:wpg="http://schemas.microsoft.com/office/word/2010/wordprocessingGroup" xmlns:wpi="http://schemas.microsoft.com/office/word/2010/wordprocessingInk" xmlns:wne="http://schemas.microsoft.com/office/word/2006/wordml" xmlns:wps="http://schemas.microsoft.com/office/word/2010/wordprocessingShape" mc:Ignorable="w14 w15 w16se w16cid w16 w16cex w16sdtdh wp14">
+<w:ftr xmlns:wpc="http://schemas.microsoft.com/office/word/2010/wordprocessingCanvas" xmlns:cx="http://schemas.microsoft.com/office/drawing/2014/chartex" xmlns:cx1="http://schemas.microsoft.com/office/drawing/2015/9/8/chartex" xmlns:cx2="http://schemas.microsoft.com/office/drawing/2015/10/21/chartex" xmlns:cx3="http://schemas.microsoft.com/office/drawing/2016/5/9/chartex" xmlns:cx4="http://schemas.microsoft.com/office/drawing/2016/5/10/chartex" xmlns:cx5="http://schemas.microsoft.com/office/drawing/2016/5/11/chartex" xmlns:cx6="http://schemas.microsoft.com/office/drawing/2016/5/12/chartex" xmlns:cx7="http://schemas.microsoft.com/office/drawing/2016/5/13/chartex" xmlns:cx8="http://schemas.microsoft.com/office/drawing/2016/5/14/chartex" xmlns:mc="http://schemas.openxmlformats.org/markup-compatibility/2006" xmlns:aink="http://schemas.microsoft.com/office/drawing/2016/ink" xmlns:am3d="http://schemas.microsoft.com/office/drawing/2017/model3d" xmlns:o="urn:schemas-microsoft-com:office:office" xmlns:oel="http://schemas.microsoft.com/office/2019/extlst" xmlns:r="http://schemas.openxmlformats.org/officeDocument/2006/relationships" xmlns:m="http://schemas.openxmlformats.org/officeDocument/2006/math" xmlns:v="urn:schemas-microsoft-com:vml" xmlns:wp14="http://schemas.microsoft.com/office/word/2010/wordprocessingDrawing" xmlns:wp="http://schemas.openxmlformats.org/drawingml/2006/wordprocessingDrawing" xmlns:w10="urn:schemas-microsoft-com:office:word" xmlns:w="http://schemas.openxmlformats.org/wordprocessingml/2006/main" xmlns:w14="http://schemas.microsoft.com/office/word/2010/wordml" xmlns:w15="http://schemas.microsoft.com/office/word/2012/wordml" xmlns:w16cex="http://schemas.microsoft.com/office/word/2018/wordml/cex" xmlns:w16cid="http://schemas.microsoft.com/office/word/2016/wordml/cid" xmlns:w16="http://schemas.microsoft.com/office/word/2018/wordml" xmlns:w16du="http://schemas.microsoft.com/office/word/2023/wordml/word16du" xmlns:w16sdtdh="http://schemas.microsoft.com/office/word/2020/wordml/sdtdatahash" xmlns:w16sdtfl="http://schemas.microsoft.com/office/word/2024/wordml/sdtformatlock" xmlns:w16se="http://schemas.microsoft.com/office/word/2015/wordml/symex" xmlns:wpg="http://schemas.microsoft.com/office/word/2010/wordprocessingGroup" xmlns:wpi="http://schemas.microsoft.com/office/word/2010/wordprocessingInk" xmlns:wne="http://schemas.microsoft.com/office/word/2006/wordml" xmlns:wps="http://schemas.microsoft.com/office/word/2010/wordprocessingShape" mc:Ignorable="w14 w15 w16se w16cid w16 w16cex w16sdtdh w16sdtfl w16du wp14">
   <w:sdt>
     <w:sdtPr>
       <w:id w:val="1267111573"/>
@@ -10016,7 +9965,7 @@
 </file>
 
 <file path=word/footer3.xml><?xml version="1.0" encoding="utf-8"?>
-<w:ftr xmlns:wpc="http://schemas.microsoft.com/office/word/2010/wordprocessingCanvas" xmlns:cx="http://schemas.microsoft.com/office/drawing/2014/chartex" xmlns:cx1="http://schemas.microsoft.com/office/drawing/2015/9/8/chartex" xmlns:cx2="http://schemas.microsoft.com/office/drawing/2015/10/21/chartex" xmlns:cx3="http://schemas.microsoft.com/office/drawing/2016/5/9/chartex" xmlns:cx4="http://schemas.microsoft.com/office/drawing/2016/5/10/chartex" xmlns:cx5="http://schemas.microsoft.com/office/drawing/2016/5/11/chartex" xmlns:cx6="http://schemas.microsoft.com/office/drawing/2016/5/12/chartex" xmlns:cx7="http://schemas.microsoft.com/office/drawing/2016/5/13/chartex" xmlns:cx8="http://schemas.microsoft.com/office/drawing/2016/5/14/chartex" xmlns:mc="http://schemas.openxmlformats.org/markup-compatibility/2006" xmlns:aink="http://schemas.microsoft.com/office/drawing/2016/ink" xmlns:am3d="http://schemas.microsoft.com/office/drawing/2017/model3d" xmlns:o="urn:schemas-microsoft-com:office:office" xmlns:oel="http://schemas.microsoft.com/office/2019/extlst" xmlns:r="http://schemas.openxmlformats.org/officeDocument/2006/relationships" xmlns:m="http://schemas.openxmlformats.org/officeDocument/2006/math" xmlns:v="urn:schemas-microsoft-com:vml" xmlns:wp14="http://schemas.microsoft.com/office/word/2010/wordprocessingDrawing" xmlns:wp="http://schemas.openxmlformats.org/drawingml/2006/wordprocessingDrawing" xmlns:w10="urn:schemas-microsoft-com:office:word" xmlns:w="http://schemas.openxmlformats.org/wordprocessingml/2006/main" xmlns:w14="http://schemas.microsoft.com/office/word/2010/wordml" xmlns:w15="http://schemas.microsoft.com/office/word/2012/wordml" xmlns:w16cex="http://schemas.microsoft.com/office/word/2018/wordml/cex" xmlns:w16cid="http://schemas.microsoft.com/office/word/2016/wordml/cid" xmlns:w16="http://schemas.microsoft.com/office/word/2018/wordml" xmlns:w16sdtdh="http://schemas.microsoft.com/office/word/2020/wordml/sdtdatahash" xmlns:w16se="http://schemas.microsoft.com/office/word/2015/wordml/symex" xmlns:wpg="http://schemas.microsoft.com/office/word/2010/wordprocessingGroup" xmlns:wpi="http://schemas.microsoft.com/office/word/2010/wordprocessingInk" xmlns:wne="http://schemas.microsoft.com/office/word/2006/wordml" xmlns:wps="http://schemas.microsoft.com/office/word/2010/wordprocessingShape" mc:Ignorable="w14 w15 w16se w16cid w16 w16cex w16sdtdh wp14">
+<w:ftr xmlns:wpc="http://schemas.microsoft.com/office/word/2010/wordprocessingCanvas" xmlns:cx="http://schemas.microsoft.com/office/drawing/2014/chartex" xmlns:cx1="http://schemas.microsoft.com/office/drawing/2015/9/8/chartex" xmlns:cx2="http://schemas.microsoft.com/office/drawing/2015/10/21/chartex" xmlns:cx3="http://schemas.microsoft.com/office/drawing/2016/5/9/chartex" xmlns:cx4="http://schemas.microsoft.com/office/drawing/2016/5/10/chartex" xmlns:cx5="http://schemas.microsoft.com/office/drawing/2016/5/11/chartex" xmlns:cx6="http://schemas.microsoft.com/office/drawing/2016/5/12/chartex" xmlns:cx7="http://schemas.microsoft.com/office/drawing/2016/5/13/chartex" xmlns:cx8="http://schemas.microsoft.com/office/drawing/2016/5/14/chartex" xmlns:mc="http://schemas.openxmlformats.org/markup-compatibility/2006" xmlns:aink="http://schemas.microsoft.com/office/drawing/2016/ink" xmlns:am3d="http://schemas.microsoft.com/office/drawing/2017/model3d" xmlns:o="urn:schemas-microsoft-com:office:office" xmlns:oel="http://schemas.microsoft.com/office/2019/extlst" xmlns:r="http://schemas.openxmlformats.org/officeDocument/2006/relationships" xmlns:m="http://schemas.openxmlformats.org/officeDocument/2006/math" xmlns:v="urn:schemas-microsoft-com:vml" xmlns:wp14="http://schemas.microsoft.com/office/word/2010/wordprocessingDrawing" xmlns:wp="http://schemas.openxmlformats.org/drawingml/2006/wordprocessingDrawing" xmlns:w10="urn:schemas-microsoft-com:office:word" xmlns:w="http://schemas.openxmlformats.org/wordprocessingml/2006/main" xmlns:w14="http://schemas.microsoft.com/office/word/2010/wordml" xmlns:w15="http://schemas.microsoft.com/office/word/2012/wordml" xmlns:w16cex="http://schemas.microsoft.com/office/word/2018/wordml/cex" xmlns:w16cid="http://schemas.microsoft.com/office/word/2016/wordml/cid" xmlns:w16="http://schemas.microsoft.com/office/word/2018/wordml" xmlns:w16du="http://schemas.microsoft.com/office/word/2023/wordml/word16du" xmlns:w16sdtdh="http://schemas.microsoft.com/office/word/2020/wordml/sdtdatahash" xmlns:w16sdtfl="http://schemas.microsoft.com/office/word/2024/wordml/sdtformatlock" xmlns:w16se="http://schemas.microsoft.com/office/word/2015/wordml/symex" xmlns:wpg="http://schemas.microsoft.com/office/word/2010/wordprocessingGroup" xmlns:wpi="http://schemas.microsoft.com/office/word/2010/wordprocessingInk" xmlns:wne="http://schemas.microsoft.com/office/word/2006/wordml" xmlns:wps="http://schemas.microsoft.com/office/word/2010/wordprocessingShape" mc:Ignorable="w14 w15 w16se w16cid w16 w16cex w16sdtdh w16sdtfl w16du wp14">
   <w:p>
     <w:pPr>
       <w:jc w:val="center"/>
@@ -10053,7 +10002,7 @@
 </file>
 
 <file path=word/footnotes.xml><?xml version="1.0" encoding="utf-8"?>
-<w:footnotes xmlns:wpc="http://schemas.microsoft.com/office/word/2010/wordprocessingCanvas" xmlns:cx="http://schemas.microsoft.com/office/drawing/2014/chartex" xmlns:cx1="http://schemas.microsoft.com/office/drawing/2015/9/8/chartex" xmlns:cx2="http://schemas.microsoft.com/office/drawing/2015/10/21/chartex" xmlns:cx3="http://schemas.microsoft.com/office/drawing/2016/5/9/chartex" xmlns:cx4="http://schemas.microsoft.com/office/drawing/2016/5/10/chartex" xmlns:cx5="http://schemas.microsoft.com/office/drawing/2016/5/11/chartex" xmlns:cx6="http://schemas.microsoft.com/office/drawing/2016/5/12/chartex" xmlns:cx7="http://schemas.microsoft.com/office/drawing/2016/5/13/chartex" xmlns:cx8="http://schemas.microsoft.com/office/drawing/2016/5/14/chartex" xmlns:mc="http://schemas.openxmlformats.org/markup-compatibility/2006" xmlns:aink="http://schemas.microsoft.com/office/drawing/2016/ink" xmlns:am3d="http://schemas.microsoft.com/office/drawing/2017/model3d" xmlns:o="urn:schemas-microsoft-com:office:office" xmlns:oel="http://schemas.microsoft.com/office/2019/extlst" xmlns:r="http://schemas.openxmlformats.org/officeDocument/2006/relationships" xmlns:m="http://schemas.openxmlformats.org/officeDocument/2006/math" xmlns:v="urn:schemas-microsoft-com:vml" xmlns:wp14="http://schemas.microsoft.com/office/word/2010/wordprocessingDrawing" xmlns:wp="http://schemas.openxmlformats.org/drawingml/2006/wordprocessingDrawing" xmlns:w10="urn:schemas-microsoft-com:office:word" xmlns:w="http://schemas.openxmlformats.org/wordprocessingml/2006/main" xmlns:w14="http://schemas.microsoft.com/office/word/2010/wordml" xmlns:w15="http://schemas.microsoft.com/office/word/2012/wordml" xmlns:w16cex="http://schemas.microsoft.com/office/word/2018/wordml/cex" xmlns:w16cid="http://schemas.microsoft.com/office/word/2016/wordml/cid" xmlns:w16="http://schemas.microsoft.com/office/word/2018/wordml" xmlns:w16sdtdh="http://schemas.microsoft.com/office/word/2020/wordml/sdtdatahash" xmlns:w16se="http://schemas.microsoft.com/office/word/2015/wordml/symex" xmlns:wpg="http://schemas.microsoft.com/office/word/2010/wordprocessingGroup" xmlns:wpi="http://schemas.microsoft.com/office/word/2010/wordprocessingInk" xmlns:wne="http://schemas.microsoft.com/office/word/2006/wordml" xmlns:wps="http://schemas.microsoft.com/office/word/2010/wordprocessingShape" mc:Ignorable="w14 w15 w16se w16cid w16 w16cex w16sdtdh wp14">
+<w:footnotes xmlns:wpc="http://schemas.microsoft.com/office/word/2010/wordprocessingCanvas" xmlns:cx="http://schemas.microsoft.com/office/drawing/2014/chartex" xmlns:cx1="http://schemas.microsoft.com/office/drawing/2015/9/8/chartex" xmlns:cx2="http://schemas.microsoft.com/office/drawing/2015/10/21/chartex" xmlns:cx3="http://schemas.microsoft.com/office/drawing/2016/5/9/chartex" xmlns:cx4="http://schemas.microsoft.com/office/drawing/2016/5/10/chartex" xmlns:cx5="http://schemas.microsoft.com/office/drawing/2016/5/11/chartex" xmlns:cx6="http://schemas.microsoft.com/office/drawing/2016/5/12/chartex" xmlns:cx7="http://schemas.microsoft.com/office/drawing/2016/5/13/chartex" xmlns:cx8="http://schemas.microsoft.com/office/drawing/2016/5/14/chartex" xmlns:mc="http://schemas.openxmlformats.org/markup-compatibility/2006" xmlns:aink="http://schemas.microsoft.com/office/drawing/2016/ink" xmlns:am3d="http://schemas.microsoft.com/office/drawing/2017/model3d" xmlns:o="urn:schemas-microsoft-com:office:office" xmlns:oel="http://schemas.microsoft.com/office/2019/extlst" xmlns:r="http://schemas.openxmlformats.org/officeDocument/2006/relationships" xmlns:m="http://schemas.openxmlformats.org/officeDocument/2006/math" xmlns:v="urn:schemas-microsoft-com:vml" xmlns:wp14="http://schemas.microsoft.com/office/word/2010/wordprocessingDrawing" xmlns:wp="http://schemas.openxmlformats.org/drawingml/2006/wordprocessingDrawing" xmlns:w10="urn:schemas-microsoft-com:office:word" xmlns:w="http://schemas.openxmlformats.org/wordprocessingml/2006/main" xmlns:w14="http://schemas.microsoft.com/office/word/2010/wordml" xmlns:w15="http://schemas.microsoft.com/office/word/2012/wordml" xmlns:w16cex="http://schemas.microsoft.com/office/word/2018/wordml/cex" xmlns:w16cid="http://schemas.microsoft.com/office/word/2016/wordml/cid" xmlns:w16="http://schemas.microsoft.com/office/word/2018/wordml" xmlns:w16du="http://schemas.microsoft.com/office/word/2023/wordml/word16du" xmlns:w16sdtdh="http://schemas.microsoft.com/office/word/2020/wordml/sdtdatahash" xmlns:w16sdtfl="http://schemas.microsoft.com/office/word/2024/wordml/sdtformatlock" xmlns:w16se="http://schemas.microsoft.com/office/word/2015/wordml/symex" xmlns:wpg="http://schemas.microsoft.com/office/word/2010/wordprocessingGroup" xmlns:wpi="http://schemas.microsoft.com/office/word/2010/wordprocessingInk" xmlns:wne="http://schemas.microsoft.com/office/word/2006/wordml" xmlns:wps="http://schemas.microsoft.com/office/word/2010/wordprocessingShape" mc:Ignorable="w14 w15 w16se w16cid w16 w16cex w16sdtdh w16sdtfl w16du wp14">
   <w:footnote w:type="separator" w:id="-1">
     <w:p>
       <w:r>
@@ -10072,7 +10021,7 @@
 </file>
 
 <file path=word/header1.xml><?xml version="1.0" encoding="utf-8"?>
-<w:hdr xmlns:wpc="http://schemas.microsoft.com/office/word/2010/wordprocessingCanvas" xmlns:cx="http://schemas.microsoft.com/office/drawing/2014/chartex" xmlns:cx1="http://schemas.microsoft.com/office/drawing/2015/9/8/chartex" xmlns:cx2="http://schemas.microsoft.com/office/drawing/2015/10/21/chartex" xmlns:cx3="http://schemas.microsoft.com/office/drawing/2016/5/9/chartex" xmlns:cx4="http://schemas.microsoft.com/office/drawing/2016/5/10/chartex" xmlns:cx5="http://schemas.microsoft.com/office/drawing/2016/5/11/chartex" xmlns:cx6="http://schemas.microsoft.com/office/drawing/2016/5/12/chartex" xmlns:cx7="http://schemas.microsoft.com/office/drawing/2016/5/13/chartex" xmlns:cx8="http://schemas.microsoft.com/office/drawing/2016/5/14/chartex" xmlns:mc="http://schemas.openxmlformats.org/markup-compatibility/2006" xmlns:aink="http://schemas.microsoft.com/office/drawing/2016/ink" xmlns:am3d="http://schemas.microsoft.com/office/drawing/2017/model3d" xmlns:o="urn:schemas-microsoft-com:office:office" xmlns:oel="http://schemas.microsoft.com/office/2019/extlst" xmlns:r="http://schemas.openxmlformats.org/officeDocument/2006/relationships" xmlns:m="http://schemas.openxmlformats.org/officeDocument/2006/math" xmlns:v="urn:schemas-microsoft-com:vml" xmlns:wp14="http://schemas.microsoft.com/office/word/2010/wordprocessingDrawing" xmlns:wp="http://schemas.openxmlformats.org/drawingml/2006/wordprocessingDrawing" xmlns:w10="urn:schemas-microsoft-com:office:word" xmlns:w="http://schemas.openxmlformats.org/wordprocessingml/2006/main" xmlns:w14="http://schemas.microsoft.com/office/word/2010/wordml" xmlns:w15="http://schemas.microsoft.com/office/word/2012/wordml" xmlns:w16cex="http://schemas.microsoft.com/office/word/2018/wordml/cex" xmlns:w16cid="http://schemas.microsoft.com/office/word/2016/wordml/cid" xmlns:w16="http://schemas.microsoft.com/office/word/2018/wordml" xmlns:w16sdtdh="http://schemas.microsoft.com/office/word/2020/wordml/sdtdatahash" xmlns:w16se="http://schemas.microsoft.com/office/word/2015/wordml/symex" xmlns:wpg="http://schemas.microsoft.com/office/word/2010/wordprocessingGroup" xmlns:wpi="http://schemas.microsoft.com/office/word/2010/wordprocessingInk" xmlns:wne="http://schemas.microsoft.com/office/word/2006/wordml" xmlns:wps="http://schemas.microsoft.com/office/word/2010/wordprocessingShape" mc:Ignorable="w14 w15 w16se w16cid w16 w16cex w16sdtdh wp14">
+<w:hdr xmlns:wpc="http://schemas.microsoft.com/office/word/2010/wordprocessingCanvas" xmlns:cx="http://schemas.microsoft.com/office/drawing/2014/chartex" xmlns:cx1="http://schemas.microsoft.com/office/drawing/2015/9/8/chartex" xmlns:cx2="http://schemas.microsoft.com/office/drawing/2015/10/21/chartex" xmlns:cx3="http://schemas.microsoft.com/office/drawing/2016/5/9/chartex" xmlns:cx4="http://schemas.microsoft.com/office/drawing/2016/5/10/chartex" xmlns:cx5="http://schemas.microsoft.com/office/drawing/2016/5/11/chartex" xmlns:cx6="http://schemas.microsoft.com/office/drawing/2016/5/12/chartex" xmlns:cx7="http://schemas.microsoft.com/office/drawing/2016/5/13/chartex" xmlns:cx8="http://schemas.microsoft.com/office/drawing/2016/5/14/chartex" xmlns:mc="http://schemas.openxmlformats.org/markup-compatibility/2006" xmlns:aink="http://schemas.microsoft.com/office/drawing/2016/ink" xmlns:am3d="http://schemas.microsoft.com/office/drawing/2017/model3d" xmlns:o="urn:schemas-microsoft-com:office:office" xmlns:oel="http://schemas.microsoft.com/office/2019/extlst" xmlns:r="http://schemas.openxmlformats.org/officeDocument/2006/relationships" xmlns:m="http://schemas.openxmlformats.org/officeDocument/2006/math" xmlns:v="urn:schemas-microsoft-com:vml" xmlns:wp14="http://schemas.microsoft.com/office/word/2010/wordprocessingDrawing" xmlns:wp="http://schemas.openxmlformats.org/drawingml/2006/wordprocessingDrawing" xmlns:w10="urn:schemas-microsoft-com:office:word" xmlns:w="http://schemas.openxmlformats.org/wordprocessingml/2006/main" xmlns:w14="http://schemas.microsoft.com/office/word/2010/wordml" xmlns:w15="http://schemas.microsoft.com/office/word/2012/wordml" xmlns:w16cex="http://schemas.microsoft.com/office/word/2018/wordml/cex" xmlns:w16cid="http://schemas.microsoft.com/office/word/2016/wordml/cid" xmlns:w16="http://schemas.microsoft.com/office/word/2018/wordml" xmlns:w16du="http://schemas.microsoft.com/office/word/2023/wordml/word16du" xmlns:w16sdtdh="http://schemas.microsoft.com/office/word/2020/wordml/sdtdatahash" xmlns:w16sdtfl="http://schemas.microsoft.com/office/word/2024/wordml/sdtformatlock" xmlns:w16se="http://schemas.microsoft.com/office/word/2015/wordml/symex" xmlns:wpg="http://schemas.microsoft.com/office/word/2010/wordprocessingGroup" xmlns:wpi="http://schemas.microsoft.com/office/word/2010/wordprocessingInk" xmlns:wne="http://schemas.microsoft.com/office/word/2006/wordml" xmlns:wps="http://schemas.microsoft.com/office/word/2010/wordprocessingShape" mc:Ignorable="w14 w15 w16se w16cid w16 w16cex w16sdtdh w16sdtfl w16du wp14">
   <w:p>
     <w:pPr>
       <w:pStyle w:val="Header"/>
@@ -10124,7 +10073,7 @@
 </file>
 
 <file path=word/numbering.xml><?xml version="1.0" encoding="utf-8"?>
-<w:numbering xmlns:wpc="http://schemas.microsoft.com/office/word/2010/wordprocessingCanvas" xmlns:cx="http://schemas.microsoft.com/office/drawing/2014/chartex" xmlns:cx1="http://schemas.microsoft.com/office/drawing/2015/9/8/chartex" xmlns:cx2="http://schemas.microsoft.com/office/drawing/2015/10/21/chartex" xmlns:cx3="http://schemas.microsoft.com/office/drawing/2016/5/9/chartex" xmlns:cx4="http://schemas.microsoft.com/office/drawing/2016/5/10/chartex" xmlns:cx5="http://schemas.microsoft.com/office/drawing/2016/5/11/chartex" xmlns:cx6="http://schemas.microsoft.com/office/drawing/2016/5/12/chartex" xmlns:cx7="http://schemas.microsoft.com/office/drawing/2016/5/13/chartex" xmlns:cx8="http://schemas.microsoft.com/office/drawing/2016/5/14/chartex" xmlns:mc="http://schemas.openxmlformats.org/markup-compatibility/2006" xmlns:aink="http://schemas.microsoft.com/office/drawing/2016/ink" xmlns:am3d="http://schemas.microsoft.com/office/drawing/2017/model3d" xmlns:o="urn:schemas-microsoft-com:office:office" xmlns:oel="http://schemas.microsoft.com/office/2019/extlst" xmlns:r="http://schemas.openxmlformats.org/officeDocument/2006/relationships" xmlns:m="http://schemas.openxmlformats.org/officeDocument/2006/math" xmlns:v="urn:schemas-microsoft-com:vml" xmlns:wp14="http://schemas.microsoft.com/office/word/2010/wordprocessingDrawing" xmlns:wp="http://schemas.openxmlformats.org/drawingml/2006/wordprocessingDrawing" xmlns:w10="urn:schemas-microsoft-com:office:word" xmlns:w="http://schemas.openxmlformats.org/wordprocessingml/2006/main" xmlns:w14="http://schemas.microsoft.com/office/word/2010/wordml" xmlns:w15="http://schemas.microsoft.com/office/word/2012/wordml" xmlns:w16cex="http://schemas.microsoft.com/office/word/2018/wordml/cex" xmlns:w16cid="http://schemas.microsoft.com/office/word/2016/wordml/cid" xmlns:w16="http://schemas.microsoft.com/office/word/2018/wordml" xmlns:w16sdtdh="http://schemas.microsoft.com/office/word/2020/wordml/sdtdatahash" xmlns:w16se="http://schemas.microsoft.com/office/word/2015/wordml/symex" xmlns:wpg="http://schemas.microsoft.com/office/word/2010/wordprocessingGroup" xmlns:wpi="http://schemas.microsoft.com/office/word/2010/wordprocessingInk" xmlns:wne="http://schemas.microsoft.com/office/word/2006/wordml" xmlns:wps="http://schemas.microsoft.com/office/word/2010/wordprocessingShape" mc:Ignorable="w14 w15 w16se w16cid w16 w16cex w16sdtdh wp14">
+<w:numbering xmlns:wpc="http://schemas.microsoft.com/office/word/2010/wordprocessingCanvas" xmlns:cx="http://schemas.microsoft.com/office/drawing/2014/chartex" xmlns:cx1="http://schemas.microsoft.com/office/drawing/2015/9/8/chartex" xmlns:cx2="http://schemas.microsoft.com/office/drawing/2015/10/21/chartex" xmlns:cx3="http://schemas.microsoft.com/office/drawing/2016/5/9/chartex" xmlns:cx4="http://schemas.microsoft.com/office/drawing/2016/5/10/chartex" xmlns:cx5="http://schemas.microsoft.com/office/drawing/2016/5/11/chartex" xmlns:cx6="http://schemas.microsoft.com/office/drawing/2016/5/12/chartex" xmlns:cx7="http://schemas.microsoft.com/office/drawing/2016/5/13/chartex" xmlns:cx8="http://schemas.microsoft.com/office/drawing/2016/5/14/chartex" xmlns:mc="http://schemas.openxmlformats.org/markup-compatibility/2006" xmlns:aink="http://schemas.microsoft.com/office/drawing/2016/ink" xmlns:am3d="http://schemas.microsoft.com/office/drawing/2017/model3d" xmlns:o="urn:schemas-microsoft-com:office:office" xmlns:oel="http://schemas.microsoft.com/office/2019/extlst" xmlns:r="http://schemas.openxmlformats.org/officeDocument/2006/relationships" xmlns:m="http://schemas.openxmlformats.org/officeDocument/2006/math" xmlns:v="urn:schemas-microsoft-com:vml" xmlns:wp14="http://schemas.microsoft.com/office/word/2010/wordprocessingDrawing" xmlns:wp="http://schemas.openxmlformats.org/drawingml/2006/wordprocessingDrawing" xmlns:w10="urn:schemas-microsoft-com:office:word" xmlns:w="http://schemas.openxmlformats.org/wordprocessingml/2006/main" xmlns:w14="http://schemas.microsoft.com/office/word/2010/wordml" xmlns:w15="http://schemas.microsoft.com/office/word/2012/wordml" xmlns:w16cex="http://schemas.microsoft.com/office/word/2018/wordml/cex" xmlns:w16cid="http://schemas.microsoft.com/office/word/2016/wordml/cid" xmlns:w16="http://schemas.microsoft.com/office/word/2018/wordml" xmlns:w16du="http://schemas.microsoft.com/office/word/2023/wordml/word16du" xmlns:w16sdtdh="http://schemas.microsoft.com/office/word/2020/wordml/sdtdatahash" xmlns:w16sdtfl="http://schemas.microsoft.com/office/word/2024/wordml/sdtformatlock" xmlns:w16se="http://schemas.microsoft.com/office/word/2015/wordml/symex" xmlns:wpg="http://schemas.microsoft.com/office/word/2010/wordprocessingGroup" xmlns:wpi="http://schemas.microsoft.com/office/word/2010/wordprocessingInk" xmlns:wne="http://schemas.microsoft.com/office/word/2006/wordml" xmlns:wps="http://schemas.microsoft.com/office/word/2010/wordprocessingShape" mc:Ignorable="w14 w15 w16se w16cid w16 w16cex w16sdtdh w16sdtfl w16du wp14">
   <w:abstractNum w:abstractNumId="0" w15:restartNumberingAfterBreak="0">
     <w:nsid w:val="043F1D54"/>
     <w:multiLevelType w:val="hybridMultilevel"/>
@@ -14867,7 +14816,7 @@
 </file>
 
 <file path=word/styles.xml><?xml version="1.0" encoding="utf-8"?>
-<w:styles xmlns:mc="http://schemas.openxmlformats.org/markup-compatibility/2006" xmlns:r="http://schemas.openxmlformats.org/officeDocument/2006/relationships" xmlns:w="http://schemas.openxmlformats.org/wordprocessingml/2006/main" xmlns:w14="http://schemas.microsoft.com/office/word/2010/wordml" xmlns:w15="http://schemas.microsoft.com/office/word/2012/wordml" xmlns:w16cex="http://schemas.microsoft.com/office/word/2018/wordml/cex" xmlns:w16cid="http://schemas.microsoft.com/office/word/2016/wordml/cid" xmlns:w16="http://schemas.microsoft.com/office/word/2018/wordml" xmlns:w16sdtdh="http://schemas.microsoft.com/office/word/2020/wordml/sdtdatahash" xmlns:w16se="http://schemas.microsoft.com/office/word/2015/wordml/symex" mc:Ignorable="w14 w15 w16se w16cid w16 w16cex w16sdtdh">
+<w:styles xmlns:mc="http://schemas.openxmlformats.org/markup-compatibility/2006" xmlns:r="http://schemas.openxmlformats.org/officeDocument/2006/relationships" xmlns:w="http://schemas.openxmlformats.org/wordprocessingml/2006/main" xmlns:w14="http://schemas.microsoft.com/office/word/2010/wordml" xmlns:w15="http://schemas.microsoft.com/office/word/2012/wordml" xmlns:w16cex="http://schemas.microsoft.com/office/word/2018/wordml/cex" xmlns:w16cid="http://schemas.microsoft.com/office/word/2016/wordml/cid" xmlns:w16="http://schemas.microsoft.com/office/word/2018/wordml" xmlns:w16du="http://schemas.microsoft.com/office/word/2023/wordml/word16du" xmlns:w16sdtdh="http://schemas.microsoft.com/office/word/2020/wordml/sdtdatahash" xmlns:w16sdtfl="http://schemas.microsoft.com/office/word/2024/wordml/sdtformatlock" xmlns:w16se="http://schemas.microsoft.com/office/word/2015/wordml/symex" mc:Ignorable="w14 w15 w16se w16cid w16 w16cex w16sdtdh w16sdtfl w16du">
   <w:docDefaults>
     <w:rPrDefault>
       <w:rPr>
@@ -16142,25 +16091,16 @@
 </file>
 
 <file path=customXml/item1.xml><?xml version="1.0" encoding="utf-8"?>
-<b:Sources xmlns:b="http://schemas.openxmlformats.org/officeDocument/2006/bibliography" xmlns="http://schemas.openxmlformats.org/officeDocument/2006/bibliography" SelectedStyle="/APA.XSL" StyleName="APA"/>
-</file>
-
-<file path=customXml/item2.xml><?xml version="1.0" encoding="utf-8"?>
 <p:properties xmlns:p="http://schemas.microsoft.com/office/2006/metadata/properties" xmlns:xsi="http://www.w3.org/2001/XMLSchema-instance" xmlns:pc="http://schemas.microsoft.com/office/infopath/2007/PartnerControls">
   <documentManagement/>
 </p:properties>
 </file>
 
-<file path=customXml/item3.xml><?xml version="1.0" encoding="utf-8"?>
-<?mso-contentType ?>
-<FormTemplates xmlns="http://schemas.microsoft.com/sharepoint/v3/contenttype/forms">
-  <Display>DocumentLibraryForm</Display>
-  <Edit>DocumentLibraryForm</Edit>
-  <New>DocumentLibraryForm</New>
-</FormTemplates>
+<file path=customXml/item2.xml><?xml version="1.0" encoding="utf-8"?>
+<b:Sources xmlns:b="http://schemas.openxmlformats.org/officeDocument/2006/bibliography" xmlns="http://schemas.openxmlformats.org/officeDocument/2006/bibliography" SelectedStyle="/APA.XSL" StyleName="APA"/>
 </file>
 
-<file path=customXml/item4.xml><?xml version="1.0" encoding="utf-8"?>
+<file path=customXml/item3.xml><?xml version="1.0" encoding="utf-8"?>
 <ct:contentTypeSchema xmlns:ct="http://schemas.microsoft.com/office/2006/metadata/contentType" xmlns:ma="http://schemas.microsoft.com/office/2006/metadata/properties/metaAttributes" ct:_="" ma:_="" ma:contentTypeName="Document" ma:contentTypeID="0x01010007D12AF12D95694AA6344C672C327518" ma:contentTypeVersion="8" ma:contentTypeDescription="Create a new document." ma:contentTypeScope="" ma:versionID="8f7a0aec25e10ce396a14d38e2abe4d4">
   <xsd:schema xmlns:xsd="http://www.w3.org/2001/XMLSchema" xmlns:xs="http://www.w3.org/2001/XMLSchema" xmlns:p="http://schemas.microsoft.com/office/2006/metadata/properties" xmlns:ns2="d6cac377-2cf8-44f0-abe6-651387810930" xmlns:ns3="9452cacb-2e03-45ce-9ef6-fd1a0457f341" targetNamespace="http://schemas.microsoft.com/office/2006/metadata/properties" ma:root="true" ma:fieldsID="560c6bcc4542c9bdc732ad77cc5db800" ns2:_="" ns3:_="">
     <xsd:import namespace="d6cac377-2cf8-44f0-abe6-651387810930"/>
@@ -16351,7 +16291,25 @@
 </ct:contentTypeSchema>
 </file>
 
+<file path=customXml/item4.xml><?xml version="1.0" encoding="utf-8"?>
+<?mso-contentType ?>
+<FormTemplates xmlns="http://schemas.microsoft.com/sharepoint/v3/contenttype/forms">
+  <Display>DocumentLibraryForm</Display>
+  <Edit>DocumentLibraryForm</Edit>
+  <New>DocumentLibraryForm</New>
+</FormTemplates>
+</file>
+
 <file path=customXml/itemProps1.xml><?xml version="1.0" encoding="utf-8"?>
+<ds:datastoreItem xmlns:ds="http://schemas.openxmlformats.org/officeDocument/2006/customXml" ds:itemID="{209FEB97-EE36-4B37-842C-E21EFD8FE65E}">
+  <ds:schemaRefs>
+    <ds:schemaRef ds:uri="http://schemas.microsoft.com/office/2006/metadata/properties"/>
+    <ds:schemaRef ds:uri="http://schemas.microsoft.com/office/infopath/2007/PartnerControls"/>
+  </ds:schemaRefs>
+</ds:datastoreItem>
+</file>
+
+<file path=customXml/itemProps2.xml><?xml version="1.0" encoding="utf-8"?>
 <ds:datastoreItem xmlns:ds="http://schemas.openxmlformats.org/officeDocument/2006/customXml" ds:itemID="{3C98F4BA-7E6B-48F8-9255-5526812861DF}">
   <ds:schemaRefs>
     <ds:schemaRef ds:uri="http://schemas.openxmlformats.org/officeDocument/2006/bibliography"/>
@@ -16359,32 +16317,29 @@
 </ds:datastoreItem>
 </file>
 
-<file path=customXml/itemProps2.xml><?xml version="1.0" encoding="utf-8"?>
-<ds:datastoreItem xmlns:ds="http://schemas.openxmlformats.org/officeDocument/2006/customXml" ds:itemID="{209FEB97-EE36-4B37-842C-E21EFD8FE65E}">
+<file path=customXml/itemProps3.xml><?xml version="1.0" encoding="utf-8"?>
+<ds:datastoreItem xmlns:ds="http://schemas.openxmlformats.org/officeDocument/2006/customXml" ds:itemID="{90FEC3CC-B124-4D30-B520-509CE07D006E}">
   <ds:schemaRefs>
+    <ds:schemaRef ds:uri="http://schemas.microsoft.com/office/2006/metadata/contentType"/>
+    <ds:schemaRef ds:uri="http://schemas.microsoft.com/office/2006/metadata/properties/metaAttributes"/>
+    <ds:schemaRef ds:uri="http://www.w3.org/2001/XMLSchema"/>
+    <ds:schemaRef ds:uri="http://schemas.microsoft.com/office/2006/metadata/properties"/>
+    <ds:schemaRef ds:uri="d6cac377-2cf8-44f0-abe6-651387810930"/>
+    <ds:schemaRef ds:uri="9452cacb-2e03-45ce-9ef6-fd1a0457f341"/>
+    <ds:schemaRef ds:uri="http://schemas.microsoft.com/office/2006/documentManagement/types"/>
+    <ds:schemaRef ds:uri="http://schemas.microsoft.com/office/infopath/2007/PartnerControls"/>
+    <ds:schemaRef ds:uri="http://schemas.openxmlformats.org/package/2006/metadata/core-properties"/>
     <ds:schemaRef ds:uri="http://purl.org/dc/elements/1.1/"/>
-    <ds:schemaRef ds:uri="http://purl.org/dc/dcmitype/"/>
-    <ds:schemaRef ds:uri="http://schemas.microsoft.com/sharepoint/v3"/>
-    <ds:schemaRef ds:uri="http://schemas.microsoft.com/office/2006/metadata/properties"/>
     <ds:schemaRef ds:uri="http://purl.org/dc/terms/"/>
-    <ds:schemaRef ds:uri="http://schemas.microsoft.com/office/infopath/2007/PartnerControls"/>
-    <ds:schemaRef ds:uri="http://schemas.microsoft.com/office/2006/documentManagement/types"/>
-    <ds:schemaRef ds:uri="http://www.w3.org/XML/1998/namespace"/>
-    <ds:schemaRef ds:uri="http://schemas.openxmlformats.org/package/2006/metadata/core-properties"/>
-    <ds:schemaRef ds:uri="37d47695-dda2-48a2-87bc-2a1f7ac7fedc"/>
-    <ds:schemaRef ds:uri="b3b59848-949a-4ed4-8036-feb011ce2b52"/>
+    <ds:schemaRef ds:uri="http://schemas.microsoft.com/internal/obd"/>
   </ds:schemaRefs>
 </ds:datastoreItem>
 </file>
 
-<file path=customXml/itemProps3.xml><?xml version="1.0" encoding="utf-8"?>
+<file path=customXml/itemProps4.xml><?xml version="1.0" encoding="utf-8"?>
 <ds:datastoreItem xmlns:ds="http://schemas.openxmlformats.org/officeDocument/2006/customXml" ds:itemID="{C6D8047C-D8CD-42A4-8A57-EA6F4E1056B6}">
   <ds:schemaRefs>
     <ds:schemaRef ds:uri="http://schemas.microsoft.com/sharepoint/v3/contenttype/forms"/>
   </ds:schemaRefs>
 </ds:datastoreItem>
-</file>
-
-<file path=customXml/itemProps4.xml><?xml version="1.0" encoding="utf-8"?>
-<ds:datastoreItem xmlns:ds="http://schemas.openxmlformats.org/officeDocument/2006/customXml" ds:itemID="{90FEC3CC-B124-4D30-B520-509CE07D006E}"/>
 </file>
</xml_diff>

<commit_message>
: Finish functionality to reset the timer and display the current time elapsed.
</commit_message>
<xml_diff>
--- a/Activity5/CST-250-RS-T5-Activity5Guide.docx
+++ b/Activity5/CST-250-RS-T5-Activity5Guide.docx
@@ -1757,10 +1757,14 @@
     <w:p>
       <w:pPr>
         <w:spacing w:before="120" w:after="480"/>
+        <w:rPr>
+          <w:highlight w:val="yellow"/>
+        </w:rPr>
       </w:pPr>
       <w:r>
         <w:rPr>
           <w:noProof/>
+          <w:highlight w:val="yellow"/>
         </w:rPr>
         <mc:AlternateContent>
           <mc:Choice Requires="wpg">
@@ -1873,12 +1877,14 @@
                                 <w:rPr>
                                   <w:sz w:val="20"/>
                                   <w:szCs w:val="20"/>
+                                  <w:highlight w:val="yellow"/>
                                 </w:rPr>
                               </w:pPr>
                               <w:r>
                                 <w:rPr>
                                   <w:sz w:val="22"/>
                                   <w:szCs w:val="22"/>
+                                  <w:highlight w:val="yellow"/>
                                 </w:rPr>
                                 <w:t>Add the project to source control</w:t>
                               </w:r>
@@ -1886,6 +1892,7 @@
                                 <w:rPr>
                                   <w:sz w:val="22"/>
                                   <w:szCs w:val="22"/>
+                                  <w:highlight w:val="yellow"/>
                                 </w:rPr>
                                 <w:t>.</w:t>
                               </w:r>
@@ -1902,12 +1909,14 @@
                                 <w:rPr>
                                   <w:sz w:val="20"/>
                                   <w:szCs w:val="20"/>
+                                  <w:highlight w:val="yellow"/>
                                 </w:rPr>
                               </w:pPr>
                               <w:r>
                                 <w:rPr>
                                   <w:sz w:val="22"/>
                                   <w:szCs w:val="22"/>
+                                  <w:highlight w:val="yellow"/>
                                 </w:rPr>
                                 <w:t xml:space="preserve">See the </w:t>
                               </w:r>
@@ -1915,6 +1924,7 @@
                                 <w:rPr>
                                   <w:sz w:val="22"/>
                                   <w:szCs w:val="22"/>
+                                  <w:highlight w:val="yellow"/>
                                 </w:rPr>
                                 <w:t>C</w:t>
                               </w:r>
@@ -1922,6 +1932,7 @@
                                 <w:rPr>
                                   <w:sz w:val="22"/>
                                   <w:szCs w:val="22"/>
+                                  <w:highlight w:val="yellow"/>
                                 </w:rPr>
                                 <w:t xml:space="preserve">lass </w:t>
                               </w:r>
@@ -1929,6 +1940,7 @@
                                 <w:rPr>
                                   <w:sz w:val="22"/>
                                   <w:szCs w:val="22"/>
+                                  <w:highlight w:val="yellow"/>
                                 </w:rPr>
                                 <w:t>R</w:t>
                               </w:r>
@@ -1936,6 +1948,7 @@
                                 <w:rPr>
                                   <w:sz w:val="22"/>
                                   <w:szCs w:val="22"/>
+                                  <w:highlight w:val="yellow"/>
                                 </w:rPr>
                                 <w:t>esources for a detailed tutorial on GitHub source control</w:t>
                               </w:r>
@@ -1943,6 +1956,7 @@
                                 <w:rPr>
                                   <w:sz w:val="22"/>
                                   <w:szCs w:val="22"/>
+                                  <w:highlight w:val="yellow"/>
                                 </w:rPr>
                                 <w:t>.</w:t>
                               </w:r>
@@ -2003,12 +2017,14 @@
                           <w:rPr>
                             <w:sz w:val="20"/>
                             <w:szCs w:val="20"/>
+                            <w:highlight w:val="yellow"/>
                           </w:rPr>
                         </w:pPr>
                         <w:r>
                           <w:rPr>
                             <w:sz w:val="22"/>
                             <w:szCs w:val="22"/>
+                            <w:highlight w:val="yellow"/>
                           </w:rPr>
                           <w:t>Add the project to source control</w:t>
                         </w:r>
@@ -2016,6 +2032,7 @@
                           <w:rPr>
                             <w:sz w:val="22"/>
                             <w:szCs w:val="22"/>
+                            <w:highlight w:val="yellow"/>
                           </w:rPr>
                           <w:t>.</w:t>
                         </w:r>
@@ -2032,12 +2049,14 @@
                           <w:rPr>
                             <w:sz w:val="20"/>
                             <w:szCs w:val="20"/>
+                            <w:highlight w:val="yellow"/>
                           </w:rPr>
                         </w:pPr>
                         <w:r>
                           <w:rPr>
                             <w:sz w:val="22"/>
                             <w:szCs w:val="22"/>
+                            <w:highlight w:val="yellow"/>
                           </w:rPr>
                           <w:t xml:space="preserve">See the </w:t>
                         </w:r>
@@ -2045,6 +2064,7 @@
                           <w:rPr>
                             <w:sz w:val="22"/>
                             <w:szCs w:val="22"/>
+                            <w:highlight w:val="yellow"/>
                           </w:rPr>
                           <w:t>C</w:t>
                         </w:r>
@@ -2052,6 +2072,7 @@
                           <w:rPr>
                             <w:sz w:val="22"/>
                             <w:szCs w:val="22"/>
+                            <w:highlight w:val="yellow"/>
                           </w:rPr>
                           <w:t xml:space="preserve">lass </w:t>
                         </w:r>
@@ -2059,6 +2080,7 @@
                           <w:rPr>
                             <w:sz w:val="22"/>
                             <w:szCs w:val="22"/>
+                            <w:highlight w:val="yellow"/>
                           </w:rPr>
                           <w:t>R</w:t>
                         </w:r>
@@ -2066,6 +2088,7 @@
                           <w:rPr>
                             <w:sz w:val="22"/>
                             <w:szCs w:val="22"/>
+                            <w:highlight w:val="yellow"/>
                           </w:rPr>
                           <w:t>esources for a detailed tutorial on GitHub source control</w:t>
                         </w:r>
@@ -2073,6 +2096,7 @@
                           <w:rPr>
                             <w:sz w:val="22"/>
                             <w:szCs w:val="22"/>
+                            <w:highlight w:val="yellow"/>
                           </w:rPr>
                           <w:t>.</w:t>
                         </w:r>
@@ -2097,22 +2121,40 @@
         <w:spacing w:before="120" w:after="480"/>
         <w:ind w:left="360" w:hanging="360"/>
         <w:contextualSpacing w:val="0"/>
-      </w:pPr>
-      <w:r>
+        <w:rPr>
+          <w:highlight w:val="yellow"/>
+        </w:rPr>
+      </w:pPr>
+      <w:r>
+        <w:rPr>
+          <w:highlight w:val="yellow"/>
+        </w:rPr>
         <w:t xml:space="preserve">Right click on Form1 and rename it to </w:t>
       </w:r>
       <w:proofErr w:type="spellStart"/>
       <w:r>
+        <w:rPr>
+          <w:highlight w:val="yellow"/>
+        </w:rPr>
         <w:t>FrmStopwatch</w:t>
       </w:r>
       <w:proofErr w:type="spellEnd"/>
       <w:r>
+        <w:rPr>
+          <w:highlight w:val="yellow"/>
+        </w:rPr>
         <w:t>,</w:t>
       </w:r>
       <w:r>
+        <w:rPr>
+          <w:highlight w:val="yellow"/>
+        </w:rPr>
         <w:t xml:space="preserve"> as shown in</w:t>
       </w:r>
       <w:r>
+        <w:rPr>
+          <w:highlight w:val="yellow"/>
+        </w:rPr>
         <w:t xml:space="preserve"> Figure 2.</w:t>
       </w:r>
     </w:p>
@@ -2120,10 +2162,14 @@
       <w:pPr>
         <w:keepNext/>
         <w:spacing w:before="120" w:after="120"/>
+        <w:rPr>
+          <w:highlight w:val="yellow"/>
+        </w:rPr>
       </w:pPr>
       <w:r>
         <w:rPr>
           <w:noProof/>
+          <w:highlight w:val="yellow"/>
         </w:rPr>
         <w:drawing>
           <wp:inline distT="0" distB="0" distL="0" distR="0" wp14:anchorId="5F118D00" wp14:editId="2054BB38">
@@ -2166,31 +2212,68 @@
       <w:pPr>
         <w:pStyle w:val="Caption"/>
         <w:spacing w:before="120" w:after="480"/>
+        <w:rPr>
+          <w:highlight w:val="yellow"/>
+        </w:rPr>
       </w:pPr>
       <w:bookmarkStart w:id="4" w:name="_Ref191935125"/>
       <w:r>
+        <w:rPr>
+          <w:highlight w:val="yellow"/>
+        </w:rPr>
         <w:t xml:space="preserve">Figure </w:t>
       </w:r>
-      <w:fldSimple w:instr=" SEQ Figure \* ARABIC ">
-        <w:r>
-          <w:rPr>
-            <w:noProof/>
-          </w:rPr>
-          <w:t>2</w:t>
-        </w:r>
-      </w:fldSimple>
+      <w:r>
+        <w:rPr>
+          <w:highlight w:val="yellow"/>
+        </w:rPr>
+        <w:fldChar w:fldCharType="begin"/>
+      </w:r>
+      <w:r>
+        <w:rPr>
+          <w:highlight w:val="yellow"/>
+        </w:rPr>
+        <w:instrText xml:space="preserve"> SEQ Figure \* ARABIC </w:instrText>
+      </w:r>
+      <w:r>
+        <w:rPr>
+          <w:highlight w:val="yellow"/>
+        </w:rPr>
+        <w:fldChar w:fldCharType="separate"/>
+      </w:r>
+      <w:r>
+        <w:rPr>
+          <w:noProof/>
+          <w:highlight w:val="yellow"/>
+        </w:rPr>
+        <w:t>2</w:t>
+      </w:r>
+      <w:r>
+        <w:rPr>
+          <w:noProof/>
+          <w:highlight w:val="yellow"/>
+        </w:rPr>
+        <w:fldChar w:fldCharType="end"/>
+      </w:r>
       <w:bookmarkEnd w:id="4"/>
       <w:r>
         <w:rPr>
           <w:noProof/>
+          <w:highlight w:val="yellow"/>
         </w:rPr>
         <w:t>:</w:t>
       </w:r>
       <w:r>
+        <w:rPr>
+          <w:highlight w:val="yellow"/>
+        </w:rPr>
         <w:t xml:space="preserve"> Rename Form1 to </w:t>
       </w:r>
       <w:proofErr w:type="spellStart"/>
       <w:r>
+        <w:rPr>
+          <w:highlight w:val="yellow"/>
+        </w:rPr>
         <w:t>FrmStopwatch</w:t>
       </w:r>
       <w:proofErr w:type="spellEnd"/>
@@ -2205,43 +2288,79 @@
         <w:spacing w:before="120" w:after="480"/>
         <w:ind w:left="360" w:hanging="360"/>
         <w:contextualSpacing w:val="0"/>
-      </w:pPr>
-      <w:r>
+        <w:rPr>
+          <w:highlight w:val="yellow"/>
+        </w:rPr>
+      </w:pPr>
+      <w:r>
+        <w:rPr>
+          <w:highlight w:val="yellow"/>
+        </w:rPr>
         <w:lastRenderedPageBreak/>
         <w:t xml:space="preserve">Create a Presentation folder under your project and name it </w:t>
       </w:r>
       <w:r>
+        <w:rPr>
+          <w:highlight w:val="yellow"/>
+        </w:rPr>
         <w:t>"</w:t>
       </w:r>
       <w:proofErr w:type="spellStart"/>
       <w:r>
+        <w:rPr>
+          <w:highlight w:val="yellow"/>
+        </w:rPr>
         <w:t>PresentationLayer</w:t>
       </w:r>
       <w:proofErr w:type="spellEnd"/>
       <w:r>
+        <w:rPr>
+          <w:highlight w:val="yellow"/>
+        </w:rPr>
         <w:t>"</w:t>
       </w:r>
       <w:r>
+        <w:rPr>
+          <w:highlight w:val="yellow"/>
+        </w:rPr>
         <w:t xml:space="preserve">. Drag </w:t>
       </w:r>
       <w:proofErr w:type="spellStart"/>
       <w:r>
+        <w:rPr>
+          <w:highlight w:val="yellow"/>
+        </w:rPr>
         <w:t>FrmStopwatch</w:t>
       </w:r>
       <w:proofErr w:type="spellEnd"/>
       <w:r>
+        <w:rPr>
+          <w:highlight w:val="yellow"/>
+        </w:rPr>
         <w:t xml:space="preserve"> into the folder</w:t>
       </w:r>
       <w:r>
+        <w:rPr>
+          <w:highlight w:val="yellow"/>
+        </w:rPr>
         <w:t>,</w:t>
       </w:r>
       <w:r>
+        <w:rPr>
+          <w:highlight w:val="yellow"/>
+        </w:rPr>
         <w:t xml:space="preserve"> as shown in</w:t>
       </w:r>
       <w:r>
+        <w:rPr>
+          <w:highlight w:val="yellow"/>
+        </w:rPr>
         <w:t xml:space="preserve"> Figure 3</w:t>
       </w:r>
       <w:r>
+        <w:rPr>
+          <w:highlight w:val="yellow"/>
+        </w:rPr>
         <w:t>.</w:t>
       </w:r>
     </w:p>
@@ -2249,10 +2368,14 @@
       <w:pPr>
         <w:keepNext/>
         <w:spacing w:before="120" w:after="120"/>
+        <w:rPr>
+          <w:highlight w:val="yellow"/>
+        </w:rPr>
       </w:pPr>
       <w:r>
         <w:rPr>
           <w:noProof/>
+          <w:highlight w:val="yellow"/>
         </w:rPr>
         <w:drawing>
           <wp:inline distT="0" distB="0" distL="0" distR="0" wp14:anchorId="41E6A65D" wp14:editId="6D9F09AB">
@@ -2295,37 +2418,82 @@
       <w:pPr>
         <w:pStyle w:val="Caption"/>
         <w:spacing w:after="480"/>
+        <w:rPr>
+          <w:highlight w:val="yellow"/>
+        </w:rPr>
       </w:pPr>
       <w:bookmarkStart w:id="5" w:name="_Ref191935207"/>
       <w:r>
+        <w:rPr>
+          <w:highlight w:val="yellow"/>
+        </w:rPr>
         <w:t xml:space="preserve">Figure </w:t>
       </w:r>
-      <w:fldSimple w:instr=" SEQ Figure \* ARABIC ">
-        <w:r>
-          <w:rPr>
-            <w:noProof/>
-          </w:rPr>
-          <w:t>3</w:t>
-        </w:r>
-      </w:fldSimple>
+      <w:r>
+        <w:rPr>
+          <w:highlight w:val="yellow"/>
+        </w:rPr>
+        <w:fldChar w:fldCharType="begin"/>
+      </w:r>
+      <w:r>
+        <w:rPr>
+          <w:highlight w:val="yellow"/>
+        </w:rPr>
+        <w:instrText xml:space="preserve"> SEQ Figure \* ARABIC </w:instrText>
+      </w:r>
+      <w:r>
+        <w:rPr>
+          <w:highlight w:val="yellow"/>
+        </w:rPr>
+        <w:fldChar w:fldCharType="separate"/>
+      </w:r>
+      <w:r>
+        <w:rPr>
+          <w:noProof/>
+          <w:highlight w:val="yellow"/>
+        </w:rPr>
+        <w:t>3</w:t>
+      </w:r>
+      <w:r>
+        <w:rPr>
+          <w:noProof/>
+          <w:highlight w:val="yellow"/>
+        </w:rPr>
+        <w:fldChar w:fldCharType="end"/>
+      </w:r>
       <w:bookmarkEnd w:id="5"/>
       <w:r>
+        <w:rPr>
+          <w:highlight w:val="yellow"/>
+        </w:rPr>
         <w:t xml:space="preserve">: Moving </w:t>
       </w:r>
       <w:proofErr w:type="spellStart"/>
       <w:r>
+        <w:rPr>
+          <w:highlight w:val="yellow"/>
+        </w:rPr>
         <w:t>FrmStopwatch</w:t>
       </w:r>
       <w:proofErr w:type="spellEnd"/>
       <w:r>
+        <w:rPr>
+          <w:highlight w:val="yellow"/>
+        </w:rPr>
         <w:t xml:space="preserve"> to the </w:t>
       </w:r>
       <w:proofErr w:type="spellStart"/>
       <w:r>
+        <w:rPr>
+          <w:highlight w:val="yellow"/>
+        </w:rPr>
         <w:t>PresentationLayer</w:t>
       </w:r>
       <w:proofErr w:type="spellEnd"/>
       <w:r>
+        <w:rPr>
+          <w:highlight w:val="yellow"/>
+        </w:rPr>
         <w:t xml:space="preserve"> Folder</w:t>
       </w:r>
     </w:p>
@@ -2339,42 +2507,78 @@
         <w:spacing w:before="120" w:after="480"/>
         <w:ind w:left="360" w:hanging="360"/>
         <w:contextualSpacing w:val="0"/>
-      </w:pPr>
-      <w:r>
+        <w:rPr>
+          <w:highlight w:val="yellow"/>
+        </w:rPr>
+      </w:pPr>
+      <w:r>
+        <w:rPr>
+          <w:highlight w:val="yellow"/>
+        </w:rPr>
         <w:t xml:space="preserve">Under </w:t>
       </w:r>
       <w:proofErr w:type="spellStart"/>
       <w:r>
+        <w:rPr>
+          <w:highlight w:val="yellow"/>
+        </w:rPr>
         <w:t>FrmStopwatch’s</w:t>
       </w:r>
       <w:proofErr w:type="spellEnd"/>
       <w:r>
+        <w:rPr>
+          <w:highlight w:val="yellow"/>
+        </w:rPr>
         <w:t xml:space="preserve"> Properties, change the name for Form1 to </w:t>
       </w:r>
       <w:proofErr w:type="spellStart"/>
       <w:r>
+        <w:rPr>
+          <w:highlight w:val="yellow"/>
+        </w:rPr>
         <w:t>FrmStopwatch</w:t>
       </w:r>
       <w:proofErr w:type="spellEnd"/>
       <w:r>
+        <w:rPr>
+          <w:highlight w:val="yellow"/>
+        </w:rPr>
         <w:t xml:space="preserve"> using the Name attribute</w:t>
       </w:r>
       <w:r>
+        <w:rPr>
+          <w:highlight w:val="yellow"/>
+        </w:rPr>
         <w:t>,</w:t>
       </w:r>
       <w:r>
+        <w:rPr>
+          <w:highlight w:val="yellow"/>
+        </w:rPr>
         <w:t xml:space="preserve"> as shown in</w:t>
       </w:r>
       <w:r>
+        <w:rPr>
+          <w:highlight w:val="yellow"/>
+        </w:rPr>
         <w:t xml:space="preserve"> Figure 4</w:t>
       </w:r>
       <w:r>
+        <w:rPr>
+          <w:highlight w:val="yellow"/>
+        </w:rPr>
         <w:t>. Additionally, update the Text attribute so</w:t>
       </w:r>
       <w:r>
+        <w:rPr>
+          <w:highlight w:val="yellow"/>
+        </w:rPr>
         <w:t xml:space="preserve"> that</w:t>
       </w:r>
       <w:r>
+        <w:rPr>
+          <w:highlight w:val="yellow"/>
+        </w:rPr>
         <w:t xml:space="preserve"> the form reads Stopwatch.</w:t>
       </w:r>
     </w:p>
@@ -2382,10 +2586,14 @@
       <w:pPr>
         <w:keepNext/>
         <w:spacing w:before="120" w:after="120"/>
+        <w:rPr>
+          <w:highlight w:val="yellow"/>
+        </w:rPr>
       </w:pPr>
       <w:r>
         <w:rPr>
           <w:noProof/>
+          <w:highlight w:val="yellow"/>
         </w:rPr>
         <w:drawing>
           <wp:inline distT="0" distB="0" distL="0" distR="0" wp14:anchorId="683DB474" wp14:editId="0942CA0E">
@@ -2428,31 +2636,75 @@
       <w:pPr>
         <w:pStyle w:val="Caption"/>
         <w:spacing w:after="480"/>
+        <w:rPr>
+          <w:highlight w:val="yellow"/>
+        </w:rPr>
       </w:pPr>
       <w:bookmarkStart w:id="6" w:name="_Ref191935282"/>
       <w:r>
+        <w:rPr>
+          <w:highlight w:val="yellow"/>
+        </w:rPr>
         <w:t xml:space="preserve">Figure </w:t>
       </w:r>
-      <w:fldSimple w:instr=" SEQ Figure \* ARABIC ">
-        <w:r>
-          <w:rPr>
-            <w:noProof/>
-          </w:rPr>
-          <w:t>4</w:t>
-        </w:r>
-      </w:fldSimple>
+      <w:r>
+        <w:rPr>
+          <w:highlight w:val="yellow"/>
+        </w:rPr>
+        <w:fldChar w:fldCharType="begin"/>
+      </w:r>
+      <w:r>
+        <w:rPr>
+          <w:highlight w:val="yellow"/>
+        </w:rPr>
+        <w:instrText xml:space="preserve"> SEQ Figure \* ARABIC </w:instrText>
+      </w:r>
+      <w:r>
+        <w:rPr>
+          <w:highlight w:val="yellow"/>
+        </w:rPr>
+        <w:fldChar w:fldCharType="separate"/>
+      </w:r>
+      <w:r>
+        <w:rPr>
+          <w:noProof/>
+          <w:highlight w:val="yellow"/>
+        </w:rPr>
+        <w:t>4</w:t>
+      </w:r>
+      <w:r>
+        <w:rPr>
+          <w:noProof/>
+          <w:highlight w:val="yellow"/>
+        </w:rPr>
+        <w:fldChar w:fldCharType="end"/>
+      </w:r>
       <w:bookmarkEnd w:id="6"/>
       <w:r>
+        <w:rPr>
+          <w:highlight w:val="yellow"/>
+        </w:rPr>
         <w:t xml:space="preserve">: Updating the name of the form to </w:t>
       </w:r>
       <w:proofErr w:type="spellStart"/>
       <w:r>
+        <w:rPr>
+          <w:highlight w:val="yellow"/>
+        </w:rPr>
         <w:t>FrmStopwatch</w:t>
       </w:r>
       <w:proofErr w:type="spellEnd"/>
     </w:p>
     <w:p>
-      <w:r>
+      <w:pPr>
+        <w:rPr>
+          <w:highlight w:val="yellow"/>
+        </w:rPr>
+      </w:pPr>
+      <w:r>
+        <w:rPr>
+          <w:highlight w:val="yellow"/>
+        </w:rPr>
         <w:br w:type="page"/>
       </w:r>
     </w:p>
@@ -2466,29 +2718,53 @@
         <w:spacing w:before="120" w:after="480"/>
         <w:ind w:left="360" w:hanging="360"/>
         <w:contextualSpacing w:val="0"/>
-      </w:pPr>
-      <w:r>
+        <w:rPr>
+          <w:highlight w:val="yellow"/>
+        </w:rPr>
+      </w:pPr>
+      <w:r>
+        <w:rPr>
+          <w:highlight w:val="yellow"/>
+        </w:rPr>
         <w:lastRenderedPageBreak/>
         <w:t xml:space="preserve">Resize </w:t>
       </w:r>
       <w:proofErr w:type="spellStart"/>
       <w:r>
+        <w:rPr>
+          <w:highlight w:val="yellow"/>
+        </w:rPr>
         <w:t>FrmStopwatch</w:t>
       </w:r>
       <w:proofErr w:type="spellEnd"/>
       <w:r>
+        <w:rPr>
+          <w:highlight w:val="yellow"/>
+        </w:rPr>
         <w:t xml:space="preserve"> and create three buttons and a label</w:t>
       </w:r>
       <w:r>
+        <w:rPr>
+          <w:highlight w:val="yellow"/>
+        </w:rPr>
         <w:t>,</w:t>
       </w:r>
       <w:r>
+        <w:rPr>
+          <w:highlight w:val="yellow"/>
+        </w:rPr>
         <w:t xml:space="preserve"> as shown in</w:t>
       </w:r>
       <w:r>
+        <w:rPr>
+          <w:highlight w:val="yellow"/>
+        </w:rPr>
         <w:t xml:space="preserve"> Figure 5</w:t>
       </w:r>
       <w:r>
+        <w:rPr>
+          <w:highlight w:val="yellow"/>
+        </w:rPr>
         <w:t>.</w:t>
       </w:r>
     </w:p>
@@ -2496,10 +2772,14 @@
       <w:pPr>
         <w:keepNext/>
         <w:spacing w:before="120" w:after="120"/>
+        <w:rPr>
+          <w:highlight w:val="yellow"/>
+        </w:rPr>
       </w:pPr>
       <w:r>
         <w:rPr>
           <w:noProof/>
+          <w:highlight w:val="yellow"/>
         </w:rPr>
         <w:drawing>
           <wp:inline distT="0" distB="0" distL="0" distR="0" wp14:anchorId="18751419" wp14:editId="624E21F9">
@@ -2542,25 +2822,61 @@
       <w:pPr>
         <w:pStyle w:val="Caption"/>
         <w:spacing w:after="480"/>
+        <w:rPr>
+          <w:highlight w:val="yellow"/>
+        </w:rPr>
       </w:pPr>
       <w:bookmarkStart w:id="7" w:name="_Ref191935366"/>
       <w:r>
+        <w:rPr>
+          <w:highlight w:val="yellow"/>
+        </w:rPr>
         <w:t xml:space="preserve">Figure </w:t>
       </w:r>
-      <w:fldSimple w:instr=" SEQ Figure \* ARABIC ">
-        <w:r>
-          <w:rPr>
-            <w:noProof/>
-          </w:rPr>
-          <w:t>5</w:t>
-        </w:r>
-      </w:fldSimple>
+      <w:r>
+        <w:rPr>
+          <w:highlight w:val="yellow"/>
+        </w:rPr>
+        <w:fldChar w:fldCharType="begin"/>
+      </w:r>
+      <w:r>
+        <w:rPr>
+          <w:highlight w:val="yellow"/>
+        </w:rPr>
+        <w:instrText xml:space="preserve"> SEQ Figure \* ARABIC </w:instrText>
+      </w:r>
+      <w:r>
+        <w:rPr>
+          <w:highlight w:val="yellow"/>
+        </w:rPr>
+        <w:fldChar w:fldCharType="separate"/>
+      </w:r>
+      <w:r>
+        <w:rPr>
+          <w:noProof/>
+          <w:highlight w:val="yellow"/>
+        </w:rPr>
+        <w:t>5</w:t>
+      </w:r>
+      <w:r>
+        <w:rPr>
+          <w:noProof/>
+          <w:highlight w:val="yellow"/>
+        </w:rPr>
+        <w:fldChar w:fldCharType="end"/>
+      </w:r>
       <w:bookmarkEnd w:id="7"/>
       <w:r>
+        <w:rPr>
+          <w:highlight w:val="yellow"/>
+        </w:rPr>
         <w:t xml:space="preserve">: Adding buttons and a label to </w:t>
       </w:r>
       <w:proofErr w:type="spellStart"/>
       <w:r>
+        <w:rPr>
+          <w:highlight w:val="yellow"/>
+        </w:rPr>
         <w:t>FrmStopwatch</w:t>
       </w:r>
       <w:proofErr w:type="spellEnd"/>
@@ -2575,46 +2891,82 @@
         <w:spacing w:before="120" w:after="480"/>
         <w:ind w:left="360" w:hanging="360"/>
         <w:contextualSpacing w:val="0"/>
-      </w:pPr>
-      <w:r>
+        <w:rPr>
+          <w:highlight w:val="yellow"/>
+        </w:rPr>
+      </w:pPr>
+      <w:r>
+        <w:rPr>
+          <w:highlight w:val="yellow"/>
+        </w:rPr>
         <w:t xml:space="preserve">Rename the label as </w:t>
       </w:r>
       <w:proofErr w:type="spellStart"/>
       <w:r>
+        <w:rPr>
+          <w:highlight w:val="yellow"/>
+        </w:rPr>
         <w:t>lblTimeElapsed</w:t>
       </w:r>
       <w:proofErr w:type="spellEnd"/>
       <w:r>
+        <w:rPr>
+          <w:highlight w:val="yellow"/>
+        </w:rPr>
         <w:t xml:space="preserve"> and each of the buttons as </w:t>
       </w:r>
       <w:proofErr w:type="spellStart"/>
       <w:r>
+        <w:rPr>
+          <w:highlight w:val="yellow"/>
+        </w:rPr>
         <w:t>btnStart</w:t>
       </w:r>
       <w:proofErr w:type="spellEnd"/>
       <w:r>
+        <w:rPr>
+          <w:highlight w:val="yellow"/>
+        </w:rPr>
         <w:t xml:space="preserve">, </w:t>
       </w:r>
       <w:proofErr w:type="spellStart"/>
       <w:r>
+        <w:rPr>
+          <w:highlight w:val="yellow"/>
+        </w:rPr>
         <w:t>btnStop</w:t>
       </w:r>
       <w:proofErr w:type="spellEnd"/>
       <w:r>
+        <w:rPr>
+          <w:highlight w:val="yellow"/>
+        </w:rPr>
         <w:t xml:space="preserve">, and </w:t>
       </w:r>
       <w:proofErr w:type="spellStart"/>
       <w:r>
+        <w:rPr>
+          <w:highlight w:val="yellow"/>
+        </w:rPr>
         <w:t>btnReset</w:t>
       </w:r>
       <w:proofErr w:type="spellEnd"/>
       <w:r>
+        <w:rPr>
+          <w:highlight w:val="yellow"/>
+        </w:rPr>
         <w:t xml:space="preserve">, respectively. You can also change the text for each button to Start, Stop, and Reset as shown in </w:t>
       </w:r>
       <w:r>
+        <w:rPr>
+          <w:highlight w:val="yellow"/>
+        </w:rPr>
         <w:t>Figure 6</w:t>
       </w:r>
       <w:r>
+        <w:rPr>
+          <w:highlight w:val="yellow"/>
+        </w:rPr>
         <w:t>.</w:t>
       </w:r>
     </w:p>
@@ -2622,10 +2974,14 @@
       <w:pPr>
         <w:keepNext/>
         <w:spacing w:before="120" w:after="120"/>
+        <w:rPr>
+          <w:highlight w:val="yellow"/>
+        </w:rPr>
       </w:pPr>
       <w:r>
         <w:rPr>
           <w:noProof/>
+          <w:highlight w:val="yellow"/>
         </w:rPr>
         <w:drawing>
           <wp:inline distT="0" distB="0" distL="0" distR="0" wp14:anchorId="044DE45D" wp14:editId="6A7A31B5">
@@ -2668,29 +3024,68 @@
       <w:pPr>
         <w:pStyle w:val="Caption"/>
         <w:spacing w:after="480"/>
+        <w:rPr>
+          <w:highlight w:val="yellow"/>
+        </w:rPr>
       </w:pPr>
       <w:bookmarkStart w:id="8" w:name="_Ref191935554"/>
       <w:r>
+        <w:rPr>
+          <w:highlight w:val="yellow"/>
+        </w:rPr>
         <w:t xml:space="preserve">Figure </w:t>
       </w:r>
-      <w:fldSimple w:instr=" SEQ Figure \* ARABIC ">
-        <w:r>
-          <w:rPr>
-            <w:noProof/>
-          </w:rPr>
-          <w:t>6</w:t>
-        </w:r>
-      </w:fldSimple>
+      <w:r>
+        <w:rPr>
+          <w:highlight w:val="yellow"/>
+        </w:rPr>
+        <w:fldChar w:fldCharType="begin"/>
+      </w:r>
+      <w:r>
+        <w:rPr>
+          <w:highlight w:val="yellow"/>
+        </w:rPr>
+        <w:instrText xml:space="preserve"> SEQ Figure \* ARABIC </w:instrText>
+      </w:r>
+      <w:r>
+        <w:rPr>
+          <w:highlight w:val="yellow"/>
+        </w:rPr>
+        <w:fldChar w:fldCharType="separate"/>
+      </w:r>
+      <w:r>
+        <w:rPr>
+          <w:noProof/>
+          <w:highlight w:val="yellow"/>
+        </w:rPr>
+        <w:t>6</w:t>
+      </w:r>
+      <w:r>
+        <w:rPr>
+          <w:noProof/>
+          <w:highlight w:val="yellow"/>
+        </w:rPr>
+        <w:fldChar w:fldCharType="end"/>
+      </w:r>
       <w:bookmarkEnd w:id="8"/>
       <w:r>
+        <w:rPr>
+          <w:highlight w:val="yellow"/>
+        </w:rPr>
         <w:t xml:space="preserve">: </w:t>
       </w:r>
       <w:proofErr w:type="spellStart"/>
       <w:r>
+        <w:rPr>
+          <w:highlight w:val="yellow"/>
+        </w:rPr>
         <w:t>FrmStopwatch</w:t>
       </w:r>
       <w:proofErr w:type="spellEnd"/>
       <w:r>
+        <w:rPr>
+          <w:highlight w:val="yellow"/>
+        </w:rPr>
         <w:t xml:space="preserve"> with the Start, Stop, and Reset buttons</w:t>
       </w:r>
     </w:p>
@@ -2704,32 +3099,59 @@
         <w:spacing w:before="120" w:after="480"/>
         <w:ind w:left="360" w:hanging="360"/>
         <w:contextualSpacing w:val="0"/>
-      </w:pPr>
-      <w:r>
+        <w:rPr>
+          <w:highlight w:val="yellow"/>
+        </w:rPr>
+      </w:pPr>
+      <w:r>
+        <w:rPr>
+          <w:highlight w:val="yellow"/>
+        </w:rPr>
         <w:lastRenderedPageBreak/>
         <w:t xml:space="preserve">Next, add a Timer control to </w:t>
       </w:r>
       <w:proofErr w:type="spellStart"/>
       <w:r>
+        <w:rPr>
+          <w:highlight w:val="yellow"/>
+        </w:rPr>
         <w:t>FrmStopwatch</w:t>
       </w:r>
       <w:proofErr w:type="spellEnd"/>
       <w:r>
+        <w:rPr>
+          <w:highlight w:val="yellow"/>
+        </w:rPr>
         <w:t>,</w:t>
       </w:r>
       <w:r>
+        <w:rPr>
+          <w:highlight w:val="yellow"/>
+        </w:rPr>
         <w:t xml:space="preserve"> as shown in</w:t>
       </w:r>
       <w:r>
+        <w:rPr>
+          <w:highlight w:val="yellow"/>
+        </w:rPr>
         <w:t xml:space="preserve"> Figure 7</w:t>
       </w:r>
       <w:r>
+        <w:rPr>
+          <w:highlight w:val="yellow"/>
+        </w:rPr>
         <w:t xml:space="preserve">. The control will not be visible on your </w:t>
       </w:r>
       <w:r>
+        <w:rPr>
+          <w:highlight w:val="yellow"/>
+        </w:rPr>
         <w:t>form but</w:t>
       </w:r>
       <w:r>
+        <w:rPr>
+          <w:highlight w:val="yellow"/>
+        </w:rPr>
         <w:t xml:space="preserve"> will show up in the bar at the bottom of the designer.</w:t>
       </w:r>
     </w:p>
@@ -2737,10 +3159,14 @@
       <w:pPr>
         <w:keepNext/>
         <w:spacing w:before="120" w:after="120"/>
+        <w:rPr>
+          <w:highlight w:val="yellow"/>
+        </w:rPr>
       </w:pPr>
       <w:r>
         <w:rPr>
           <w:noProof/>
+          <w:highlight w:val="yellow"/>
         </w:rPr>
         <w:drawing>
           <wp:inline distT="0" distB="0" distL="0" distR="0" wp14:anchorId="73DF04F3" wp14:editId="6CD1EE4D">
@@ -2783,25 +3209,61 @@
       <w:pPr>
         <w:pStyle w:val="Caption"/>
         <w:spacing w:after="480"/>
+        <w:rPr>
+          <w:highlight w:val="yellow"/>
+        </w:rPr>
       </w:pPr>
       <w:bookmarkStart w:id="9" w:name="_Ref191935606"/>
       <w:r>
+        <w:rPr>
+          <w:highlight w:val="yellow"/>
+        </w:rPr>
         <w:t xml:space="preserve">Figure </w:t>
       </w:r>
-      <w:fldSimple w:instr=" SEQ Figure \* ARABIC ">
-        <w:r>
-          <w:rPr>
-            <w:noProof/>
-          </w:rPr>
-          <w:t>7</w:t>
-        </w:r>
-      </w:fldSimple>
+      <w:r>
+        <w:rPr>
+          <w:highlight w:val="yellow"/>
+        </w:rPr>
+        <w:fldChar w:fldCharType="begin"/>
+      </w:r>
+      <w:r>
+        <w:rPr>
+          <w:highlight w:val="yellow"/>
+        </w:rPr>
+        <w:instrText xml:space="preserve"> SEQ Figure \* ARABIC </w:instrText>
+      </w:r>
+      <w:r>
+        <w:rPr>
+          <w:highlight w:val="yellow"/>
+        </w:rPr>
+        <w:fldChar w:fldCharType="separate"/>
+      </w:r>
+      <w:r>
+        <w:rPr>
+          <w:noProof/>
+          <w:highlight w:val="yellow"/>
+        </w:rPr>
+        <w:t>7</w:t>
+      </w:r>
+      <w:r>
+        <w:rPr>
+          <w:noProof/>
+          <w:highlight w:val="yellow"/>
+        </w:rPr>
+        <w:fldChar w:fldCharType="end"/>
+      </w:r>
       <w:bookmarkEnd w:id="9"/>
       <w:r>
+        <w:rPr>
+          <w:highlight w:val="yellow"/>
+        </w:rPr>
         <w:t xml:space="preserve">: Adding a timer control to </w:t>
       </w:r>
       <w:proofErr w:type="spellStart"/>
       <w:r>
+        <w:rPr>
+          <w:highlight w:val="yellow"/>
+        </w:rPr>
         <w:t>FrmStopwatch</w:t>
       </w:r>
       <w:proofErr w:type="spellEnd"/>
@@ -2816,36 +3278,66 @@
         <w:spacing w:before="120" w:after="480"/>
         <w:ind w:left="360" w:hanging="360"/>
         <w:contextualSpacing w:val="0"/>
-      </w:pPr>
-      <w:r>
+        <w:rPr>
+          <w:highlight w:val="yellow"/>
+        </w:rPr>
+      </w:pPr>
+      <w:r>
+        <w:rPr>
+          <w:highlight w:val="yellow"/>
+        </w:rPr>
         <w:t xml:space="preserve">Using the timer naming convention, </w:t>
       </w:r>
       <w:proofErr w:type="spellStart"/>
       <w:r>
+        <w:rPr>
+          <w:highlight w:val="yellow"/>
+        </w:rPr>
         <w:t>tmr</w:t>
       </w:r>
       <w:proofErr w:type="spellEnd"/>
       <w:r>
+        <w:rPr>
+          <w:highlight w:val="yellow"/>
+        </w:rPr>
         <w:t xml:space="preserve">, rename timer1 to </w:t>
       </w:r>
       <w:proofErr w:type="spellStart"/>
       <w:r>
+        <w:rPr>
+          <w:highlight w:val="yellow"/>
+        </w:rPr>
         <w:t>tmrStopwatch</w:t>
       </w:r>
       <w:proofErr w:type="spellEnd"/>
       <w:r>
+        <w:rPr>
+          <w:highlight w:val="yellow"/>
+        </w:rPr>
         <w:t>. Then, find the Enabled property for the timer and set it to true. Finally, set the interval to 1000 (this is measured in milliseconds)</w:t>
       </w:r>
       <w:r>
+        <w:rPr>
+          <w:highlight w:val="yellow"/>
+        </w:rPr>
         <w:t>,</w:t>
       </w:r>
       <w:r>
+        <w:rPr>
+          <w:highlight w:val="yellow"/>
+        </w:rPr>
         <w:t xml:space="preserve"> as shown in</w:t>
       </w:r>
       <w:r>
+        <w:rPr>
+          <w:highlight w:val="yellow"/>
+        </w:rPr>
         <w:t xml:space="preserve"> Figure 8</w:t>
       </w:r>
       <w:r>
+        <w:rPr>
+          <w:highlight w:val="yellow"/>
+        </w:rPr>
         <w:t>.</w:t>
       </w:r>
     </w:p>
@@ -2853,10 +3345,14 @@
       <w:pPr>
         <w:keepNext/>
         <w:spacing w:before="120" w:after="120"/>
+        <w:rPr>
+          <w:highlight w:val="yellow"/>
+        </w:rPr>
       </w:pPr>
       <w:r>
         <w:rPr>
           <w:noProof/>
+          <w:highlight w:val="yellow"/>
         </w:rPr>
         <w:drawing>
           <wp:inline distT="0" distB="0" distL="0" distR="0" wp14:anchorId="7538FE8A" wp14:editId="4CB00259">
@@ -2899,26 +3395,67 @@
       <w:pPr>
         <w:pStyle w:val="Caption"/>
         <w:spacing w:after="480"/>
+        <w:rPr>
+          <w:highlight w:val="yellow"/>
+        </w:rPr>
       </w:pPr>
       <w:bookmarkStart w:id="10" w:name="_Ref191936021"/>
       <w:r>
+        <w:rPr>
+          <w:highlight w:val="yellow"/>
+        </w:rPr>
         <w:t xml:space="preserve">Figure </w:t>
       </w:r>
-      <w:fldSimple w:instr=" SEQ Figure \* ARABIC ">
-        <w:r>
-          <w:rPr>
-            <w:noProof/>
-          </w:rPr>
-          <w:t>8</w:t>
-        </w:r>
-      </w:fldSimple>
+      <w:r>
+        <w:rPr>
+          <w:highlight w:val="yellow"/>
+        </w:rPr>
+        <w:fldChar w:fldCharType="begin"/>
+      </w:r>
+      <w:r>
+        <w:rPr>
+          <w:highlight w:val="yellow"/>
+        </w:rPr>
+        <w:instrText xml:space="preserve"> SEQ Figure \* ARABIC </w:instrText>
+      </w:r>
+      <w:r>
+        <w:rPr>
+          <w:highlight w:val="yellow"/>
+        </w:rPr>
+        <w:fldChar w:fldCharType="separate"/>
+      </w:r>
+      <w:r>
+        <w:rPr>
+          <w:noProof/>
+          <w:highlight w:val="yellow"/>
+        </w:rPr>
+        <w:t>8</w:t>
+      </w:r>
+      <w:r>
+        <w:rPr>
+          <w:noProof/>
+          <w:highlight w:val="yellow"/>
+        </w:rPr>
+        <w:fldChar w:fldCharType="end"/>
+      </w:r>
       <w:bookmarkEnd w:id="10"/>
       <w:r>
+        <w:rPr>
+          <w:highlight w:val="yellow"/>
+        </w:rPr>
         <w:t>: Updating the timer properties</w:t>
       </w:r>
     </w:p>
     <w:p>
-      <w:r>
+      <w:pPr>
+        <w:rPr>
+          <w:highlight w:val="yellow"/>
+        </w:rPr>
+      </w:pPr>
+      <w:r>
+        <w:rPr>
+          <w:highlight w:val="yellow"/>
+        </w:rPr>
         <w:br w:type="page"/>
       </w:r>
     </w:p>
@@ -2932,23 +3469,41 @@
         <w:spacing w:before="120" w:after="480"/>
         <w:ind w:left="360" w:hanging="360"/>
         <w:contextualSpacing w:val="0"/>
-      </w:pPr>
-      <w:r>
+        <w:rPr>
+          <w:highlight w:val="yellow"/>
+        </w:rPr>
+      </w:pPr>
+      <w:r>
+        <w:rPr>
+          <w:highlight w:val="yellow"/>
+        </w:rPr>
         <w:lastRenderedPageBreak/>
         <w:t xml:space="preserve">Right click on </w:t>
       </w:r>
       <w:proofErr w:type="spellStart"/>
       <w:r>
+        <w:rPr>
+          <w:highlight w:val="yellow"/>
+        </w:rPr>
         <w:t>FrmStopwatch</w:t>
       </w:r>
       <w:proofErr w:type="spellEnd"/>
       <w:r>
+        <w:rPr>
+          <w:highlight w:val="yellow"/>
+        </w:rPr>
         <w:t xml:space="preserve"> and open the code for the form. Add a citation to the top as shown in</w:t>
       </w:r>
       <w:r>
+        <w:rPr>
+          <w:highlight w:val="yellow"/>
+        </w:rPr>
         <w:t xml:space="preserve"> Figure 9</w:t>
       </w:r>
       <w:r>
+        <w:rPr>
+          <w:highlight w:val="yellow"/>
+        </w:rPr>
         <w:t>.</w:t>
       </w:r>
     </w:p>
@@ -2956,10 +3511,14 @@
       <w:pPr>
         <w:keepNext/>
         <w:spacing w:before="120" w:after="120"/>
+        <w:rPr>
+          <w:highlight w:val="yellow"/>
+        </w:rPr>
       </w:pPr>
       <w:r>
         <w:rPr>
           <w:noProof/>
+          <w:highlight w:val="yellow"/>
         </w:rPr>
         <w:drawing>
           <wp:inline distT="0" distB="0" distL="0" distR="0" wp14:anchorId="4B40BA54" wp14:editId="1756EC46">
@@ -3002,25 +3561,61 @@
       <w:pPr>
         <w:pStyle w:val="Caption"/>
         <w:spacing w:after="480"/>
+        <w:rPr>
+          <w:highlight w:val="yellow"/>
+        </w:rPr>
       </w:pPr>
       <w:bookmarkStart w:id="11" w:name="_Ref191936332"/>
       <w:r>
+        <w:rPr>
+          <w:highlight w:val="yellow"/>
+        </w:rPr>
         <w:t xml:space="preserve">Figure </w:t>
       </w:r>
-      <w:fldSimple w:instr=" SEQ Figure \* ARABIC ">
-        <w:r>
-          <w:rPr>
-            <w:noProof/>
-          </w:rPr>
-          <w:t>9</w:t>
-        </w:r>
-      </w:fldSimple>
+      <w:r>
+        <w:rPr>
+          <w:highlight w:val="yellow"/>
+        </w:rPr>
+        <w:fldChar w:fldCharType="begin"/>
+      </w:r>
+      <w:r>
+        <w:rPr>
+          <w:highlight w:val="yellow"/>
+        </w:rPr>
+        <w:instrText xml:space="preserve"> SEQ Figure \* ARABIC </w:instrText>
+      </w:r>
+      <w:r>
+        <w:rPr>
+          <w:highlight w:val="yellow"/>
+        </w:rPr>
+        <w:fldChar w:fldCharType="separate"/>
+      </w:r>
+      <w:r>
+        <w:rPr>
+          <w:noProof/>
+          <w:highlight w:val="yellow"/>
+        </w:rPr>
+        <w:t>9</w:t>
+      </w:r>
+      <w:r>
+        <w:rPr>
+          <w:noProof/>
+          <w:highlight w:val="yellow"/>
+        </w:rPr>
+        <w:fldChar w:fldCharType="end"/>
+      </w:r>
       <w:bookmarkEnd w:id="11"/>
       <w:r>
+        <w:rPr>
+          <w:highlight w:val="yellow"/>
+        </w:rPr>
         <w:t xml:space="preserve">: Citation for </w:t>
       </w:r>
       <w:proofErr w:type="spellStart"/>
       <w:r>
+        <w:rPr>
+          <w:highlight w:val="yellow"/>
+        </w:rPr>
         <w:t>FrmStopwatch</w:t>
       </w:r>
       <w:proofErr w:type="spellEnd"/>
@@ -3035,36 +3630,66 @@
         <w:spacing w:before="120" w:after="480"/>
         <w:ind w:left="360" w:hanging="360"/>
         <w:contextualSpacing w:val="0"/>
-      </w:pPr>
-      <w:r>
+        <w:rPr>
+          <w:highlight w:val="yellow"/>
+        </w:rPr>
+      </w:pPr>
+      <w:r>
+        <w:rPr>
+          <w:highlight w:val="yellow"/>
+        </w:rPr>
         <w:t xml:space="preserve">Add a click event handler with a summary comment to </w:t>
       </w:r>
       <w:proofErr w:type="spellStart"/>
       <w:r>
+        <w:rPr>
+          <w:highlight w:val="yellow"/>
+        </w:rPr>
         <w:t>btnStart</w:t>
       </w:r>
       <w:proofErr w:type="spellEnd"/>
       <w:r>
+        <w:rPr>
+          <w:highlight w:val="yellow"/>
+        </w:rPr>
         <w:t xml:space="preserve"> named </w:t>
       </w:r>
       <w:proofErr w:type="spellStart"/>
       <w:r>
+        <w:rPr>
+          <w:highlight w:val="yellow"/>
+        </w:rPr>
         <w:t>BtnStartClickEH</w:t>
       </w:r>
       <w:proofErr w:type="spellEnd"/>
       <w:r>
+        <w:rPr>
+          <w:highlight w:val="yellow"/>
+        </w:rPr>
         <w:t>. This method will use the Start method for the timer to start the timer</w:t>
       </w:r>
       <w:r>
+        <w:rPr>
+          <w:highlight w:val="yellow"/>
+        </w:rPr>
         <w:t>,</w:t>
       </w:r>
       <w:r>
+        <w:rPr>
+          <w:highlight w:val="yellow"/>
+        </w:rPr>
         <w:t xml:space="preserve"> as shown in</w:t>
       </w:r>
       <w:r>
+        <w:rPr>
+          <w:highlight w:val="yellow"/>
+        </w:rPr>
         <w:t xml:space="preserve"> Figure 10</w:t>
       </w:r>
       <w:r>
+        <w:rPr>
+          <w:highlight w:val="yellow"/>
+        </w:rPr>
         <w:t>.</w:t>
       </w:r>
     </w:p>
@@ -3072,10 +3697,14 @@
       <w:pPr>
         <w:keepNext/>
         <w:spacing w:before="120" w:after="120"/>
+        <w:rPr>
+          <w:highlight w:val="yellow"/>
+        </w:rPr>
       </w:pPr>
       <w:r>
         <w:rPr>
           <w:noProof/>
+          <w:highlight w:val="yellow"/>
         </w:rPr>
         <w:drawing>
           <wp:inline distT="0" distB="0" distL="0" distR="0" wp14:anchorId="16565F73" wp14:editId="7CB2E808">
@@ -3118,25 +3747,61 @@
       <w:pPr>
         <w:pStyle w:val="Caption"/>
         <w:spacing w:after="480"/>
+        <w:rPr>
+          <w:highlight w:val="yellow"/>
+        </w:rPr>
       </w:pPr>
       <w:bookmarkStart w:id="12" w:name="_Ref191936403"/>
       <w:r>
+        <w:rPr>
+          <w:highlight w:val="yellow"/>
+        </w:rPr>
         <w:t xml:space="preserve">Figure </w:t>
       </w:r>
-      <w:fldSimple w:instr=" SEQ Figure \* ARABIC ">
-        <w:r>
-          <w:rPr>
-            <w:noProof/>
-          </w:rPr>
-          <w:t>10</w:t>
-        </w:r>
-      </w:fldSimple>
+      <w:r>
+        <w:rPr>
+          <w:highlight w:val="yellow"/>
+        </w:rPr>
+        <w:fldChar w:fldCharType="begin"/>
+      </w:r>
+      <w:r>
+        <w:rPr>
+          <w:highlight w:val="yellow"/>
+        </w:rPr>
+        <w:instrText xml:space="preserve"> SEQ Figure \* ARABIC </w:instrText>
+      </w:r>
+      <w:r>
+        <w:rPr>
+          <w:highlight w:val="yellow"/>
+        </w:rPr>
+        <w:fldChar w:fldCharType="separate"/>
+      </w:r>
+      <w:r>
+        <w:rPr>
+          <w:noProof/>
+          <w:highlight w:val="yellow"/>
+        </w:rPr>
+        <w:t>10</w:t>
+      </w:r>
+      <w:r>
+        <w:rPr>
+          <w:noProof/>
+          <w:highlight w:val="yellow"/>
+        </w:rPr>
+        <w:fldChar w:fldCharType="end"/>
+      </w:r>
       <w:bookmarkEnd w:id="12"/>
       <w:r>
+        <w:rPr>
+          <w:highlight w:val="yellow"/>
+        </w:rPr>
         <w:t xml:space="preserve">: Click event handler for </w:t>
       </w:r>
       <w:proofErr w:type="spellStart"/>
       <w:r>
+        <w:rPr>
+          <w:highlight w:val="yellow"/>
+        </w:rPr>
         <w:t>btnStart</w:t>
       </w:r>
       <w:proofErr w:type="spellEnd"/>
@@ -3151,39 +3816,72 @@
         <w:spacing w:before="120" w:after="480"/>
         <w:ind w:left="360" w:hanging="360"/>
         <w:contextualSpacing w:val="0"/>
-      </w:pPr>
-      <w:r>
+        <w:rPr>
+          <w:highlight w:val="yellow"/>
+        </w:rPr>
+      </w:pPr>
+      <w:r>
+        <w:rPr>
+          <w:highlight w:val="yellow"/>
+        </w:rPr>
         <w:t xml:space="preserve">Next, add a click event handler to </w:t>
       </w:r>
       <w:proofErr w:type="spellStart"/>
       <w:r>
+        <w:rPr>
+          <w:highlight w:val="yellow"/>
+        </w:rPr>
         <w:t>btnStop</w:t>
       </w:r>
       <w:proofErr w:type="spellEnd"/>
       <w:r>
+        <w:rPr>
+          <w:highlight w:val="yellow"/>
+        </w:rPr>
         <w:t xml:space="preserve"> named </w:t>
       </w:r>
       <w:proofErr w:type="spellStart"/>
       <w:r>
+        <w:rPr>
+          <w:highlight w:val="yellow"/>
+        </w:rPr>
         <w:t>BtnStopClickEH</w:t>
       </w:r>
       <w:proofErr w:type="spellEnd"/>
       <w:r>
+        <w:rPr>
+          <w:highlight w:val="yellow"/>
+        </w:rPr>
         <w:t>. This</w:t>
       </w:r>
       <w:r>
+        <w:rPr>
+          <w:highlight w:val="yellow"/>
+        </w:rPr>
         <w:t xml:space="preserve"> will stop the timer using the Stop method</w:t>
       </w:r>
       <w:r>
+        <w:rPr>
+          <w:highlight w:val="yellow"/>
+        </w:rPr>
         <w:t>,</w:t>
       </w:r>
       <w:r>
+        <w:rPr>
+          <w:highlight w:val="yellow"/>
+        </w:rPr>
         <w:t xml:space="preserve"> as shown in </w:t>
       </w:r>
       <w:r>
+        <w:rPr>
+          <w:highlight w:val="yellow"/>
+        </w:rPr>
         <w:t>Figure 11</w:t>
       </w:r>
       <w:r>
+        <w:rPr>
+          <w:highlight w:val="yellow"/>
+        </w:rPr>
         <w:t xml:space="preserve">. Make sure to add a summary comment to the method. </w:t>
       </w:r>
     </w:p>
@@ -3191,10 +3889,14 @@
       <w:pPr>
         <w:keepNext/>
         <w:spacing w:before="120" w:after="120"/>
+        <w:rPr>
+          <w:highlight w:val="yellow"/>
+        </w:rPr>
       </w:pPr>
       <w:r>
         <w:rPr>
           <w:noProof/>
+          <w:highlight w:val="yellow"/>
         </w:rPr>
         <w:drawing>
           <wp:inline distT="0" distB="0" distL="0" distR="0" wp14:anchorId="02949194" wp14:editId="767C7A5B">
@@ -3237,25 +3939,61 @@
       <w:pPr>
         <w:pStyle w:val="Caption"/>
         <w:spacing w:after="480"/>
+        <w:rPr>
+          <w:highlight w:val="yellow"/>
+        </w:rPr>
       </w:pPr>
       <w:bookmarkStart w:id="13" w:name="_Ref191936565"/>
       <w:r>
+        <w:rPr>
+          <w:highlight w:val="yellow"/>
+        </w:rPr>
         <w:t xml:space="preserve">Figure </w:t>
       </w:r>
-      <w:fldSimple w:instr=" SEQ Figure \* ARABIC ">
-        <w:r>
-          <w:rPr>
-            <w:noProof/>
-          </w:rPr>
-          <w:t>11</w:t>
-        </w:r>
-      </w:fldSimple>
+      <w:r>
+        <w:rPr>
+          <w:highlight w:val="yellow"/>
+        </w:rPr>
+        <w:fldChar w:fldCharType="begin"/>
+      </w:r>
+      <w:r>
+        <w:rPr>
+          <w:highlight w:val="yellow"/>
+        </w:rPr>
+        <w:instrText xml:space="preserve"> SEQ Figure \* ARABIC </w:instrText>
+      </w:r>
+      <w:r>
+        <w:rPr>
+          <w:highlight w:val="yellow"/>
+        </w:rPr>
+        <w:fldChar w:fldCharType="separate"/>
+      </w:r>
+      <w:r>
+        <w:rPr>
+          <w:noProof/>
+          <w:highlight w:val="yellow"/>
+        </w:rPr>
+        <w:t>11</w:t>
+      </w:r>
+      <w:r>
+        <w:rPr>
+          <w:noProof/>
+          <w:highlight w:val="yellow"/>
+        </w:rPr>
+        <w:fldChar w:fldCharType="end"/>
+      </w:r>
       <w:bookmarkEnd w:id="13"/>
       <w:r>
+        <w:rPr>
+          <w:highlight w:val="yellow"/>
+        </w:rPr>
         <w:t xml:space="preserve">: Click event handler for </w:t>
       </w:r>
       <w:proofErr w:type="spellStart"/>
       <w:r>
+        <w:rPr>
+          <w:highlight w:val="yellow"/>
+        </w:rPr>
         <w:t>btnStop</w:t>
       </w:r>
       <w:proofErr w:type="spellEnd"/>
@@ -3263,10 +4001,14 @@
     <w:p>
       <w:pPr>
         <w:spacing w:before="120" w:after="480"/>
+        <w:rPr>
+          <w:highlight w:val="yellow"/>
+        </w:rPr>
       </w:pPr>
       <w:r>
         <w:rPr>
           <w:noProof/>
+          <w:highlight w:val="yellow"/>
         </w:rPr>
         <w:lastRenderedPageBreak/>
         <mc:AlternateContent>
@@ -3380,12 +4122,14 @@
                                 <w:rPr>
                                   <w:sz w:val="20"/>
                                   <w:szCs w:val="20"/>
+                                  <w:highlight w:val="yellow"/>
                                 </w:rPr>
                               </w:pPr>
                               <w:r>
                                 <w:rPr>
                                   <w:sz w:val="22"/>
                                   <w:szCs w:val="22"/>
+                                  <w:highlight w:val="yellow"/>
                                 </w:rPr>
                                 <w:t>Commit all changes in the project to source control</w:t>
                               </w:r>
@@ -3393,6 +4137,7 @@
                                 <w:rPr>
                                   <w:sz w:val="22"/>
                                   <w:szCs w:val="22"/>
+                                  <w:highlight w:val="yellow"/>
                                 </w:rPr>
                                 <w:t>.</w:t>
                               </w:r>
@@ -3409,12 +4154,14 @@
                                 <w:rPr>
                                   <w:sz w:val="20"/>
                                   <w:szCs w:val="20"/>
+                                  <w:highlight w:val="yellow"/>
                                 </w:rPr>
                               </w:pPr>
                               <w:r>
                                 <w:rPr>
                                   <w:sz w:val="22"/>
                                   <w:szCs w:val="22"/>
+                                  <w:highlight w:val="yellow"/>
                                 </w:rPr>
                                 <w:t>Commit Message: Finish the UI and add stop and start functionality to the timer</w:t>
                               </w:r>
@@ -3422,6 +4169,7 @@
                                 <w:rPr>
                                   <w:sz w:val="22"/>
                                   <w:szCs w:val="22"/>
+                                  <w:highlight w:val="yellow"/>
                                 </w:rPr>
                                 <w:t>.</w:t>
                               </w:r>
@@ -3459,12 +4207,14 @@
                           <w:rPr>
                             <w:sz w:val="20"/>
                             <w:szCs w:val="20"/>
+                            <w:highlight w:val="yellow"/>
                           </w:rPr>
                         </w:pPr>
                         <w:r>
                           <w:rPr>
                             <w:sz w:val="22"/>
                             <w:szCs w:val="22"/>
+                            <w:highlight w:val="yellow"/>
                           </w:rPr>
                           <w:t>Commit all changes in the project to source control</w:t>
                         </w:r>
@@ -3472,6 +4222,7 @@
                           <w:rPr>
                             <w:sz w:val="22"/>
                             <w:szCs w:val="22"/>
+                            <w:highlight w:val="yellow"/>
                           </w:rPr>
                           <w:t>.</w:t>
                         </w:r>
@@ -3488,12 +4239,14 @@
                           <w:rPr>
                             <w:sz w:val="20"/>
                             <w:szCs w:val="20"/>
+                            <w:highlight w:val="yellow"/>
                           </w:rPr>
                         </w:pPr>
                         <w:r>
                           <w:rPr>
                             <w:sz w:val="22"/>
                             <w:szCs w:val="22"/>
+                            <w:highlight w:val="yellow"/>
                           </w:rPr>
                           <w:t>Commit Message: Finish the UI and add stop and start functionality to the timer</w:t>
                         </w:r>
@@ -3501,6 +4254,7 @@
                           <w:rPr>
                             <w:sz w:val="22"/>
                             <w:szCs w:val="22"/>
+                            <w:highlight w:val="yellow"/>
                           </w:rPr>
                           <w:t>.</w:t>
                         </w:r>
@@ -3527,7 +4281,13 @@
         <w:contextualSpacing w:val="0"/>
       </w:pPr>
       <w:r>
-        <w:t>Add a class</w:t>
+        <w:rPr>
+          <w:highlight w:val="yellow"/>
+        </w:rPr>
+        <w:t>Add</w:t>
+      </w:r>
+      <w:r>
+        <w:t xml:space="preserve"> a class</w:t>
       </w:r>
       <w:r>
         <w:t>-</w:t>
@@ -4684,12 +5444,21 @@
                                 </w:rPr>
                                 <w:t xml:space="preserve"> for </w:t>
                               </w:r>
+                              <w:proofErr w:type="spellStart"/>
                               <w:r>
                                 <w:rPr>
                                   <w:sz w:val="20"/>
                                   <w:szCs w:val="20"/>
                                 </w:rPr>
-                                <w:t>FrmStopwatch. Make sure to include the class declaration in the image.</w:t>
+                                <w:t>FrmStopwatch</w:t>
+                              </w:r>
+                              <w:proofErr w:type="spellEnd"/>
+                              <w:r>
+                                <w:rPr>
+                                  <w:sz w:val="20"/>
+                                  <w:szCs w:val="20"/>
+                                </w:rPr>
+                                <w:t>. Make sure to include the class declaration in the image.</w:t>
                               </w:r>
                             </w:p>
                             <w:p>
@@ -4717,8 +5486,41 @@
                                   <w:sz w:val="20"/>
                                   <w:szCs w:val="20"/>
                                 </w:rPr>
-                                <w:t xml:space="preserve">the BtnStartClickEH, BtnStopClickEH, </w:t>
+                                <w:t xml:space="preserve">the </w:t>
                               </w:r>
+                              <w:proofErr w:type="spellStart"/>
+                              <w:r>
+                                <w:rPr>
+                                  <w:sz w:val="20"/>
+                                  <w:szCs w:val="20"/>
+                                </w:rPr>
+                                <w:t>BtnStartClickEH</w:t>
+                              </w:r>
+                              <w:proofErr w:type="spellEnd"/>
+                              <w:r>
+                                <w:rPr>
+                                  <w:sz w:val="20"/>
+                                  <w:szCs w:val="20"/>
+                                </w:rPr>
+                                <w:t xml:space="preserve">, </w:t>
+                              </w:r>
+                              <w:proofErr w:type="spellStart"/>
+                              <w:r>
+                                <w:rPr>
+                                  <w:sz w:val="20"/>
+                                  <w:szCs w:val="20"/>
+                                </w:rPr>
+                                <w:t>BtnStopClickEH</w:t>
+                              </w:r>
+                              <w:proofErr w:type="spellEnd"/>
+                              <w:r>
+                                <w:rPr>
+                                  <w:sz w:val="20"/>
+                                  <w:szCs w:val="20"/>
+                                </w:rPr>
+                                <w:t xml:space="preserve">, </w:t>
+                              </w:r>
+                              <w:proofErr w:type="spellStart"/>
                               <w:r>
                                 <w:rPr>
                                   <w:sz w:val="20"/>
@@ -4726,6 +5528,7 @@
                                 </w:rPr>
                                 <w:t>TmrStopwatchTickEH</w:t>
                               </w:r>
+                              <w:proofErr w:type="spellEnd"/>
                               <w:r>
                                 <w:rPr>
                                   <w:sz w:val="20"/>
@@ -4733,12 +5536,21 @@
                                 </w:rPr>
                                 <w:t xml:space="preserve">, and </w:t>
                               </w:r>
+                              <w:proofErr w:type="spellStart"/>
                               <w:r>
                                 <w:rPr>
                                   <w:sz w:val="20"/>
                                   <w:szCs w:val="20"/>
                                 </w:rPr>
-                                <w:t xml:space="preserve">BtnResetClickEH </w:t>
+                                <w:t>BtnResetClickEH</w:t>
+                              </w:r>
+                              <w:proofErr w:type="spellEnd"/>
+                              <w:r>
+                                <w:rPr>
+                                  <w:sz w:val="20"/>
+                                  <w:szCs w:val="20"/>
+                                </w:rPr>
+                                <w:t xml:space="preserve"> </w:t>
                               </w:r>
                               <w:r>
                                 <w:rPr>
@@ -4773,7 +5585,23 @@
                                   <w:sz w:val="20"/>
                                   <w:szCs w:val="20"/>
                                 </w:rPr>
-                                <w:t>Take a screen shot of the UML for the FrmStopwatch class.</w:t>
+                                <w:t xml:space="preserve">Take a screen shot of the UML for the </w:t>
+                              </w:r>
+                              <w:proofErr w:type="spellStart"/>
+                              <w:r>
+                                <w:rPr>
+                                  <w:sz w:val="20"/>
+                                  <w:szCs w:val="20"/>
+                                </w:rPr>
+                                <w:t>FrmStopwatch</w:t>
+                              </w:r>
+                              <w:proofErr w:type="spellEnd"/>
+                              <w:r>
+                                <w:rPr>
+                                  <w:sz w:val="20"/>
+                                  <w:szCs w:val="20"/>
+                                </w:rPr>
+                                <w:t xml:space="preserve"> class.</w:t>
                               </w:r>
                             </w:p>
                             <w:p>
@@ -4946,12 +5774,21 @@
                           </w:rPr>
                           <w:t xml:space="preserve"> for </w:t>
                         </w:r>
+                        <w:proofErr w:type="spellStart"/>
                         <w:r>
                           <w:rPr>
                             <w:sz w:val="20"/>
                             <w:szCs w:val="20"/>
                           </w:rPr>
-                          <w:t>FrmStopwatch. Make sure to include the class declaration in the image.</w:t>
+                          <w:t>FrmStopwatch</w:t>
+                        </w:r>
+                        <w:proofErr w:type="spellEnd"/>
+                        <w:r>
+                          <w:rPr>
+                            <w:sz w:val="20"/>
+                            <w:szCs w:val="20"/>
+                          </w:rPr>
+                          <w:t>. Make sure to include the class declaration in the image.</w:t>
                         </w:r>
                       </w:p>
                       <w:p>
@@ -4979,8 +5816,41 @@
                             <w:sz w:val="20"/>
                             <w:szCs w:val="20"/>
                           </w:rPr>
-                          <w:t xml:space="preserve">the BtnStartClickEH, BtnStopClickEH, </w:t>
+                          <w:t xml:space="preserve">the </w:t>
                         </w:r>
+                        <w:proofErr w:type="spellStart"/>
+                        <w:r>
+                          <w:rPr>
+                            <w:sz w:val="20"/>
+                            <w:szCs w:val="20"/>
+                          </w:rPr>
+                          <w:t>BtnStartClickEH</w:t>
+                        </w:r>
+                        <w:proofErr w:type="spellEnd"/>
+                        <w:r>
+                          <w:rPr>
+                            <w:sz w:val="20"/>
+                            <w:szCs w:val="20"/>
+                          </w:rPr>
+                          <w:t xml:space="preserve">, </w:t>
+                        </w:r>
+                        <w:proofErr w:type="spellStart"/>
+                        <w:r>
+                          <w:rPr>
+                            <w:sz w:val="20"/>
+                            <w:szCs w:val="20"/>
+                          </w:rPr>
+                          <w:t>BtnStopClickEH</w:t>
+                        </w:r>
+                        <w:proofErr w:type="spellEnd"/>
+                        <w:r>
+                          <w:rPr>
+                            <w:sz w:val="20"/>
+                            <w:szCs w:val="20"/>
+                          </w:rPr>
+                          <w:t xml:space="preserve">, </w:t>
+                        </w:r>
+                        <w:proofErr w:type="spellStart"/>
                         <w:r>
                           <w:rPr>
                             <w:sz w:val="20"/>
@@ -4988,6 +5858,7 @@
                           </w:rPr>
                           <w:t>TmrStopwatchTickEH</w:t>
                         </w:r>
+                        <w:proofErr w:type="spellEnd"/>
                         <w:r>
                           <w:rPr>
                             <w:sz w:val="20"/>
@@ -4995,12 +5866,21 @@
                           </w:rPr>
                           <w:t xml:space="preserve">, and </w:t>
                         </w:r>
+                        <w:proofErr w:type="spellStart"/>
                         <w:r>
                           <w:rPr>
                             <w:sz w:val="20"/>
                             <w:szCs w:val="20"/>
                           </w:rPr>
-                          <w:t xml:space="preserve">BtnResetClickEH </w:t>
+                          <w:t>BtnResetClickEH</w:t>
+                        </w:r>
+                        <w:proofErr w:type="spellEnd"/>
+                        <w:r>
+                          <w:rPr>
+                            <w:sz w:val="20"/>
+                            <w:szCs w:val="20"/>
+                          </w:rPr>
+                          <w:t xml:space="preserve"> </w:t>
                         </w:r>
                         <w:r>
                           <w:rPr>
@@ -5035,7 +5915,23 @@
                             <w:sz w:val="20"/>
                             <w:szCs w:val="20"/>
                           </w:rPr>
-                          <w:t>Take a screen shot of the UML for the FrmStopwatch class.</w:t>
+                          <w:t xml:space="preserve">Take a screen shot of the UML for the </w:t>
+                        </w:r>
+                        <w:proofErr w:type="spellStart"/>
+                        <w:r>
+                          <w:rPr>
+                            <w:sz w:val="20"/>
+                            <w:szCs w:val="20"/>
+                          </w:rPr>
+                          <w:t>FrmStopwatch</w:t>
+                        </w:r>
+                        <w:proofErr w:type="spellEnd"/>
+                        <w:r>
+                          <w:rPr>
+                            <w:sz w:val="20"/>
+                            <w:szCs w:val="20"/>
+                          </w:rPr>
+                          <w:t xml:space="preserve"> class.</w:t>
                         </w:r>
                       </w:p>
                       <w:p>
@@ -6593,12 +7489,21 @@
                                 </w:rPr>
                                 <w:t xml:space="preserve">Take a screenshot of the </w:t>
                               </w:r>
+                              <w:proofErr w:type="spellStart"/>
                               <w:r>
                                 <w:rPr>
                                   <w:sz w:val="20"/>
                                   <w:szCs w:val="20"/>
                                 </w:rPr>
-                                <w:t xml:space="preserve">BtnTargetClickEH </w:t>
+                                <w:t>BtnTargetClickEH</w:t>
+                              </w:r>
+                              <w:proofErr w:type="spellEnd"/>
+                              <w:r>
+                                <w:rPr>
+                                  <w:sz w:val="20"/>
+                                  <w:szCs w:val="20"/>
+                                </w:rPr>
+                                <w:t xml:space="preserve"> </w:t>
                               </w:r>
                               <w:r>
                                 <w:rPr>
@@ -6607,12 +7512,21 @@
                                 </w:rPr>
                                 <w:t xml:space="preserve">and </w:t>
                               </w:r>
+                              <w:proofErr w:type="spellStart"/>
                               <w:r>
                                 <w:rPr>
                                   <w:sz w:val="20"/>
                                   <w:szCs w:val="20"/>
                                 </w:rPr>
-                                <w:t xml:space="preserve">TmrStopwatchTickEH </w:t>
+                                <w:t>TmrStopwatchTickEH</w:t>
+                              </w:r>
+                              <w:proofErr w:type="spellEnd"/>
+                              <w:r>
+                                <w:rPr>
+                                  <w:sz w:val="20"/>
+                                  <w:szCs w:val="20"/>
+                                </w:rPr>
+                                <w:t xml:space="preserve"> </w:t>
                               </w:r>
                               <w:r>
                                 <w:rPr>
@@ -6640,7 +7554,23 @@
                                   <w:sz w:val="20"/>
                                   <w:szCs w:val="20"/>
                                 </w:rPr>
-                                <w:t>Take a screenshot of the UML for the FrmStopwatch class.</w:t>
+                                <w:t xml:space="preserve">Take a screenshot of the UML for the </w:t>
+                              </w:r>
+                              <w:proofErr w:type="spellStart"/>
+                              <w:r>
+                                <w:rPr>
+                                  <w:sz w:val="20"/>
+                                  <w:szCs w:val="20"/>
+                                </w:rPr>
+                                <w:t>FrmStopwatch</w:t>
+                              </w:r>
+                              <w:proofErr w:type="spellEnd"/>
+                              <w:r>
+                                <w:rPr>
+                                  <w:sz w:val="20"/>
+                                  <w:szCs w:val="20"/>
+                                </w:rPr>
+                                <w:t xml:space="preserve"> class.</w:t>
                               </w:r>
                             </w:p>
                             <w:p>
@@ -6799,12 +7729,21 @@
                           </w:rPr>
                           <w:t xml:space="preserve">Take a screenshot of the </w:t>
                         </w:r>
+                        <w:proofErr w:type="spellStart"/>
                         <w:r>
                           <w:rPr>
                             <w:sz w:val="20"/>
                             <w:szCs w:val="20"/>
                           </w:rPr>
-                          <w:t xml:space="preserve">BtnTargetClickEH </w:t>
+                          <w:t>BtnTargetClickEH</w:t>
+                        </w:r>
+                        <w:proofErr w:type="spellEnd"/>
+                        <w:r>
+                          <w:rPr>
+                            <w:sz w:val="20"/>
+                            <w:szCs w:val="20"/>
+                          </w:rPr>
+                          <w:t xml:space="preserve"> </w:t>
                         </w:r>
                         <w:r>
                           <w:rPr>
@@ -6813,12 +7752,21 @@
                           </w:rPr>
                           <w:t xml:space="preserve">and </w:t>
                         </w:r>
+                        <w:proofErr w:type="spellStart"/>
                         <w:r>
                           <w:rPr>
                             <w:sz w:val="20"/>
                             <w:szCs w:val="20"/>
                           </w:rPr>
-                          <w:t xml:space="preserve">TmrStopwatchTickEH </w:t>
+                          <w:t>TmrStopwatchTickEH</w:t>
+                        </w:r>
+                        <w:proofErr w:type="spellEnd"/>
+                        <w:r>
+                          <w:rPr>
+                            <w:sz w:val="20"/>
+                            <w:szCs w:val="20"/>
+                          </w:rPr>
+                          <w:t xml:space="preserve"> </w:t>
                         </w:r>
                         <w:r>
                           <w:rPr>
@@ -6846,7 +7794,23 @@
                             <w:sz w:val="20"/>
                             <w:szCs w:val="20"/>
                           </w:rPr>
-                          <w:t>Take a screenshot of the UML for the FrmStopwatch class.</w:t>
+                          <w:t xml:space="preserve">Take a screenshot of the UML for the </w:t>
+                        </w:r>
+                        <w:proofErr w:type="spellStart"/>
+                        <w:r>
+                          <w:rPr>
+                            <w:sz w:val="20"/>
+                            <w:szCs w:val="20"/>
+                          </w:rPr>
+                          <w:t>FrmStopwatch</w:t>
+                        </w:r>
+                        <w:proofErr w:type="spellEnd"/>
+                        <w:r>
+                          <w:rPr>
+                            <w:sz w:val="20"/>
+                            <w:szCs w:val="20"/>
+                          </w:rPr>
+                          <w:t xml:space="preserve"> class.</w:t>
                         </w:r>
                       </w:p>
                       <w:p>

</xml_diff>

<commit_message>
Add functionality to move the target as well as hide it when clicked by the user.
</commit_message>
<xml_diff>
--- a/Activity5/CST-250-RS-T5-Activity5Guide.docx
+++ b/Activity5/CST-250-RS-T5-Activity5Guide.docx
@@ -5765,25 +5765,35 @@
         <w:spacing w:before="120" w:after="480"/>
         <w:ind w:left="360" w:hanging="360"/>
         <w:contextualSpacing w:val="0"/>
-      </w:pPr>
-      <w:r>
-        <w:rPr>
-          <w:highlight w:val="yellow"/>
-        </w:rPr>
-        <w:t>Run</w:t>
-      </w:r>
-      <w:r>
-        <w:t xml:space="preserve"> the program and test the stopwatch.</w:t>
+        <w:rPr>
+          <w:highlight w:val="yellow"/>
+        </w:rPr>
+      </w:pPr>
+      <w:r>
+        <w:rPr>
+          <w:highlight w:val="yellow"/>
+        </w:rPr>
+        <w:t>Ru</w:t>
+      </w:r>
+      <w:r>
+        <w:rPr>
+          <w:highlight w:val="yellow"/>
+        </w:rPr>
+        <w:t>n the program and test the stopwatch.</w:t>
       </w:r>
     </w:p>
     <w:p>
       <w:pPr>
         <w:spacing w:before="120" w:after="480"/>
         <w:ind w:left="360"/>
+        <w:rPr>
+          <w:highlight w:val="yellow"/>
+        </w:rPr>
       </w:pPr>
       <w:r>
         <w:rPr>
           <w:noProof/>
+          <w:highlight w:val="yellow"/>
         </w:rPr>
         <mc:AlternateContent>
           <mc:Choice Requires="wpg">
@@ -5865,12 +5875,14 @@
                                 <w:rPr>
                                   <w:sz w:val="20"/>
                                   <w:szCs w:val="20"/>
+                                  <w:highlight w:val="yellow"/>
                                 </w:rPr>
                               </w:pPr>
                               <w:r>
                                 <w:rPr>
                                   <w:sz w:val="20"/>
                                   <w:szCs w:val="20"/>
+                                  <w:highlight w:val="yellow"/>
                                 </w:rPr>
                                 <w:t>Take a screenshot of the application</w:t>
                               </w:r>
@@ -5878,6 +5890,7 @@
                                 <w:rPr>
                                   <w:sz w:val="20"/>
                                   <w:szCs w:val="20"/>
+                                  <w:highlight w:val="yellow"/>
                                 </w:rPr>
                                 <w:t xml:space="preserve"> running</w:t>
                               </w:r>
@@ -5885,6 +5898,7 @@
                                 <w:rPr>
                                   <w:sz w:val="20"/>
                                   <w:szCs w:val="20"/>
+                                  <w:highlight w:val="yellow"/>
                                 </w:rPr>
                                 <w:t xml:space="preserve"> at this point</w:t>
                               </w:r>
@@ -5892,6 +5906,7 @@
                                 <w:rPr>
                                   <w:sz w:val="20"/>
                                   <w:szCs w:val="20"/>
+                                  <w:highlight w:val="yellow"/>
                                 </w:rPr>
                                 <w:t>.</w:t>
                               </w:r>
@@ -5907,12 +5922,14 @@
                                 <w:rPr>
                                   <w:sz w:val="20"/>
                                   <w:szCs w:val="20"/>
+                                  <w:highlight w:val="yellow"/>
                                 </w:rPr>
                               </w:pPr>
                               <w:r>
                                 <w:rPr>
                                   <w:sz w:val="20"/>
                                   <w:szCs w:val="20"/>
+                                  <w:highlight w:val="yellow"/>
                                 </w:rPr>
                                 <w:t xml:space="preserve">Take a screenshot of the </w:t>
                               </w:r>
@@ -5920,6 +5937,7 @@
                                 <w:rPr>
                                   <w:sz w:val="20"/>
                                   <w:szCs w:val="20"/>
+                                  <w:highlight w:val="yellow"/>
                                 </w:rPr>
                                 <w:t>citation</w:t>
                               </w:r>
@@ -5927,6 +5945,7 @@
                                 <w:rPr>
                                   <w:sz w:val="20"/>
                                   <w:szCs w:val="20"/>
+                                  <w:highlight w:val="yellow"/>
                                 </w:rPr>
                                 <w:t xml:space="preserve"> for </w:t>
                               </w:r>
@@ -5935,6 +5954,7 @@
                                 <w:rPr>
                                   <w:sz w:val="20"/>
                                   <w:szCs w:val="20"/>
+                                  <w:highlight w:val="yellow"/>
                                 </w:rPr>
                                 <w:t>FrmStopwatch</w:t>
                               </w:r>
@@ -5943,6 +5963,7 @@
                                 <w:rPr>
                                   <w:sz w:val="20"/>
                                   <w:szCs w:val="20"/>
+                                  <w:highlight w:val="yellow"/>
                                 </w:rPr>
                                 <w:t>. Make sure to include the class declaration in the image.</w:t>
                               </w:r>
@@ -5958,12 +5979,14 @@
                                 <w:rPr>
                                   <w:sz w:val="20"/>
                                   <w:szCs w:val="20"/>
+                                  <w:highlight w:val="yellow"/>
                                 </w:rPr>
                               </w:pPr>
                               <w:r>
                                 <w:rPr>
                                   <w:sz w:val="20"/>
                                   <w:szCs w:val="20"/>
+                                  <w:highlight w:val="yellow"/>
                                 </w:rPr>
                                 <w:t xml:space="preserve">Take a screenshot of </w:t>
                               </w:r>
@@ -5971,6 +5994,7 @@
                                 <w:rPr>
                                   <w:sz w:val="20"/>
                                   <w:szCs w:val="20"/>
+                                  <w:highlight w:val="yellow"/>
                                 </w:rPr>
                                 <w:t xml:space="preserve">the </w:t>
                               </w:r>
@@ -5979,6 +6003,7 @@
                                 <w:rPr>
                                   <w:sz w:val="20"/>
                                   <w:szCs w:val="20"/>
+                                  <w:highlight w:val="yellow"/>
                                 </w:rPr>
                                 <w:t>BtnStartClickEH</w:t>
                               </w:r>
@@ -5987,6 +6012,7 @@
                                 <w:rPr>
                                   <w:sz w:val="20"/>
                                   <w:szCs w:val="20"/>
+                                  <w:highlight w:val="yellow"/>
                                 </w:rPr>
                                 <w:t xml:space="preserve">, </w:t>
                               </w:r>
@@ -5995,6 +6021,7 @@
                                 <w:rPr>
                                   <w:sz w:val="20"/>
                                   <w:szCs w:val="20"/>
+                                  <w:highlight w:val="yellow"/>
                                 </w:rPr>
                                 <w:t>BtnStopClickEH</w:t>
                               </w:r>
@@ -6003,6 +6030,7 @@
                                 <w:rPr>
                                   <w:sz w:val="20"/>
                                   <w:szCs w:val="20"/>
+                                  <w:highlight w:val="yellow"/>
                                 </w:rPr>
                                 <w:t xml:space="preserve">, </w:t>
                               </w:r>
@@ -6011,6 +6039,7 @@
                                 <w:rPr>
                                   <w:sz w:val="20"/>
                                   <w:szCs w:val="20"/>
+                                  <w:highlight w:val="yellow"/>
                                 </w:rPr>
                                 <w:t>TmrStopwatchTickEH</w:t>
                               </w:r>
@@ -6019,6 +6048,7 @@
                                 <w:rPr>
                                   <w:sz w:val="20"/>
                                   <w:szCs w:val="20"/>
+                                  <w:highlight w:val="yellow"/>
                                 </w:rPr>
                                 <w:t xml:space="preserve">, and </w:t>
                               </w:r>
@@ -6027,6 +6057,7 @@
                                 <w:rPr>
                                   <w:sz w:val="20"/>
                                   <w:szCs w:val="20"/>
+                                  <w:highlight w:val="yellow"/>
                                 </w:rPr>
                                 <w:t>BtnResetClickEH</w:t>
                               </w:r>
@@ -6035,6 +6066,7 @@
                                 <w:rPr>
                                   <w:sz w:val="20"/>
                                   <w:szCs w:val="20"/>
+                                  <w:highlight w:val="yellow"/>
                                 </w:rPr>
                                 <w:t xml:space="preserve"> </w:t>
                               </w:r>
@@ -6042,6 +6074,7 @@
                                 <w:rPr>
                                   <w:sz w:val="20"/>
                                   <w:szCs w:val="20"/>
+                                  <w:highlight w:val="yellow"/>
                                 </w:rPr>
                                 <w:t>methods</w:t>
                               </w:r>
@@ -6049,6 +6082,7 @@
                                 <w:rPr>
                                   <w:sz w:val="20"/>
                                   <w:szCs w:val="20"/>
+                                  <w:highlight w:val="yellow"/>
                                 </w:rPr>
                                 <w:t>.</w:t>
                               </w:r>
@@ -6064,12 +6098,14 @@
                                 <w:rPr>
                                   <w:sz w:val="20"/>
                                   <w:szCs w:val="20"/>
+                                  <w:highlight w:val="yellow"/>
                                 </w:rPr>
                               </w:pPr>
                               <w:r>
                                 <w:rPr>
                                   <w:sz w:val="20"/>
                                   <w:szCs w:val="20"/>
+                                  <w:highlight w:val="yellow"/>
                                 </w:rPr>
                                 <w:t xml:space="preserve">Take a screen shot of the UML for the </w:t>
                               </w:r>
@@ -6078,6 +6114,7 @@
                                 <w:rPr>
                                   <w:sz w:val="20"/>
                                   <w:szCs w:val="20"/>
+                                  <w:highlight w:val="yellow"/>
                                 </w:rPr>
                                 <w:t>FrmStopwatch</w:t>
                               </w:r>
@@ -6086,6 +6123,7 @@
                                 <w:rPr>
                                   <w:sz w:val="20"/>
                                   <w:szCs w:val="20"/>
+                                  <w:highlight w:val="yellow"/>
                                 </w:rPr>
                                 <w:t xml:space="preserve"> class.</w:t>
                               </w:r>
@@ -6101,12 +6139,14 @@
                                 <w:rPr>
                                   <w:sz w:val="20"/>
                                   <w:szCs w:val="20"/>
+                                  <w:highlight w:val="yellow"/>
                                 </w:rPr>
                               </w:pPr>
                               <w:r>
                                 <w:rPr>
                                   <w:sz w:val="20"/>
                                   <w:szCs w:val="20"/>
+                                  <w:highlight w:val="yellow"/>
                                 </w:rPr>
                                 <w:t>Paste the image</w:t>
                               </w:r>
@@ -6114,6 +6154,7 @@
                                 <w:rPr>
                                   <w:sz w:val="20"/>
                                   <w:szCs w:val="20"/>
+                                  <w:highlight w:val="yellow"/>
                                 </w:rPr>
                                 <w:t>s</w:t>
                               </w:r>
@@ -6121,6 +6162,7 @@
                                 <w:rPr>
                                   <w:sz w:val="20"/>
                                   <w:szCs w:val="20"/>
+                                  <w:highlight w:val="yellow"/>
                                 </w:rPr>
                                 <w:t xml:space="preserve"> into a Word document.</w:t>
                               </w:r>
@@ -6136,12 +6178,14 @@
                                 <w:rPr>
                                   <w:sz w:val="20"/>
                                   <w:szCs w:val="20"/>
+                                  <w:highlight w:val="yellow"/>
                                 </w:rPr>
                               </w:pPr>
                               <w:r>
                                 <w:rPr>
                                   <w:sz w:val="20"/>
                                   <w:szCs w:val="20"/>
+                                  <w:highlight w:val="yellow"/>
                                 </w:rPr>
                                 <w:t xml:space="preserve">Put a caption below </w:t>
                               </w:r>
@@ -6149,6 +6193,7 @@
                                 <w:rPr>
                                   <w:sz w:val="20"/>
                                   <w:szCs w:val="20"/>
+                                  <w:highlight w:val="yellow"/>
                                 </w:rPr>
                                 <w:t>each</w:t>
                               </w:r>
@@ -6156,6 +6201,7 @@
                                 <w:rPr>
                                   <w:sz w:val="20"/>
                                   <w:szCs w:val="20"/>
+                                  <w:highlight w:val="yellow"/>
                                 </w:rPr>
                                 <w:t xml:space="preserve"> image explaining what is being demonstrated.</w:t>
                               </w:r>
@@ -6195,12 +6241,14 @@
                           <w:rPr>
                             <w:sz w:val="20"/>
                             <w:szCs w:val="20"/>
+                            <w:highlight w:val="yellow"/>
                           </w:rPr>
                         </w:pPr>
                         <w:r>
                           <w:rPr>
                             <w:sz w:val="20"/>
                             <w:szCs w:val="20"/>
+                            <w:highlight w:val="yellow"/>
                           </w:rPr>
                           <w:t>Take a screenshot of the application</w:t>
                         </w:r>
@@ -6208,6 +6256,7 @@
                           <w:rPr>
                             <w:sz w:val="20"/>
                             <w:szCs w:val="20"/>
+                            <w:highlight w:val="yellow"/>
                           </w:rPr>
                           <w:t xml:space="preserve"> running</w:t>
                         </w:r>
@@ -6215,6 +6264,7 @@
                           <w:rPr>
                             <w:sz w:val="20"/>
                             <w:szCs w:val="20"/>
+                            <w:highlight w:val="yellow"/>
                           </w:rPr>
                           <w:t xml:space="preserve"> at this point</w:t>
                         </w:r>
@@ -6222,6 +6272,7 @@
                           <w:rPr>
                             <w:sz w:val="20"/>
                             <w:szCs w:val="20"/>
+                            <w:highlight w:val="yellow"/>
                           </w:rPr>
                           <w:t>.</w:t>
                         </w:r>
@@ -6237,12 +6288,14 @@
                           <w:rPr>
                             <w:sz w:val="20"/>
                             <w:szCs w:val="20"/>
+                            <w:highlight w:val="yellow"/>
                           </w:rPr>
                         </w:pPr>
                         <w:r>
                           <w:rPr>
                             <w:sz w:val="20"/>
                             <w:szCs w:val="20"/>
+                            <w:highlight w:val="yellow"/>
                           </w:rPr>
                           <w:t xml:space="preserve">Take a screenshot of the </w:t>
                         </w:r>
@@ -6250,6 +6303,7 @@
                           <w:rPr>
                             <w:sz w:val="20"/>
                             <w:szCs w:val="20"/>
+                            <w:highlight w:val="yellow"/>
                           </w:rPr>
                           <w:t>citation</w:t>
                         </w:r>
@@ -6257,6 +6311,7 @@
                           <w:rPr>
                             <w:sz w:val="20"/>
                             <w:szCs w:val="20"/>
+                            <w:highlight w:val="yellow"/>
                           </w:rPr>
                           <w:t xml:space="preserve"> for </w:t>
                         </w:r>
@@ -6265,6 +6320,7 @@
                           <w:rPr>
                             <w:sz w:val="20"/>
                             <w:szCs w:val="20"/>
+                            <w:highlight w:val="yellow"/>
                           </w:rPr>
                           <w:t>FrmStopwatch</w:t>
                         </w:r>
@@ -6273,6 +6329,7 @@
                           <w:rPr>
                             <w:sz w:val="20"/>
                             <w:szCs w:val="20"/>
+                            <w:highlight w:val="yellow"/>
                           </w:rPr>
                           <w:t>. Make sure to include the class declaration in the image.</w:t>
                         </w:r>
@@ -6288,12 +6345,14 @@
                           <w:rPr>
                             <w:sz w:val="20"/>
                             <w:szCs w:val="20"/>
+                            <w:highlight w:val="yellow"/>
                           </w:rPr>
                         </w:pPr>
                         <w:r>
                           <w:rPr>
                             <w:sz w:val="20"/>
                             <w:szCs w:val="20"/>
+                            <w:highlight w:val="yellow"/>
                           </w:rPr>
                           <w:t xml:space="preserve">Take a screenshot of </w:t>
                         </w:r>
@@ -6301,6 +6360,7 @@
                           <w:rPr>
                             <w:sz w:val="20"/>
                             <w:szCs w:val="20"/>
+                            <w:highlight w:val="yellow"/>
                           </w:rPr>
                           <w:t xml:space="preserve">the </w:t>
                         </w:r>
@@ -6309,6 +6369,7 @@
                           <w:rPr>
                             <w:sz w:val="20"/>
                             <w:szCs w:val="20"/>
+                            <w:highlight w:val="yellow"/>
                           </w:rPr>
                           <w:t>BtnStartClickEH</w:t>
                         </w:r>
@@ -6317,6 +6378,7 @@
                           <w:rPr>
                             <w:sz w:val="20"/>
                             <w:szCs w:val="20"/>
+                            <w:highlight w:val="yellow"/>
                           </w:rPr>
                           <w:t xml:space="preserve">, </w:t>
                         </w:r>
@@ -6325,6 +6387,7 @@
                           <w:rPr>
                             <w:sz w:val="20"/>
                             <w:szCs w:val="20"/>
+                            <w:highlight w:val="yellow"/>
                           </w:rPr>
                           <w:t>BtnStopClickEH</w:t>
                         </w:r>
@@ -6333,6 +6396,7 @@
                           <w:rPr>
                             <w:sz w:val="20"/>
                             <w:szCs w:val="20"/>
+                            <w:highlight w:val="yellow"/>
                           </w:rPr>
                           <w:t xml:space="preserve">, </w:t>
                         </w:r>
@@ -6341,6 +6405,7 @@
                           <w:rPr>
                             <w:sz w:val="20"/>
                             <w:szCs w:val="20"/>
+                            <w:highlight w:val="yellow"/>
                           </w:rPr>
                           <w:t>TmrStopwatchTickEH</w:t>
                         </w:r>
@@ -6349,6 +6414,7 @@
                           <w:rPr>
                             <w:sz w:val="20"/>
                             <w:szCs w:val="20"/>
+                            <w:highlight w:val="yellow"/>
                           </w:rPr>
                           <w:t xml:space="preserve">, and </w:t>
                         </w:r>
@@ -6357,6 +6423,7 @@
                           <w:rPr>
                             <w:sz w:val="20"/>
                             <w:szCs w:val="20"/>
+                            <w:highlight w:val="yellow"/>
                           </w:rPr>
                           <w:t>BtnResetClickEH</w:t>
                         </w:r>
@@ -6365,6 +6432,7 @@
                           <w:rPr>
                             <w:sz w:val="20"/>
                             <w:szCs w:val="20"/>
+                            <w:highlight w:val="yellow"/>
                           </w:rPr>
                           <w:t xml:space="preserve"> </w:t>
                         </w:r>
@@ -6372,6 +6440,7 @@
                           <w:rPr>
                             <w:sz w:val="20"/>
                             <w:szCs w:val="20"/>
+                            <w:highlight w:val="yellow"/>
                           </w:rPr>
                           <w:t>methods</w:t>
                         </w:r>
@@ -6379,6 +6448,7 @@
                           <w:rPr>
                             <w:sz w:val="20"/>
                             <w:szCs w:val="20"/>
+                            <w:highlight w:val="yellow"/>
                           </w:rPr>
                           <w:t>.</w:t>
                         </w:r>
@@ -6394,12 +6464,14 @@
                           <w:rPr>
                             <w:sz w:val="20"/>
                             <w:szCs w:val="20"/>
+                            <w:highlight w:val="yellow"/>
                           </w:rPr>
                         </w:pPr>
                         <w:r>
                           <w:rPr>
                             <w:sz w:val="20"/>
                             <w:szCs w:val="20"/>
+                            <w:highlight w:val="yellow"/>
                           </w:rPr>
                           <w:t xml:space="preserve">Take a screen shot of the UML for the </w:t>
                         </w:r>
@@ -6408,6 +6480,7 @@
                           <w:rPr>
                             <w:sz w:val="20"/>
                             <w:szCs w:val="20"/>
+                            <w:highlight w:val="yellow"/>
                           </w:rPr>
                           <w:t>FrmStopwatch</w:t>
                         </w:r>
@@ -6416,6 +6489,7 @@
                           <w:rPr>
                             <w:sz w:val="20"/>
                             <w:szCs w:val="20"/>
+                            <w:highlight w:val="yellow"/>
                           </w:rPr>
                           <w:t xml:space="preserve"> class.</w:t>
                         </w:r>
@@ -6431,12 +6505,14 @@
                           <w:rPr>
                             <w:sz w:val="20"/>
                             <w:szCs w:val="20"/>
+                            <w:highlight w:val="yellow"/>
                           </w:rPr>
                         </w:pPr>
                         <w:r>
                           <w:rPr>
                             <w:sz w:val="20"/>
                             <w:szCs w:val="20"/>
+                            <w:highlight w:val="yellow"/>
                           </w:rPr>
                           <w:t>Paste the image</w:t>
                         </w:r>
@@ -6444,6 +6520,7 @@
                           <w:rPr>
                             <w:sz w:val="20"/>
                             <w:szCs w:val="20"/>
+                            <w:highlight w:val="yellow"/>
                           </w:rPr>
                           <w:t>s</w:t>
                         </w:r>
@@ -6451,6 +6528,7 @@
                           <w:rPr>
                             <w:sz w:val="20"/>
                             <w:szCs w:val="20"/>
+                            <w:highlight w:val="yellow"/>
                           </w:rPr>
                           <w:t xml:space="preserve"> into a Word document.</w:t>
                         </w:r>
@@ -6466,12 +6544,14 @@
                           <w:rPr>
                             <w:sz w:val="20"/>
                             <w:szCs w:val="20"/>
+                            <w:highlight w:val="yellow"/>
                           </w:rPr>
                         </w:pPr>
                         <w:r>
                           <w:rPr>
                             <w:sz w:val="20"/>
                             <w:szCs w:val="20"/>
+                            <w:highlight w:val="yellow"/>
                           </w:rPr>
                           <w:t xml:space="preserve">Put a caption below </w:t>
                         </w:r>
@@ -6479,6 +6559,7 @@
                           <w:rPr>
                             <w:sz w:val="20"/>
                             <w:szCs w:val="20"/>
+                            <w:highlight w:val="yellow"/>
                           </w:rPr>
                           <w:t>each</w:t>
                         </w:r>
@@ -6486,6 +6567,7 @@
                           <w:rPr>
                             <w:sz w:val="20"/>
                             <w:szCs w:val="20"/>
+                            <w:highlight w:val="yellow"/>
                           </w:rPr>
                           <w:t xml:space="preserve"> image explaining what is being demonstrated.</w:t>
                         </w:r>
@@ -6510,9 +6592,13 @@
           <w:color w:val="345A8A" w:themeColor="accent1" w:themeShade="B5"/>
           <w:sz w:val="32"/>
           <w:szCs w:val="32"/>
-        </w:rPr>
-      </w:pPr>
-      <w:r>
+          <w:highlight w:val="yellow"/>
+        </w:rPr>
+      </w:pPr>
+      <w:r>
+        <w:rPr>
+          <w:highlight w:val="yellow"/>
+        </w:rPr>
         <w:br w:type="page"/>
       </w:r>
     </w:p>
@@ -6522,12 +6608,14 @@
         <w:spacing w:before="120" w:after="480"/>
         <w:rPr>
           <w:rFonts w:asciiTheme="minorHAnsi" w:hAnsiTheme="minorHAnsi"/>
+          <w:highlight w:val="yellow"/>
         </w:rPr>
       </w:pPr>
       <w:bookmarkStart w:id="20" w:name="_Toc203031036"/>
       <w:r>
         <w:rPr>
           <w:rFonts w:asciiTheme="minorHAnsi" w:hAnsiTheme="minorHAnsi"/>
+          <w:highlight w:val="yellow"/>
         </w:rPr>
         <w:lastRenderedPageBreak/>
         <w:t xml:space="preserve">Part 2 – Create a </w:t>
@@ -6535,54 +6623,63 @@
       <w:r>
         <w:rPr>
           <w:rFonts w:asciiTheme="minorHAnsi" w:hAnsiTheme="minorHAnsi"/>
+          <w:highlight w:val="yellow"/>
         </w:rPr>
         <w:t>"</w:t>
       </w:r>
       <w:r>
         <w:rPr>
           <w:rFonts w:asciiTheme="minorHAnsi" w:hAnsiTheme="minorHAnsi"/>
+          <w:highlight w:val="yellow"/>
         </w:rPr>
         <w:t>Whack</w:t>
       </w:r>
       <w:r>
         <w:rPr>
           <w:rFonts w:asciiTheme="minorHAnsi" w:hAnsiTheme="minorHAnsi"/>
+          <w:highlight w:val="yellow"/>
         </w:rPr>
         <w:t>-</w:t>
       </w:r>
       <w:r>
         <w:rPr>
           <w:rFonts w:asciiTheme="minorHAnsi" w:hAnsiTheme="minorHAnsi"/>
+          <w:highlight w:val="yellow"/>
         </w:rPr>
         <w:t>a</w:t>
       </w:r>
       <w:r>
         <w:rPr>
           <w:rFonts w:asciiTheme="minorHAnsi" w:hAnsiTheme="minorHAnsi"/>
+          <w:highlight w:val="yellow"/>
         </w:rPr>
         <w:t>-</w:t>
       </w:r>
       <w:r>
         <w:rPr>
           <w:rFonts w:asciiTheme="minorHAnsi" w:hAnsiTheme="minorHAnsi"/>
+          <w:highlight w:val="yellow"/>
         </w:rPr>
         <w:t>Mole</w:t>
       </w:r>
       <w:r>
         <w:rPr>
           <w:rFonts w:asciiTheme="minorHAnsi" w:hAnsiTheme="minorHAnsi"/>
+          <w:highlight w:val="yellow"/>
         </w:rPr>
         <w:t>"</w:t>
       </w:r>
       <w:r>
         <w:rPr>
           <w:rFonts w:asciiTheme="minorHAnsi" w:hAnsiTheme="minorHAnsi"/>
+          <w:highlight w:val="yellow"/>
         </w:rPr>
         <w:t xml:space="preserve"> </w:t>
       </w:r>
       <w:r>
         <w:rPr>
           <w:rFonts w:asciiTheme="minorHAnsi" w:hAnsiTheme="minorHAnsi"/>
+          <w:highlight w:val="yellow"/>
         </w:rPr>
         <w:t>Game</w:t>
       </w:r>
@@ -6591,32 +6688,56 @@
     <w:p>
       <w:pPr>
         <w:spacing w:before="120" w:after="480"/>
-      </w:pPr>
-      <w:r>
+        <w:rPr>
+          <w:highlight w:val="yellow"/>
+        </w:rPr>
+      </w:pPr>
+      <w:r>
+        <w:rPr>
+          <w:highlight w:val="yellow"/>
+        </w:rPr>
         <w:t>Next, we will extend the game to create a version of Wha</w:t>
       </w:r>
       <w:r>
+        <w:rPr>
+          <w:highlight w:val="yellow"/>
+        </w:rPr>
         <w:t>ck</w:t>
       </w:r>
       <w:r>
+        <w:rPr>
+          <w:highlight w:val="yellow"/>
+        </w:rPr>
         <w:t>-A-M</w:t>
       </w:r>
       <w:r>
+        <w:rPr>
+          <w:highlight w:val="yellow"/>
+        </w:rPr>
         <w:t xml:space="preserve">ole, a game </w:t>
       </w:r>
       <w:r>
-        <w:t>in which</w:t>
-      </w:r>
-      <w:r>
-        <w:t xml:space="preserve"> </w:t>
-      </w:r>
-      <w:r>
+        <w:rPr>
+          <w:highlight w:val="yellow"/>
+        </w:rPr>
+        <w:t xml:space="preserve">in which </w:t>
+      </w:r>
+      <w:r>
+        <w:rPr>
+          <w:highlight w:val="yellow"/>
+        </w:rPr>
         <w:t>the user clicks on randomly moving objects</w:t>
       </w:r>
       <w:r>
+        <w:rPr>
+          <w:highlight w:val="yellow"/>
+        </w:rPr>
         <w:t xml:space="preserve"> to score points</w:t>
       </w:r>
       <w:r>
+        <w:rPr>
+          <w:highlight w:val="yellow"/>
+        </w:rPr>
         <w:t>.</w:t>
       </w:r>
     </w:p>
@@ -6630,20 +6751,38 @@
         <w:spacing w:before="120" w:after="480"/>
         <w:ind w:left="360"/>
         <w:contextualSpacing w:val="0"/>
-      </w:pPr>
-      <w:r>
+        <w:rPr>
+          <w:highlight w:val="yellow"/>
+        </w:rPr>
+      </w:pPr>
+      <w:r>
+        <w:rPr>
+          <w:highlight w:val="yellow"/>
+        </w:rPr>
         <w:t>Reset the stopwatch form and move the buttons and label to the edges of the form</w:t>
       </w:r>
       <w:r>
+        <w:rPr>
+          <w:highlight w:val="yellow"/>
+        </w:rPr>
         <w:t>,</w:t>
       </w:r>
       <w:r>
+        <w:rPr>
+          <w:highlight w:val="yellow"/>
+        </w:rPr>
         <w:t xml:space="preserve"> as shown in </w:t>
       </w:r>
       <w:r>
+        <w:rPr>
+          <w:highlight w:val="yellow"/>
+        </w:rPr>
         <w:t>Figure 18</w:t>
       </w:r>
       <w:r>
+        <w:rPr>
+          <w:highlight w:val="yellow"/>
+        </w:rPr>
         <w:t>.</w:t>
       </w:r>
     </w:p>
@@ -6651,10 +6790,14 @@
       <w:pPr>
         <w:keepNext/>
         <w:spacing w:before="120" w:after="120"/>
+        <w:rPr>
+          <w:highlight w:val="yellow"/>
+        </w:rPr>
       </w:pPr>
       <w:r>
         <w:rPr>
           <w:noProof/>
+          <w:highlight w:val="yellow"/>
         </w:rPr>
         <w:drawing>
           <wp:inline distT="0" distB="0" distL="0" distR="0" wp14:anchorId="6CE0DC93" wp14:editId="37CAD871">
@@ -6697,31 +6840,75 @@
       <w:pPr>
         <w:pStyle w:val="Caption"/>
         <w:spacing w:after="480"/>
+        <w:rPr>
+          <w:highlight w:val="yellow"/>
+        </w:rPr>
       </w:pPr>
       <w:bookmarkStart w:id="21" w:name="_Ref192028327"/>
       <w:r>
+        <w:rPr>
+          <w:highlight w:val="yellow"/>
+        </w:rPr>
         <w:t xml:space="preserve">Figure </w:t>
       </w:r>
-      <w:fldSimple w:instr=" SEQ Figure \* ARABIC ">
-        <w:r>
-          <w:rPr>
-            <w:noProof/>
-          </w:rPr>
-          <w:t>18</w:t>
-        </w:r>
-      </w:fldSimple>
+      <w:r>
+        <w:rPr>
+          <w:highlight w:val="yellow"/>
+        </w:rPr>
+        <w:fldChar w:fldCharType="begin"/>
+      </w:r>
+      <w:r>
+        <w:rPr>
+          <w:highlight w:val="yellow"/>
+        </w:rPr>
+        <w:instrText xml:space="preserve"> SEQ Figure \* ARABIC </w:instrText>
+      </w:r>
+      <w:r>
+        <w:rPr>
+          <w:highlight w:val="yellow"/>
+        </w:rPr>
+        <w:fldChar w:fldCharType="separate"/>
+      </w:r>
+      <w:r>
+        <w:rPr>
+          <w:noProof/>
+          <w:highlight w:val="yellow"/>
+        </w:rPr>
+        <w:t>18</w:t>
+      </w:r>
+      <w:r>
+        <w:rPr>
+          <w:noProof/>
+          <w:highlight w:val="yellow"/>
+        </w:rPr>
+        <w:fldChar w:fldCharType="end"/>
+      </w:r>
       <w:bookmarkEnd w:id="21"/>
       <w:r>
+        <w:rPr>
+          <w:highlight w:val="yellow"/>
+        </w:rPr>
         <w:t xml:space="preserve">: Reconfiguring </w:t>
       </w:r>
       <w:proofErr w:type="spellStart"/>
       <w:r>
+        <w:rPr>
+          <w:highlight w:val="yellow"/>
+        </w:rPr>
         <w:t>FrmStopwatch</w:t>
       </w:r>
       <w:proofErr w:type="spellEnd"/>
     </w:p>
     <w:p>
-      <w:r>
+      <w:pPr>
+        <w:rPr>
+          <w:highlight w:val="yellow"/>
+        </w:rPr>
+      </w:pPr>
+      <w:r>
+        <w:rPr>
+          <w:highlight w:val="yellow"/>
+        </w:rPr>
         <w:br w:type="page"/>
       </w:r>
     </w:p>
@@ -6735,47 +6922,83 @@
         <w:spacing w:before="120" w:after="480"/>
         <w:ind w:left="360"/>
         <w:contextualSpacing w:val="0"/>
-      </w:pPr>
-      <w:r>
+        <w:rPr>
+          <w:highlight w:val="yellow"/>
+        </w:rPr>
+      </w:pPr>
+      <w:r>
+        <w:rPr>
+          <w:highlight w:val="yellow"/>
+        </w:rPr>
         <w:lastRenderedPageBreak/>
         <w:t xml:space="preserve">Add a new button named </w:t>
       </w:r>
       <w:proofErr w:type="spellStart"/>
       <w:r>
+        <w:rPr>
+          <w:highlight w:val="yellow"/>
+        </w:rPr>
         <w:t>btnTarget</w:t>
       </w:r>
       <w:proofErr w:type="spellEnd"/>
       <w:r>
+        <w:rPr>
+          <w:highlight w:val="yellow"/>
+        </w:rPr>
         <w:t xml:space="preserve"> to the form. Update the text for the button to say </w:t>
       </w:r>
       <w:r>
+        <w:rPr>
+          <w:highlight w:val="yellow"/>
+        </w:rPr>
         <w:t>"</w:t>
       </w:r>
       <w:r>
+        <w:rPr>
+          <w:highlight w:val="yellow"/>
+        </w:rPr>
         <w:t>Target</w:t>
       </w:r>
       <w:r>
-        <w:t>"</w:t>
-      </w:r>
-      <w:r>
-        <w:t xml:space="preserve"> </w:t>
-      </w:r>
-      <w:r>
+        <w:rPr>
+          <w:highlight w:val="yellow"/>
+        </w:rPr>
+        <w:t xml:space="preserve">" </w:t>
+      </w:r>
+      <w:r>
+        <w:rPr>
+          <w:highlight w:val="yellow"/>
+        </w:rPr>
         <w:t>and resize the button</w:t>
       </w:r>
       <w:r>
+        <w:rPr>
+          <w:highlight w:val="yellow"/>
+        </w:rPr>
         <w:t>,</w:t>
       </w:r>
       <w:r>
+        <w:rPr>
+          <w:highlight w:val="yellow"/>
+        </w:rPr>
         <w:t xml:space="preserve"> as shown in</w:t>
       </w:r>
       <w:r>
+        <w:rPr>
+          <w:highlight w:val="yellow"/>
+        </w:rPr>
         <w:t xml:space="preserve"> Figure 19</w:t>
       </w:r>
       <w:r>
+        <w:rPr>
+          <w:highlight w:val="yellow"/>
+        </w:rPr>
         <w:t>.</w:t>
       </w:r>
       <w:r>
+        <w:rPr>
+          <w:highlight w:val="yellow"/>
+        </w:rPr>
         <w:t xml:space="preserve"> This button will be the target for the user to click as our program is running.</w:t>
       </w:r>
     </w:p>
@@ -6783,10 +7006,14 @@
       <w:pPr>
         <w:keepNext/>
         <w:spacing w:before="120" w:after="120"/>
+        <w:rPr>
+          <w:highlight w:val="yellow"/>
+        </w:rPr>
       </w:pPr>
       <w:r>
         <w:rPr>
           <w:noProof/>
+          <w:highlight w:val="yellow"/>
         </w:rPr>
         <w:drawing>
           <wp:inline distT="0" distB="0" distL="0" distR="0" wp14:anchorId="641F8302" wp14:editId="7BDE3652">
@@ -6829,25 +7056,61 @@
       <w:pPr>
         <w:pStyle w:val="Caption"/>
         <w:spacing w:after="480"/>
+        <w:rPr>
+          <w:highlight w:val="yellow"/>
+        </w:rPr>
       </w:pPr>
       <w:bookmarkStart w:id="22" w:name="_Ref192028469"/>
       <w:r>
+        <w:rPr>
+          <w:highlight w:val="yellow"/>
+        </w:rPr>
         <w:t xml:space="preserve">Figure </w:t>
       </w:r>
-      <w:fldSimple w:instr=" SEQ Figure \* ARABIC ">
-        <w:r>
-          <w:rPr>
-            <w:noProof/>
-          </w:rPr>
-          <w:t>19</w:t>
-        </w:r>
-      </w:fldSimple>
+      <w:r>
+        <w:rPr>
+          <w:highlight w:val="yellow"/>
+        </w:rPr>
+        <w:fldChar w:fldCharType="begin"/>
+      </w:r>
+      <w:r>
+        <w:rPr>
+          <w:highlight w:val="yellow"/>
+        </w:rPr>
+        <w:instrText xml:space="preserve"> SEQ Figure \* ARABIC </w:instrText>
+      </w:r>
+      <w:r>
+        <w:rPr>
+          <w:highlight w:val="yellow"/>
+        </w:rPr>
+        <w:fldChar w:fldCharType="separate"/>
+      </w:r>
+      <w:r>
+        <w:rPr>
+          <w:noProof/>
+          <w:highlight w:val="yellow"/>
+        </w:rPr>
+        <w:t>19</w:t>
+      </w:r>
+      <w:r>
+        <w:rPr>
+          <w:noProof/>
+          <w:highlight w:val="yellow"/>
+        </w:rPr>
+        <w:fldChar w:fldCharType="end"/>
+      </w:r>
       <w:bookmarkEnd w:id="22"/>
       <w:r>
+        <w:rPr>
+          <w:highlight w:val="yellow"/>
+        </w:rPr>
         <w:t xml:space="preserve">: Adding a target button to </w:t>
       </w:r>
       <w:proofErr w:type="spellStart"/>
       <w:r>
+        <w:rPr>
+          <w:highlight w:val="yellow"/>
+        </w:rPr>
         <w:t>FrmStopwatch</w:t>
       </w:r>
       <w:proofErr w:type="spellEnd"/>
@@ -6855,10 +7118,14 @@
     <w:p>
       <w:pPr>
         <w:spacing w:before="120" w:after="480"/>
+        <w:rPr>
+          <w:highlight w:val="yellow"/>
+        </w:rPr>
       </w:pPr>
       <w:r>
         <w:rPr>
           <w:noProof/>
+          <w:highlight w:val="yellow"/>
         </w:rPr>
         <mc:AlternateContent>
           <mc:Choice Requires="wpg">
@@ -6971,12 +7238,14 @@
                                 <w:rPr>
                                   <w:sz w:val="20"/>
                                   <w:szCs w:val="20"/>
+                                  <w:highlight w:val="yellow"/>
                                 </w:rPr>
                               </w:pPr>
                               <w:r>
                                 <w:rPr>
                                   <w:sz w:val="22"/>
                                   <w:szCs w:val="22"/>
+                                  <w:highlight w:val="yellow"/>
                                 </w:rPr>
                                 <w:t>Commit all changes in the project to source control</w:t>
                               </w:r>
@@ -6984,6 +7253,7 @@
                                 <w:rPr>
                                   <w:sz w:val="22"/>
                                   <w:szCs w:val="22"/>
+                                  <w:highlight w:val="yellow"/>
                                 </w:rPr>
                                 <w:t>.</w:t>
                               </w:r>
@@ -7000,12 +7270,14 @@
                                 <w:rPr>
                                   <w:sz w:val="20"/>
                                   <w:szCs w:val="20"/>
+                                  <w:highlight w:val="yellow"/>
                                 </w:rPr>
                               </w:pPr>
                               <w:r>
                                 <w:rPr>
                                   <w:sz w:val="22"/>
                                   <w:szCs w:val="22"/>
+                                  <w:highlight w:val="yellow"/>
                                 </w:rPr>
                                 <w:t>Commit Message: Rearrange the UI to prepare for the Whack-A-Mole game</w:t>
                               </w:r>
@@ -7013,6 +7285,7 @@
                                 <w:rPr>
                                   <w:sz w:val="22"/>
                                   <w:szCs w:val="22"/>
+                                  <w:highlight w:val="yellow"/>
                                 </w:rPr>
                                 <w:t>.</w:t>
                               </w:r>
@@ -7050,12 +7323,14 @@
                           <w:rPr>
                             <w:sz w:val="20"/>
                             <w:szCs w:val="20"/>
+                            <w:highlight w:val="yellow"/>
                           </w:rPr>
                         </w:pPr>
                         <w:r>
                           <w:rPr>
                             <w:sz w:val="22"/>
                             <w:szCs w:val="22"/>
+                            <w:highlight w:val="yellow"/>
                           </w:rPr>
                           <w:t>Commit all changes in the project to source control</w:t>
                         </w:r>
@@ -7063,6 +7338,7 @@
                           <w:rPr>
                             <w:sz w:val="22"/>
                             <w:szCs w:val="22"/>
+                            <w:highlight w:val="yellow"/>
                           </w:rPr>
                           <w:t>.</w:t>
                         </w:r>
@@ -7079,12 +7355,14 @@
                           <w:rPr>
                             <w:sz w:val="20"/>
                             <w:szCs w:val="20"/>
+                            <w:highlight w:val="yellow"/>
                           </w:rPr>
                         </w:pPr>
                         <w:r>
                           <w:rPr>
                             <w:sz w:val="22"/>
                             <w:szCs w:val="22"/>
+                            <w:highlight w:val="yellow"/>
                           </w:rPr>
                           <w:t>Commit Message: Rearrange the UI to prepare for the Whack-A-Mole game</w:t>
                         </w:r>
@@ -7092,6 +7370,7 @@
                           <w:rPr>
                             <w:sz w:val="22"/>
                             <w:szCs w:val="22"/>
+                            <w:highlight w:val="yellow"/>
                           </w:rPr>
                           <w:t>.</w:t>
                         </w:r>
@@ -7119,7 +7398,13 @@
       </w:pPr>
       <w:bookmarkStart w:id="23" w:name="OLE_LINK26"/>
       <w:r>
-        <w:t xml:space="preserve">Add a click event handler to </w:t>
+        <w:rPr>
+          <w:highlight w:val="yellow"/>
+        </w:rPr>
+        <w:t>Add</w:t>
+      </w:r>
+      <w:r>
+        <w:t xml:space="preserve"> a click event handler to </w:t>
       </w:r>
       <w:proofErr w:type="spellStart"/>
       <w:r>

</xml_diff>

<commit_message>
Finished all code and debugging for the activity.
</commit_message>
<xml_diff>
--- a/Activity5/CST-250-RS-T5-Activity5Guide.docx
+++ b/Activity5/CST-250-RS-T5-Activity5Guide.docx
@@ -7395,43 +7395,73 @@
         <w:spacing w:before="120" w:after="480"/>
         <w:ind w:left="360"/>
         <w:contextualSpacing w:val="0"/>
+        <w:rPr>
+          <w:highlight w:val="yellow"/>
+        </w:rPr>
       </w:pPr>
       <w:bookmarkStart w:id="23" w:name="OLE_LINK26"/>
       <w:r>
         <w:rPr>
           <w:highlight w:val="yellow"/>
         </w:rPr>
-        <w:t>Add</w:t>
-      </w:r>
-      <w:r>
-        <w:t xml:space="preserve"> a click event handler to </w:t>
+        <w:t>Ad</w:t>
+      </w:r>
+      <w:r>
+        <w:rPr>
+          <w:highlight w:val="yellow"/>
+        </w:rPr>
+        <w:t xml:space="preserve">d a click event handler to </w:t>
       </w:r>
       <w:proofErr w:type="spellStart"/>
       <w:r>
+        <w:rPr>
+          <w:highlight w:val="yellow"/>
+        </w:rPr>
         <w:t>btnTarget</w:t>
       </w:r>
       <w:proofErr w:type="spellEnd"/>
       <w:r>
+        <w:rPr>
+          <w:highlight w:val="yellow"/>
+        </w:rPr>
         <w:t xml:space="preserve"> named </w:t>
       </w:r>
       <w:proofErr w:type="spellStart"/>
       <w:r>
+        <w:rPr>
+          <w:highlight w:val="yellow"/>
+        </w:rPr>
         <w:t>BtnTargetClickEH</w:t>
       </w:r>
       <w:proofErr w:type="spellEnd"/>
       <w:r>
+        <w:rPr>
+          <w:highlight w:val="yellow"/>
+        </w:rPr>
         <w:t>. Add a summary comment and logic to hide the button to the method</w:t>
       </w:r>
       <w:r>
+        <w:rPr>
+          <w:highlight w:val="yellow"/>
+        </w:rPr>
         <w:t>,</w:t>
       </w:r>
       <w:r>
+        <w:rPr>
+          <w:highlight w:val="yellow"/>
+        </w:rPr>
         <w:t xml:space="preserve"> as shown in</w:t>
       </w:r>
       <w:r>
+        <w:rPr>
+          <w:highlight w:val="yellow"/>
+        </w:rPr>
         <w:t xml:space="preserve"> Figure 20</w:t>
       </w:r>
       <w:r>
+        <w:rPr>
+          <w:highlight w:val="yellow"/>
+        </w:rPr>
         <w:t>.</w:t>
       </w:r>
     </w:p>
@@ -7439,10 +7469,14 @@
       <w:pPr>
         <w:keepNext/>
         <w:spacing w:before="120" w:after="120"/>
+        <w:rPr>
+          <w:highlight w:val="yellow"/>
+        </w:rPr>
       </w:pPr>
       <w:r>
         <w:rPr>
           <w:noProof/>
+          <w:highlight w:val="yellow"/>
         </w:rPr>
         <w:drawing>
           <wp:inline distT="0" distB="0" distL="0" distR="0" wp14:anchorId="07B5B550" wp14:editId="4E918161">
@@ -7485,25 +7519,61 @@
       <w:pPr>
         <w:pStyle w:val="Caption"/>
         <w:spacing w:after="480"/>
+        <w:rPr>
+          <w:highlight w:val="yellow"/>
+        </w:rPr>
       </w:pPr>
       <w:bookmarkStart w:id="24" w:name="_Ref192032688"/>
       <w:r>
+        <w:rPr>
+          <w:highlight w:val="yellow"/>
+        </w:rPr>
         <w:t xml:space="preserve">Figure </w:t>
       </w:r>
-      <w:fldSimple w:instr=" SEQ Figure \* ARABIC ">
-        <w:r>
-          <w:rPr>
-            <w:noProof/>
-          </w:rPr>
-          <w:t>20</w:t>
-        </w:r>
-      </w:fldSimple>
+      <w:r>
+        <w:rPr>
+          <w:highlight w:val="yellow"/>
+        </w:rPr>
+        <w:fldChar w:fldCharType="begin"/>
+      </w:r>
+      <w:r>
+        <w:rPr>
+          <w:highlight w:val="yellow"/>
+        </w:rPr>
+        <w:instrText xml:space="preserve"> SEQ Figure \* ARABIC </w:instrText>
+      </w:r>
+      <w:r>
+        <w:rPr>
+          <w:highlight w:val="yellow"/>
+        </w:rPr>
+        <w:fldChar w:fldCharType="separate"/>
+      </w:r>
+      <w:r>
+        <w:rPr>
+          <w:noProof/>
+          <w:highlight w:val="yellow"/>
+        </w:rPr>
+        <w:t>20</w:t>
+      </w:r>
+      <w:r>
+        <w:rPr>
+          <w:noProof/>
+          <w:highlight w:val="yellow"/>
+        </w:rPr>
+        <w:fldChar w:fldCharType="end"/>
+      </w:r>
       <w:bookmarkEnd w:id="24"/>
       <w:r>
+        <w:rPr>
+          <w:highlight w:val="yellow"/>
+        </w:rPr>
         <w:t xml:space="preserve">: Click event handler for </w:t>
       </w:r>
       <w:proofErr w:type="spellStart"/>
       <w:r>
+        <w:rPr>
+          <w:highlight w:val="yellow"/>
+        </w:rPr>
         <w:t>btnTarget</w:t>
       </w:r>
       <w:proofErr w:type="spellEnd"/>
@@ -7519,38 +7589,71 @@
         <w:spacing w:before="120" w:after="480"/>
         <w:ind w:left="360"/>
         <w:contextualSpacing w:val="0"/>
-      </w:pPr>
-      <w:r>
+        <w:rPr>
+          <w:highlight w:val="yellow"/>
+        </w:rPr>
+      </w:pPr>
+      <w:r>
+        <w:rPr>
+          <w:highlight w:val="yellow"/>
+        </w:rPr>
         <w:lastRenderedPageBreak/>
         <w:t xml:space="preserve">To move the target button around the screen, we will need to create a </w:t>
       </w:r>
       <w:r>
+        <w:rPr>
+          <w:highlight w:val="yellow"/>
+        </w:rPr>
         <w:t xml:space="preserve">random object to generate new locations. Open the code behind </w:t>
       </w:r>
       <w:proofErr w:type="spellStart"/>
       <w:r>
+        <w:rPr>
+          <w:highlight w:val="yellow"/>
+        </w:rPr>
         <w:t>FrmStopwatch</w:t>
       </w:r>
       <w:proofErr w:type="spellEnd"/>
       <w:r>
+        <w:rPr>
+          <w:highlight w:val="yellow"/>
+        </w:rPr>
         <w:t xml:space="preserve"> and add a class</w:t>
       </w:r>
       <w:r>
+        <w:rPr>
+          <w:highlight w:val="yellow"/>
+        </w:rPr>
         <w:t>-</w:t>
       </w:r>
       <w:r>
+        <w:rPr>
+          <w:highlight w:val="yellow"/>
+        </w:rPr>
         <w:t>level variable named Random</w:t>
       </w:r>
       <w:r>
+        <w:rPr>
+          <w:highlight w:val="yellow"/>
+        </w:rPr>
         <w:t>,</w:t>
       </w:r>
       <w:r>
+        <w:rPr>
+          <w:highlight w:val="yellow"/>
+        </w:rPr>
         <w:t xml:space="preserve"> as shown in</w:t>
       </w:r>
       <w:r>
+        <w:rPr>
+          <w:highlight w:val="yellow"/>
+        </w:rPr>
         <w:t xml:space="preserve"> Figure 21</w:t>
       </w:r>
       <w:r>
+        <w:rPr>
+          <w:highlight w:val="yellow"/>
+        </w:rPr>
         <w:t>.</w:t>
       </w:r>
     </w:p>
@@ -7558,10 +7661,14 @@
       <w:pPr>
         <w:keepNext/>
         <w:spacing w:before="120" w:after="120"/>
+        <w:rPr>
+          <w:highlight w:val="yellow"/>
+        </w:rPr>
       </w:pPr>
       <w:r>
         <w:rPr>
           <w:noProof/>
+          <w:highlight w:val="yellow"/>
         </w:rPr>
         <w:drawing>
           <wp:inline distT="0" distB="0" distL="0" distR="0" wp14:anchorId="11500884" wp14:editId="3F1D5356">
@@ -7604,21 +7711,54 @@
       <w:pPr>
         <w:pStyle w:val="Caption"/>
         <w:spacing w:after="480"/>
+        <w:rPr>
+          <w:highlight w:val="yellow"/>
+        </w:rPr>
       </w:pPr>
       <w:bookmarkStart w:id="25" w:name="_Ref192029869"/>
       <w:r>
+        <w:rPr>
+          <w:highlight w:val="yellow"/>
+        </w:rPr>
         <w:t xml:space="preserve">Figure </w:t>
       </w:r>
-      <w:fldSimple w:instr=" SEQ Figure \* ARABIC ">
-        <w:r>
-          <w:rPr>
-            <w:noProof/>
-          </w:rPr>
-          <w:t>21</w:t>
-        </w:r>
-      </w:fldSimple>
+      <w:r>
+        <w:rPr>
+          <w:highlight w:val="yellow"/>
+        </w:rPr>
+        <w:fldChar w:fldCharType="begin"/>
+      </w:r>
+      <w:r>
+        <w:rPr>
+          <w:highlight w:val="yellow"/>
+        </w:rPr>
+        <w:instrText xml:space="preserve"> SEQ Figure \* ARABIC </w:instrText>
+      </w:r>
+      <w:r>
+        <w:rPr>
+          <w:highlight w:val="yellow"/>
+        </w:rPr>
+        <w:fldChar w:fldCharType="separate"/>
+      </w:r>
+      <w:r>
+        <w:rPr>
+          <w:noProof/>
+          <w:highlight w:val="yellow"/>
+        </w:rPr>
+        <w:t>21</w:t>
+      </w:r>
+      <w:r>
+        <w:rPr>
+          <w:noProof/>
+          <w:highlight w:val="yellow"/>
+        </w:rPr>
+        <w:fldChar w:fldCharType="end"/>
+      </w:r>
       <w:bookmarkEnd w:id="25"/>
       <w:r>
+        <w:rPr>
+          <w:highlight w:val="yellow"/>
+        </w:rPr>
         <w:t>: Adding a random object to generate numbers</w:t>
       </w:r>
     </w:p>
@@ -7632,36 +7772,66 @@
         <w:spacing w:before="120" w:after="480"/>
         <w:ind w:left="360"/>
         <w:contextualSpacing w:val="0"/>
-      </w:pPr>
-      <w:r>
+        <w:rPr>
+          <w:highlight w:val="yellow"/>
+        </w:rPr>
+      </w:pPr>
+      <w:r>
+        <w:rPr>
+          <w:highlight w:val="yellow"/>
+        </w:rPr>
         <w:t xml:space="preserve">Next, we will update our </w:t>
       </w:r>
       <w:proofErr w:type="spellStart"/>
       <w:r>
+        <w:rPr>
+          <w:highlight w:val="yellow"/>
+        </w:rPr>
         <w:t>TmrStopwatchTickEH</w:t>
       </w:r>
       <w:proofErr w:type="spellEnd"/>
       <w:r>
+        <w:rPr>
+          <w:highlight w:val="yellow"/>
+        </w:rPr>
         <w:t xml:space="preserve"> method to randomly relocate the Target button. First, update the summary comment for </w:t>
       </w:r>
       <w:proofErr w:type="spellStart"/>
       <w:r>
+        <w:rPr>
+          <w:highlight w:val="yellow"/>
+        </w:rPr>
         <w:t>TmrStopwatchTickEH</w:t>
       </w:r>
       <w:proofErr w:type="spellEnd"/>
       <w:r>
+        <w:rPr>
+          <w:highlight w:val="yellow"/>
+        </w:rPr>
         <w:t xml:space="preserve"> and add an end-of-method comment to the method</w:t>
       </w:r>
       <w:r>
+        <w:rPr>
+          <w:highlight w:val="yellow"/>
+        </w:rPr>
         <w:t>,</w:t>
       </w:r>
       <w:r>
+        <w:rPr>
+          <w:highlight w:val="yellow"/>
+        </w:rPr>
         <w:t xml:space="preserve"> as shown in</w:t>
       </w:r>
       <w:r>
+        <w:rPr>
+          <w:highlight w:val="yellow"/>
+        </w:rPr>
         <w:t xml:space="preserve"> Figure 22</w:t>
       </w:r>
       <w:r>
+        <w:rPr>
+          <w:highlight w:val="yellow"/>
+        </w:rPr>
         <w:t>.</w:t>
       </w:r>
     </w:p>
@@ -7669,10 +7839,14 @@
       <w:pPr>
         <w:keepNext/>
         <w:spacing w:before="120" w:after="120"/>
+        <w:rPr>
+          <w:highlight w:val="yellow"/>
+        </w:rPr>
       </w:pPr>
       <w:r>
         <w:rPr>
           <w:noProof/>
+          <w:highlight w:val="yellow"/>
         </w:rPr>
         <w:drawing>
           <wp:inline distT="0" distB="0" distL="0" distR="0" wp14:anchorId="031B67DE" wp14:editId="6312CFB3">
@@ -7715,31 +7889,75 @@
       <w:pPr>
         <w:pStyle w:val="Caption"/>
         <w:spacing w:after="480"/>
+        <w:rPr>
+          <w:highlight w:val="yellow"/>
+        </w:rPr>
       </w:pPr>
       <w:bookmarkStart w:id="26" w:name="_Ref192030537"/>
       <w:r>
+        <w:rPr>
+          <w:highlight w:val="yellow"/>
+        </w:rPr>
         <w:t xml:space="preserve">Figure </w:t>
       </w:r>
-      <w:fldSimple w:instr=" SEQ Figure \* ARABIC ">
-        <w:r>
-          <w:rPr>
-            <w:noProof/>
-          </w:rPr>
-          <w:t>22</w:t>
-        </w:r>
-      </w:fldSimple>
+      <w:r>
+        <w:rPr>
+          <w:highlight w:val="yellow"/>
+        </w:rPr>
+        <w:fldChar w:fldCharType="begin"/>
+      </w:r>
+      <w:r>
+        <w:rPr>
+          <w:highlight w:val="yellow"/>
+        </w:rPr>
+        <w:instrText xml:space="preserve"> SEQ Figure \* ARABIC </w:instrText>
+      </w:r>
+      <w:r>
+        <w:rPr>
+          <w:highlight w:val="yellow"/>
+        </w:rPr>
+        <w:fldChar w:fldCharType="separate"/>
+      </w:r>
+      <w:r>
+        <w:rPr>
+          <w:noProof/>
+          <w:highlight w:val="yellow"/>
+        </w:rPr>
+        <w:t>22</w:t>
+      </w:r>
+      <w:r>
+        <w:rPr>
+          <w:noProof/>
+          <w:highlight w:val="yellow"/>
+        </w:rPr>
+        <w:fldChar w:fldCharType="end"/>
+      </w:r>
       <w:bookmarkEnd w:id="26"/>
       <w:r>
+        <w:rPr>
+          <w:highlight w:val="yellow"/>
+        </w:rPr>
         <w:t xml:space="preserve">: Updated summary comment and end-of-method comment for </w:t>
       </w:r>
       <w:proofErr w:type="spellStart"/>
       <w:r>
+        <w:rPr>
+          <w:highlight w:val="yellow"/>
+        </w:rPr>
         <w:t>TmrStopwatchTickEH</w:t>
       </w:r>
       <w:proofErr w:type="spellEnd"/>
     </w:p>
     <w:p>
-      <w:r>
+      <w:pPr>
+        <w:rPr>
+          <w:highlight w:val="yellow"/>
+        </w:rPr>
+      </w:pPr>
+      <w:r>
+        <w:rPr>
+          <w:highlight w:val="yellow"/>
+        </w:rPr>
         <w:br w:type="page"/>
       </w:r>
     </w:p>
@@ -7753,41 +7971,77 @@
         <w:spacing w:before="120" w:after="480"/>
         <w:ind w:left="360"/>
         <w:contextualSpacing w:val="0"/>
-      </w:pPr>
-      <w:r>
+        <w:rPr>
+          <w:highlight w:val="yellow"/>
+        </w:rPr>
+      </w:pPr>
+      <w:r>
+        <w:rPr>
+          <w:highlight w:val="yellow"/>
+        </w:rPr>
         <w:lastRenderedPageBreak/>
         <w:t>We will relocate the target button every 3 seconds</w:t>
       </w:r>
       <w:r>
+        <w:rPr>
+          <w:highlight w:val="yellow"/>
+        </w:rPr>
         <w:t xml:space="preserve"> by checking </w:t>
       </w:r>
       <w:r>
-        <w:t>whether</w:t>
-      </w:r>
-      <w:r>
-        <w:t xml:space="preserve"> </w:t>
-      </w:r>
-      <w:r>
-        <w:t xml:space="preserve">the time elapsed in seconds is divisible by 3. If it is, we can generate numbers for the Top, Left, and </w:t>
+        <w:rPr>
+          <w:highlight w:val="yellow"/>
+        </w:rPr>
+        <w:t xml:space="preserve">whether </w:t>
+      </w:r>
+      <w:r>
+        <w:rPr>
+          <w:highlight w:val="yellow"/>
+        </w:rPr>
+        <w:t xml:space="preserve">the time elapsed in </w:t>
+      </w:r>
+      <w:r>
+        <w:rPr>
+          <w:highlight w:val="yellow"/>
+        </w:rPr>
+        <w:t xml:space="preserve">seconds is divisible by 3. If it is, we can generate numbers for the Top, Left, and </w:t>
       </w:r>
       <w:proofErr w:type="spellStart"/>
       <w:r>
+        <w:rPr>
+          <w:highlight w:val="yellow"/>
+        </w:rPr>
         <w:t>BackColor</w:t>
       </w:r>
       <w:proofErr w:type="spellEnd"/>
       <w:r>
+        <w:rPr>
+          <w:highlight w:val="yellow"/>
+        </w:rPr>
         <w:t xml:space="preserve"> properties for the target button and set the control to be visible</w:t>
       </w:r>
       <w:r>
+        <w:rPr>
+          <w:highlight w:val="yellow"/>
+        </w:rPr>
         <w:t>,</w:t>
       </w:r>
       <w:r>
+        <w:rPr>
+          <w:highlight w:val="yellow"/>
+        </w:rPr>
         <w:t xml:space="preserve"> as shown in</w:t>
       </w:r>
       <w:r>
+        <w:rPr>
+          <w:highlight w:val="yellow"/>
+        </w:rPr>
         <w:t xml:space="preserve"> Figure 23</w:t>
       </w:r>
       <w:r>
+        <w:rPr>
+          <w:highlight w:val="yellow"/>
+        </w:rPr>
         <w:t>.</w:t>
       </w:r>
     </w:p>
@@ -7795,10 +8049,14 @@
       <w:pPr>
         <w:keepNext/>
         <w:spacing w:before="120" w:after="120"/>
+        <w:rPr>
+          <w:highlight w:val="yellow"/>
+        </w:rPr>
       </w:pPr>
       <w:r>
         <w:rPr>
           <w:noProof/>
+          <w:highlight w:val="yellow"/>
         </w:rPr>
         <w:drawing>
           <wp:inline distT="0" distB="0" distL="0" distR="0" wp14:anchorId="43506294" wp14:editId="63B6EE7A">
@@ -7841,39 +8099,82 @@
       <w:pPr>
         <w:pStyle w:val="Caption"/>
         <w:spacing w:after="480"/>
+        <w:rPr>
+          <w:highlight w:val="yellow"/>
+        </w:rPr>
       </w:pPr>
       <w:bookmarkStart w:id="27" w:name="_Ref192032322"/>
       <w:r>
+        <w:rPr>
+          <w:highlight w:val="yellow"/>
+        </w:rPr>
         <w:t xml:space="preserve">Figure </w:t>
       </w:r>
-      <w:fldSimple w:instr=" SEQ Figure \* ARABIC ">
-        <w:r>
-          <w:rPr>
-            <w:noProof/>
-          </w:rPr>
-          <w:t>23</w:t>
-        </w:r>
-      </w:fldSimple>
+      <w:r>
+        <w:rPr>
+          <w:highlight w:val="yellow"/>
+        </w:rPr>
+        <w:fldChar w:fldCharType="begin"/>
+      </w:r>
+      <w:r>
+        <w:rPr>
+          <w:highlight w:val="yellow"/>
+        </w:rPr>
+        <w:instrText xml:space="preserve"> SEQ Figure \* ARABIC </w:instrText>
+      </w:r>
+      <w:r>
+        <w:rPr>
+          <w:highlight w:val="yellow"/>
+        </w:rPr>
+        <w:fldChar w:fldCharType="separate"/>
+      </w:r>
+      <w:r>
+        <w:rPr>
+          <w:noProof/>
+          <w:highlight w:val="yellow"/>
+        </w:rPr>
+        <w:t>23</w:t>
+      </w:r>
+      <w:r>
+        <w:rPr>
+          <w:noProof/>
+          <w:highlight w:val="yellow"/>
+        </w:rPr>
+        <w:fldChar w:fldCharType="end"/>
+      </w:r>
       <w:bookmarkEnd w:id="27"/>
       <w:r>
+        <w:rPr>
+          <w:highlight w:val="yellow"/>
+        </w:rPr>
         <w:t xml:space="preserve">: Adding logic to </w:t>
       </w:r>
       <w:proofErr w:type="spellStart"/>
       <w:r>
+        <w:rPr>
+          <w:highlight w:val="yellow"/>
+        </w:rPr>
         <w:t>TmrStopwatchTickEH</w:t>
       </w:r>
       <w:proofErr w:type="spellEnd"/>
       <w:r>
+        <w:rPr>
+          <w:highlight w:val="yellow"/>
+        </w:rPr>
         <w:t xml:space="preserve"> to relocate the target every 3 seconds</w:t>
       </w:r>
     </w:p>
     <w:p>
       <w:pPr>
         <w:spacing w:before="120" w:after="480"/>
+        <w:rPr>
+          <w:highlight w:val="yellow"/>
+        </w:rPr>
       </w:pPr>
       <w:r>
         <w:rPr>
           <w:noProof/>
+          <w:highlight w:val="yellow"/>
         </w:rPr>
         <mc:AlternateContent>
           <mc:Choice Requires="wpg">
@@ -7986,12 +8287,14 @@
                                 <w:rPr>
                                   <w:sz w:val="20"/>
                                   <w:szCs w:val="20"/>
+                                  <w:highlight w:val="yellow"/>
                                 </w:rPr>
                               </w:pPr>
                               <w:r>
                                 <w:rPr>
                                   <w:sz w:val="22"/>
                                   <w:szCs w:val="22"/>
+                                  <w:highlight w:val="yellow"/>
                                 </w:rPr>
                                 <w:t>Commit all changes in the project to source control</w:t>
                               </w:r>
@@ -7999,6 +8302,7 @@
                                 <w:rPr>
                                   <w:sz w:val="22"/>
                                   <w:szCs w:val="22"/>
+                                  <w:highlight w:val="yellow"/>
                                 </w:rPr>
                                 <w:t>.</w:t>
                               </w:r>
@@ -8015,12 +8319,14 @@
                                 <w:rPr>
                                   <w:sz w:val="20"/>
                                   <w:szCs w:val="20"/>
+                                  <w:highlight w:val="yellow"/>
                                 </w:rPr>
                               </w:pPr>
                               <w:r>
                                 <w:rPr>
                                   <w:sz w:val="22"/>
                                   <w:szCs w:val="22"/>
+                                  <w:highlight w:val="yellow"/>
                                 </w:rPr>
                                 <w:t>Commit Message: Add functionality to move the target as well as hide it when clicked by the user</w:t>
                               </w:r>
@@ -8028,6 +8334,7 @@
                                 <w:rPr>
                                   <w:sz w:val="22"/>
                                   <w:szCs w:val="22"/>
+                                  <w:highlight w:val="yellow"/>
                                 </w:rPr>
                                 <w:t>.</w:t>
                               </w:r>
@@ -8065,12 +8372,14 @@
                           <w:rPr>
                             <w:sz w:val="20"/>
                             <w:szCs w:val="20"/>
+                            <w:highlight w:val="yellow"/>
                           </w:rPr>
                         </w:pPr>
                         <w:r>
                           <w:rPr>
                             <w:sz w:val="22"/>
                             <w:szCs w:val="22"/>
+                            <w:highlight w:val="yellow"/>
                           </w:rPr>
                           <w:t>Commit all changes in the project to source control</w:t>
                         </w:r>
@@ -8078,6 +8387,7 @@
                           <w:rPr>
                             <w:sz w:val="22"/>
                             <w:szCs w:val="22"/>
+                            <w:highlight w:val="yellow"/>
                           </w:rPr>
                           <w:t>.</w:t>
                         </w:r>
@@ -8094,12 +8404,14 @@
                           <w:rPr>
                             <w:sz w:val="20"/>
                             <w:szCs w:val="20"/>
+                            <w:highlight w:val="yellow"/>
                           </w:rPr>
                         </w:pPr>
                         <w:r>
                           <w:rPr>
                             <w:sz w:val="22"/>
                             <w:szCs w:val="22"/>
+                            <w:highlight w:val="yellow"/>
                           </w:rPr>
                           <w:t>Commit Message: Add functionality to move the target as well as hide it when clicked by the user</w:t>
                         </w:r>
@@ -8107,6 +8419,7 @@
                           <w:rPr>
                             <w:sz w:val="22"/>
                             <w:szCs w:val="22"/>
+                            <w:highlight w:val="yellow"/>
                           </w:rPr>
                           <w:t>.</w:t>
                         </w:r>
@@ -8124,10 +8437,14 @@
     <w:p>
       <w:pPr>
         <w:spacing w:before="120" w:after="480"/>
+        <w:rPr>
+          <w:highlight w:val="yellow"/>
+        </w:rPr>
       </w:pPr>
       <w:r>
         <w:rPr>
           <w:noProof/>
+          <w:highlight w:val="yellow"/>
         </w:rPr>
         <mc:AlternateContent>
           <mc:Choice Requires="wpg">
@@ -8209,33 +8526,22 @@
                                 <w:rPr>
                                   <w:sz w:val="20"/>
                                   <w:szCs w:val="20"/>
+                                  <w:highlight w:val="yellow"/>
                                 </w:rPr>
                               </w:pPr>
                               <w:r>
                                 <w:rPr>
                                   <w:sz w:val="20"/>
                                   <w:szCs w:val="20"/>
+                                  <w:highlight w:val="yellow"/>
                                 </w:rPr>
-                                <w:t>Take a screenshot of the application</w:t>
+                                <w:t>Take a screenshot of the application running at this point</w:t>
                               </w:r>
                               <w:r>
                                 <w:rPr>
                                   <w:sz w:val="20"/>
                                   <w:szCs w:val="20"/>
-                                </w:rPr>
-                                <w:t xml:space="preserve"> running</w:t>
-                              </w:r>
-                              <w:r>
-                                <w:rPr>
-                                  <w:sz w:val="20"/>
-                                  <w:szCs w:val="20"/>
-                                </w:rPr>
-                                <w:t xml:space="preserve"> at this point</w:t>
-                              </w:r>
-                              <w:r>
-                                <w:rPr>
-                                  <w:sz w:val="20"/>
-                                  <w:szCs w:val="20"/>
+                                  <w:highlight w:val="yellow"/>
                                 </w:rPr>
                                 <w:t>.</w:t>
                               </w:r>
@@ -8251,12 +8557,14 @@
                                 <w:rPr>
                                   <w:sz w:val="20"/>
                                   <w:szCs w:val="20"/>
+                                  <w:highlight w:val="yellow"/>
                                 </w:rPr>
                               </w:pPr>
                               <w:r>
                                 <w:rPr>
                                   <w:sz w:val="20"/>
                                   <w:szCs w:val="20"/>
+                                  <w:highlight w:val="yellow"/>
                                 </w:rPr>
                                 <w:t xml:space="preserve">Take a screenshot of the </w:t>
                               </w:r>
@@ -8265,6 +8573,7 @@
                                 <w:rPr>
                                   <w:sz w:val="20"/>
                                   <w:szCs w:val="20"/>
+                                  <w:highlight w:val="yellow"/>
                                 </w:rPr>
                                 <w:t>BtnTargetClickEH</w:t>
                               </w:r>
@@ -8273,6 +8582,7 @@
                                 <w:rPr>
                                   <w:sz w:val="20"/>
                                   <w:szCs w:val="20"/>
+                                  <w:highlight w:val="yellow"/>
                                 </w:rPr>
                                 <w:t xml:space="preserve"> </w:t>
                               </w:r>
@@ -8280,6 +8590,7 @@
                                 <w:rPr>
                                   <w:sz w:val="20"/>
                                   <w:szCs w:val="20"/>
+                                  <w:highlight w:val="yellow"/>
                                 </w:rPr>
                                 <w:t xml:space="preserve">and </w:t>
                               </w:r>
@@ -8288,6 +8599,7 @@
                                 <w:rPr>
                                   <w:sz w:val="20"/>
                                   <w:szCs w:val="20"/>
+                                  <w:highlight w:val="yellow"/>
                                 </w:rPr>
                                 <w:t>TmrStopwatchTickEH</w:t>
                               </w:r>
@@ -8296,6 +8608,7 @@
                                 <w:rPr>
                                   <w:sz w:val="20"/>
                                   <w:szCs w:val="20"/>
+                                  <w:highlight w:val="yellow"/>
                                 </w:rPr>
                                 <w:t xml:space="preserve"> </w:t>
                               </w:r>
@@ -8303,6 +8616,7 @@
                                 <w:rPr>
                                   <w:sz w:val="20"/>
                                   <w:szCs w:val="20"/>
+                                  <w:highlight w:val="yellow"/>
                                 </w:rPr>
                                 <w:t>methods.</w:t>
                               </w:r>
@@ -8318,12 +8632,14 @@
                                 <w:rPr>
                                   <w:sz w:val="20"/>
                                   <w:szCs w:val="20"/>
+                                  <w:highlight w:val="yellow"/>
                                 </w:rPr>
                               </w:pPr>
                               <w:r>
                                 <w:rPr>
                                   <w:sz w:val="20"/>
                                   <w:szCs w:val="20"/>
+                                  <w:highlight w:val="yellow"/>
                                 </w:rPr>
                                 <w:t xml:space="preserve">Take a screenshot of the UML for the </w:t>
                               </w:r>
@@ -8332,6 +8648,7 @@
                                 <w:rPr>
                                   <w:sz w:val="20"/>
                                   <w:szCs w:val="20"/>
+                                  <w:highlight w:val="yellow"/>
                                 </w:rPr>
                                 <w:t>FrmStopwatch</w:t>
                               </w:r>
@@ -8340,6 +8657,7 @@
                                 <w:rPr>
                                   <w:sz w:val="20"/>
                                   <w:szCs w:val="20"/>
+                                  <w:highlight w:val="yellow"/>
                                 </w:rPr>
                                 <w:t xml:space="preserve"> class.</w:t>
                               </w:r>
@@ -8355,28 +8673,16 @@
                                 <w:rPr>
                                   <w:sz w:val="20"/>
                                   <w:szCs w:val="20"/>
+                                  <w:highlight w:val="yellow"/>
                                 </w:rPr>
                               </w:pPr>
                               <w:r>
                                 <w:rPr>
                                   <w:sz w:val="20"/>
                                   <w:szCs w:val="20"/>
+                                  <w:highlight w:val="yellow"/>
                                 </w:rPr>
-                                <w:t>Paste the image</w:t>
-                              </w:r>
-                              <w:r>
-                                <w:rPr>
-                                  <w:sz w:val="20"/>
-                                  <w:szCs w:val="20"/>
-                                </w:rPr>
-                                <w:t>s</w:t>
-                              </w:r>
-                              <w:r>
-                                <w:rPr>
-                                  <w:sz w:val="20"/>
-                                  <w:szCs w:val="20"/>
-                                </w:rPr>
-                                <w:t xml:space="preserve"> into a Word document.</w:t>
+                                <w:t>Paste the images into a Word document.</w:t>
                               </w:r>
                             </w:p>
                             <w:p>
@@ -8390,28 +8696,16 @@
                                 <w:rPr>
                                   <w:sz w:val="20"/>
                                   <w:szCs w:val="20"/>
+                                  <w:highlight w:val="yellow"/>
                                 </w:rPr>
                               </w:pPr>
                               <w:r>
                                 <w:rPr>
                                   <w:sz w:val="20"/>
                                   <w:szCs w:val="20"/>
+                                  <w:highlight w:val="yellow"/>
                                 </w:rPr>
-                                <w:t xml:space="preserve">Put a caption below </w:t>
-                              </w:r>
-                              <w:r>
-                                <w:rPr>
-                                  <w:sz w:val="20"/>
-                                  <w:szCs w:val="20"/>
-                                </w:rPr>
-                                <w:t>each</w:t>
-                              </w:r>
-                              <w:r>
-                                <w:rPr>
-                                  <w:sz w:val="20"/>
-                                  <w:szCs w:val="20"/>
-                                </w:rPr>
-                                <w:t xml:space="preserve"> image explaining what is being demonstrated.</w:t>
+                                <w:t>Put a caption below each image explaining what is being demonstrated.</w:t>
                               </w:r>
                             </w:p>
                           </w:txbxContent>
@@ -8449,33 +8743,22 @@
                           <w:rPr>
                             <w:sz w:val="20"/>
                             <w:szCs w:val="20"/>
+                            <w:highlight w:val="yellow"/>
                           </w:rPr>
                         </w:pPr>
                         <w:r>
                           <w:rPr>
                             <w:sz w:val="20"/>
                             <w:szCs w:val="20"/>
+                            <w:highlight w:val="yellow"/>
                           </w:rPr>
-                          <w:t>Take a screenshot of the application</w:t>
+                          <w:t>Take a screenshot of the application running at this point</w:t>
                         </w:r>
                         <w:r>
                           <w:rPr>
                             <w:sz w:val="20"/>
                             <w:szCs w:val="20"/>
-                          </w:rPr>
-                          <w:t xml:space="preserve"> running</w:t>
-                        </w:r>
-                        <w:r>
-                          <w:rPr>
-                            <w:sz w:val="20"/>
-                            <w:szCs w:val="20"/>
-                          </w:rPr>
-                          <w:t xml:space="preserve"> at this point</w:t>
-                        </w:r>
-                        <w:r>
-                          <w:rPr>
-                            <w:sz w:val="20"/>
-                            <w:szCs w:val="20"/>
+                            <w:highlight w:val="yellow"/>
                           </w:rPr>
                           <w:t>.</w:t>
                         </w:r>
@@ -8491,12 +8774,14 @@
                           <w:rPr>
                             <w:sz w:val="20"/>
                             <w:szCs w:val="20"/>
+                            <w:highlight w:val="yellow"/>
                           </w:rPr>
                         </w:pPr>
                         <w:r>
                           <w:rPr>
                             <w:sz w:val="20"/>
                             <w:szCs w:val="20"/>
+                            <w:highlight w:val="yellow"/>
                           </w:rPr>
                           <w:t xml:space="preserve">Take a screenshot of the </w:t>
                         </w:r>
@@ -8505,6 +8790,7 @@
                           <w:rPr>
                             <w:sz w:val="20"/>
                             <w:szCs w:val="20"/>
+                            <w:highlight w:val="yellow"/>
                           </w:rPr>
                           <w:t>BtnTargetClickEH</w:t>
                         </w:r>
@@ -8513,6 +8799,7 @@
                           <w:rPr>
                             <w:sz w:val="20"/>
                             <w:szCs w:val="20"/>
+                            <w:highlight w:val="yellow"/>
                           </w:rPr>
                           <w:t xml:space="preserve"> </w:t>
                         </w:r>
@@ -8520,6 +8807,7 @@
                           <w:rPr>
                             <w:sz w:val="20"/>
                             <w:szCs w:val="20"/>
+                            <w:highlight w:val="yellow"/>
                           </w:rPr>
                           <w:t xml:space="preserve">and </w:t>
                         </w:r>
@@ -8528,6 +8816,7 @@
                           <w:rPr>
                             <w:sz w:val="20"/>
                             <w:szCs w:val="20"/>
+                            <w:highlight w:val="yellow"/>
                           </w:rPr>
                           <w:t>TmrStopwatchTickEH</w:t>
                         </w:r>
@@ -8536,6 +8825,7 @@
                           <w:rPr>
                             <w:sz w:val="20"/>
                             <w:szCs w:val="20"/>
+                            <w:highlight w:val="yellow"/>
                           </w:rPr>
                           <w:t xml:space="preserve"> </w:t>
                         </w:r>
@@ -8543,6 +8833,7 @@
                           <w:rPr>
                             <w:sz w:val="20"/>
                             <w:szCs w:val="20"/>
+                            <w:highlight w:val="yellow"/>
                           </w:rPr>
                           <w:t>methods.</w:t>
                         </w:r>
@@ -8558,12 +8849,14 @@
                           <w:rPr>
                             <w:sz w:val="20"/>
                             <w:szCs w:val="20"/>
+                            <w:highlight w:val="yellow"/>
                           </w:rPr>
                         </w:pPr>
                         <w:r>
                           <w:rPr>
                             <w:sz w:val="20"/>
                             <w:szCs w:val="20"/>
+                            <w:highlight w:val="yellow"/>
                           </w:rPr>
                           <w:t xml:space="preserve">Take a screenshot of the UML for the </w:t>
                         </w:r>
@@ -8572,6 +8865,7 @@
                           <w:rPr>
                             <w:sz w:val="20"/>
                             <w:szCs w:val="20"/>
+                            <w:highlight w:val="yellow"/>
                           </w:rPr>
                           <w:t>FrmStopwatch</w:t>
                         </w:r>
@@ -8580,6 +8874,7 @@
                           <w:rPr>
                             <w:sz w:val="20"/>
                             <w:szCs w:val="20"/>
+                            <w:highlight w:val="yellow"/>
                           </w:rPr>
                           <w:t xml:space="preserve"> class.</w:t>
                         </w:r>
@@ -8595,28 +8890,16 @@
                           <w:rPr>
                             <w:sz w:val="20"/>
                             <w:szCs w:val="20"/>
+                            <w:highlight w:val="yellow"/>
                           </w:rPr>
                         </w:pPr>
                         <w:r>
                           <w:rPr>
                             <w:sz w:val="20"/>
                             <w:szCs w:val="20"/>
+                            <w:highlight w:val="yellow"/>
                           </w:rPr>
-                          <w:t>Paste the image</w:t>
-                        </w:r>
-                        <w:r>
-                          <w:rPr>
-                            <w:sz w:val="20"/>
-                            <w:szCs w:val="20"/>
-                          </w:rPr>
-                          <w:t>s</w:t>
-                        </w:r>
-                        <w:r>
-                          <w:rPr>
-                            <w:sz w:val="20"/>
-                            <w:szCs w:val="20"/>
-                          </w:rPr>
-                          <w:t xml:space="preserve"> into a Word document.</w:t>
+                          <w:t>Paste the images into a Word document.</w:t>
                         </w:r>
                       </w:p>
                       <w:p>
@@ -8630,28 +8913,16 @@
                           <w:rPr>
                             <w:sz w:val="20"/>
                             <w:szCs w:val="20"/>
+                            <w:highlight w:val="yellow"/>
                           </w:rPr>
                         </w:pPr>
                         <w:r>
                           <w:rPr>
                             <w:sz w:val="20"/>
                             <w:szCs w:val="20"/>
+                            <w:highlight w:val="yellow"/>
                           </w:rPr>
-                          <w:t xml:space="preserve">Put a caption below </w:t>
-                        </w:r>
-                        <w:r>
-                          <w:rPr>
-                            <w:sz w:val="20"/>
-                            <w:szCs w:val="20"/>
-                          </w:rPr>
-                          <w:t>each</w:t>
-                        </w:r>
-                        <w:r>
-                          <w:rPr>
-                            <w:sz w:val="20"/>
-                            <w:szCs w:val="20"/>
-                          </w:rPr>
-                          <w:t xml:space="preserve"> image explaining what is being demonstrated.</w:t>
+                          <w:t>Put a caption below each image explaining what is being demonstrated.</w:t>
                         </w:r>
                       </w:p>
                     </w:txbxContent>
@@ -8673,9 +8944,13 @@
           <w:color w:val="345A8A" w:themeColor="accent1" w:themeShade="B5"/>
           <w:sz w:val="32"/>
           <w:szCs w:val="32"/>
-        </w:rPr>
-      </w:pPr>
-      <w:r>
+          <w:highlight w:val="yellow"/>
+        </w:rPr>
+      </w:pPr>
+      <w:r>
+        <w:rPr>
+          <w:highlight w:val="yellow"/>
+        </w:rPr>
         <w:br w:type="page"/>
       </w:r>
     </w:p>
@@ -8685,12 +8960,14 @@
         <w:spacing w:before="120" w:after="480"/>
         <w:rPr>
           <w:rFonts w:asciiTheme="minorHAnsi" w:hAnsiTheme="minorHAnsi"/>
+          <w:highlight w:val="yellow"/>
         </w:rPr>
       </w:pPr>
       <w:bookmarkStart w:id="28" w:name="_Toc203031037"/>
       <w:r>
         <w:rPr>
           <w:rFonts w:asciiTheme="minorHAnsi" w:hAnsiTheme="minorHAnsi"/>
+          <w:highlight w:val="yellow"/>
         </w:rPr>
         <w:lastRenderedPageBreak/>
         <w:t>Part 3</w:t>
@@ -8698,12 +8975,14 @@
       <w:r>
         <w:rPr>
           <w:rFonts w:asciiTheme="minorHAnsi" w:hAnsiTheme="minorHAnsi"/>
+          <w:highlight w:val="yellow"/>
         </w:rPr>
         <w:t xml:space="preserve"> – Whack-A-Mole </w:t>
       </w:r>
       <w:r>
         <w:rPr>
           <w:rFonts w:asciiTheme="minorHAnsi" w:hAnsiTheme="minorHAnsi"/>
+          <w:highlight w:val="yellow"/>
         </w:rPr>
         <w:t>Challenges</w:t>
       </w:r>
@@ -8714,48 +8993,87 @@
         <w:spacing w:before="120" w:after="480"/>
       </w:pPr>
       <w:r>
+        <w:rPr>
+          <w:highlight w:val="yellow"/>
+        </w:rPr>
         <w:t>Now that you have created a basic game with a timer control</w:t>
       </w:r>
       <w:r>
+        <w:rPr>
+          <w:highlight w:val="yellow"/>
+        </w:rPr>
         <w:t>,</w:t>
       </w:r>
       <w:r>
+        <w:rPr>
+          <w:highlight w:val="yellow"/>
+        </w:rPr>
         <w:t xml:space="preserve"> add </w:t>
       </w:r>
       <w:r>
+        <w:rPr>
+          <w:highlight w:val="yellow"/>
+        </w:rPr>
         <w:t>a minimum of six</w:t>
       </w:r>
       <w:r>
+        <w:rPr>
+          <w:highlight w:val="yellow"/>
+        </w:rPr>
         <w:t xml:space="preserve"> of </w:t>
       </w:r>
       <w:r>
+        <w:rPr>
+          <w:highlight w:val="yellow"/>
+        </w:rPr>
         <w:t>the following features</w:t>
       </w:r>
       <w:r>
+        <w:rPr>
+          <w:highlight w:val="yellow"/>
+        </w:rPr>
         <w:t xml:space="preserve"> </w:t>
       </w:r>
       <w:r>
+        <w:rPr>
+          <w:highlight w:val="yellow"/>
+        </w:rPr>
         <w:t>using the principals of N-</w:t>
       </w:r>
       <w:r>
+        <w:rPr>
+          <w:highlight w:val="yellow"/>
+        </w:rPr>
         <w:t>l</w:t>
       </w:r>
       <w:r>
+        <w:rPr>
+          <w:highlight w:val="yellow"/>
+        </w:rPr>
         <w:t xml:space="preserve">ayer architecture </w:t>
       </w:r>
       <w:r>
+        <w:rPr>
+          <w:highlight w:val="yellow"/>
+        </w:rPr>
         <w:t xml:space="preserve">(See </w:t>
       </w:r>
       <w:r>
-        <w:t>instructor</w:t>
-      </w:r>
-      <w:r>
-        <w:t xml:space="preserve"> </w:t>
-      </w:r>
-      <w:r>
+        <w:rPr>
+          <w:highlight w:val="yellow"/>
+        </w:rPr>
+        <w:t xml:space="preserve">instructor </w:t>
+      </w:r>
+      <w:r>
+        <w:rPr>
+          <w:highlight w:val="yellow"/>
+        </w:rPr>
         <w:t>for selection)</w:t>
       </w:r>
       <w:r>
+        <w:rPr>
+          <w:highlight w:val="yellow"/>
+        </w:rPr>
         <w:t>.</w:t>
       </w:r>
     </w:p>
@@ -8772,12 +9090,14 @@
         <w:rPr>
           <w:b/>
           <w:bCs/>
+          <w:highlight w:val="yellow"/>
         </w:rPr>
       </w:pPr>
       <w:r>
         <w:rPr>
           <w:b/>
           <w:bCs/>
+          <w:highlight w:val="yellow"/>
         </w:rPr>
         <w:t>Score</w:t>
       </w:r>
@@ -8844,12 +9164,14 @@
         <w:rPr>
           <w:b/>
           <w:bCs/>
+          <w:highlight w:val="yellow"/>
         </w:rPr>
       </w:pPr>
       <w:r>
         <w:rPr>
           <w:b/>
           <w:bCs/>
+          <w:highlight w:val="yellow"/>
         </w:rPr>
         <w:t>End the Game</w:t>
       </w:r>
@@ -8881,12 +9203,14 @@
         <w:rPr>
           <w:b/>
           <w:bCs/>
+          <w:highlight w:val="yellow"/>
         </w:rPr>
       </w:pPr>
       <w:r>
         <w:rPr>
           <w:b/>
           <w:bCs/>
+          <w:highlight w:val="yellow"/>
         </w:rPr>
         <w:t>High Score Hall of Fame</w:t>
       </w:r>
@@ -8958,6 +9282,9 @@
     <w:p>
       <w:pPr>
         <w:spacing w:before="120" w:after="480"/>
+        <w:rPr>
+          <w:highlight w:val="yellow"/>
+        </w:rPr>
       </w:pPr>
       <w:r>
         <w:t xml:space="preserve">Send the scores to a text file using the business and DAO layers of </w:t>
@@ -8966,7 +9293,10 @@
         <w:t>N</w:t>
       </w:r>
       <w:r>
-        <w:t xml:space="preserve">-layer architecture so that future players can see past high scores. </w:t>
+        <w:t xml:space="preserve">-layer architecture so that </w:t>
+      </w:r>
+      <w:r>
+        <w:t xml:space="preserve">future players can see past high scores. </w:t>
       </w:r>
     </w:p>
     <w:p>
@@ -8982,12 +9312,14 @@
         <w:rPr>
           <w:b/>
           <w:bCs/>
+          <w:highlight w:val="yellow"/>
         </w:rPr>
       </w:pPr>
       <w:r>
         <w:rPr>
           <w:b/>
           <w:bCs/>
+          <w:highlight w:val="yellow"/>
         </w:rPr>
         <w:t>Penalty</w:t>
       </w:r>
@@ -8995,6 +9327,7 @@
         <w:rPr>
           <w:b/>
           <w:bCs/>
+          <w:highlight w:val="yellow"/>
         </w:rPr>
         <w:t xml:space="preserve"> Click</w:t>
       </w:r>
@@ -9121,12 +9454,14 @@
         <w:rPr>
           <w:b/>
           <w:bCs/>
+          <w:highlight w:val="yellow"/>
         </w:rPr>
       </w:pPr>
       <w:r>
         <w:rPr>
           <w:b/>
           <w:bCs/>
+          <w:highlight w:val="yellow"/>
         </w:rPr>
         <w:lastRenderedPageBreak/>
         <w:t>Custom Graphics</w:t>
@@ -9177,12 +9512,14 @@
         <w:rPr>
           <w:b/>
           <w:bCs/>
+          <w:highlight w:val="yellow"/>
         </w:rPr>
       </w:pPr>
       <w:r>
         <w:rPr>
           <w:b/>
           <w:bCs/>
+          <w:highlight w:val="yellow"/>
         </w:rPr>
         <w:t>Account for Form Resize</w:t>
       </w:r>
@@ -17826,16 +18163,25 @@
 </file>
 
 <file path=customXml/item1.xml><?xml version="1.0" encoding="utf-8"?>
+<b:Sources xmlns:b="http://schemas.openxmlformats.org/officeDocument/2006/bibliography" xmlns="http://schemas.openxmlformats.org/officeDocument/2006/bibliography" SelectedStyle="/APA.XSL" StyleName="APA"/>
+</file>
+
+<file path=customXml/item2.xml><?xml version="1.0" encoding="utf-8"?>
 <p:properties xmlns:p="http://schemas.microsoft.com/office/2006/metadata/properties" xmlns:xsi="http://www.w3.org/2001/XMLSchema-instance" xmlns:pc="http://schemas.microsoft.com/office/infopath/2007/PartnerControls">
   <documentManagement/>
 </p:properties>
 </file>
 
-<file path=customXml/item2.xml><?xml version="1.0" encoding="utf-8"?>
-<b:Sources xmlns:b="http://schemas.openxmlformats.org/officeDocument/2006/bibliography" xmlns="http://schemas.openxmlformats.org/officeDocument/2006/bibliography" SelectedStyle="/APA.XSL" StyleName="APA"/>
+<file path=customXml/item3.xml><?xml version="1.0" encoding="utf-8"?>
+<?mso-contentType ?>
+<FormTemplates xmlns="http://schemas.microsoft.com/sharepoint/v3/contenttype/forms">
+  <Display>DocumentLibraryForm</Display>
+  <Edit>DocumentLibraryForm</Edit>
+  <New>DocumentLibraryForm</New>
+</FormTemplates>
 </file>
 
-<file path=customXml/item3.xml><?xml version="1.0" encoding="utf-8"?>
+<file path=customXml/item4.xml><?xml version="1.0" encoding="utf-8"?>
 <ct:contentTypeSchema xmlns:ct="http://schemas.microsoft.com/office/2006/metadata/contentType" xmlns:ma="http://schemas.microsoft.com/office/2006/metadata/properties/metaAttributes" ct:_="" ma:_="" ma:contentTypeName="Document" ma:contentTypeID="0x01010007D12AF12D95694AA6344C672C327518" ma:contentTypeVersion="8" ma:contentTypeDescription="Create a new document." ma:contentTypeScope="" ma:versionID="8f7a0aec25e10ce396a14d38e2abe4d4">
   <xsd:schema xmlns:xsd="http://www.w3.org/2001/XMLSchema" xmlns:xs="http://www.w3.org/2001/XMLSchema" xmlns:p="http://schemas.microsoft.com/office/2006/metadata/properties" xmlns:ns2="d6cac377-2cf8-44f0-abe6-651387810930" xmlns:ns3="9452cacb-2e03-45ce-9ef6-fd1a0457f341" targetNamespace="http://schemas.microsoft.com/office/2006/metadata/properties" ma:root="true" ma:fieldsID="560c6bcc4542c9bdc732ad77cc5db800" ns2:_="" ns3:_="">
     <xsd:import namespace="d6cac377-2cf8-44f0-abe6-651387810930"/>
@@ -18026,16 +18372,15 @@
 </ct:contentTypeSchema>
 </file>
 
-<file path=customXml/item4.xml><?xml version="1.0" encoding="utf-8"?>
-<?mso-contentType ?>
-<FormTemplates xmlns="http://schemas.microsoft.com/sharepoint/v3/contenttype/forms">
-  <Display>DocumentLibraryForm</Display>
-  <Edit>DocumentLibraryForm</Edit>
-  <New>DocumentLibraryForm</New>
-</FormTemplates>
+<file path=customXml/itemProps1.xml><?xml version="1.0" encoding="utf-8"?>
+<ds:datastoreItem xmlns:ds="http://schemas.openxmlformats.org/officeDocument/2006/customXml" ds:itemID="{3C98F4BA-7E6B-48F8-9255-5526812861DF}">
+  <ds:schemaRefs>
+    <ds:schemaRef ds:uri="http://schemas.openxmlformats.org/officeDocument/2006/bibliography"/>
+  </ds:schemaRefs>
+</ds:datastoreItem>
 </file>
 
-<file path=customXml/itemProps1.xml><?xml version="1.0" encoding="utf-8"?>
+<file path=customXml/itemProps2.xml><?xml version="1.0" encoding="utf-8"?>
 <ds:datastoreItem xmlns:ds="http://schemas.openxmlformats.org/officeDocument/2006/customXml" ds:itemID="{209FEB97-EE36-4B37-842C-E21EFD8FE65E}">
   <ds:schemaRefs>
     <ds:schemaRef ds:uri="http://schemas.microsoft.com/office/2006/metadata/properties"/>
@@ -18044,15 +18389,15 @@
 </ds:datastoreItem>
 </file>
 
-<file path=customXml/itemProps2.xml><?xml version="1.0" encoding="utf-8"?>
-<ds:datastoreItem xmlns:ds="http://schemas.openxmlformats.org/officeDocument/2006/customXml" ds:itemID="{3C98F4BA-7E6B-48F8-9255-5526812861DF}">
+<file path=customXml/itemProps3.xml><?xml version="1.0" encoding="utf-8"?>
+<ds:datastoreItem xmlns:ds="http://schemas.openxmlformats.org/officeDocument/2006/customXml" ds:itemID="{C6D8047C-D8CD-42A4-8A57-EA6F4E1056B6}">
   <ds:schemaRefs>
-    <ds:schemaRef ds:uri="http://schemas.openxmlformats.org/officeDocument/2006/bibliography"/>
+    <ds:schemaRef ds:uri="http://schemas.microsoft.com/sharepoint/v3/contenttype/forms"/>
   </ds:schemaRefs>
 </ds:datastoreItem>
 </file>
 
-<file path=customXml/itemProps3.xml><?xml version="1.0" encoding="utf-8"?>
+<file path=customXml/itemProps4.xml><?xml version="1.0" encoding="utf-8"?>
 <ds:datastoreItem xmlns:ds="http://schemas.openxmlformats.org/officeDocument/2006/customXml" ds:itemID="{90FEC3CC-B124-4D30-B520-509CE07D006E}">
   <ds:schemaRefs>
     <ds:schemaRef ds:uri="http://schemas.microsoft.com/office/2006/metadata/contentType"/>
@@ -18069,12 +18414,4 @@
     <ds:schemaRef ds:uri="http://schemas.microsoft.com/internal/obd"/>
   </ds:schemaRefs>
 </ds:datastoreItem>
-</file>
-
-<file path=customXml/itemProps4.xml><?xml version="1.0" encoding="utf-8"?>
-<ds:datastoreItem xmlns:ds="http://schemas.openxmlformats.org/officeDocument/2006/customXml" ds:itemID="{C6D8047C-D8CD-42A4-8A57-EA6F4E1056B6}">
-  <ds:schemaRefs>
-    <ds:schemaRef ds:uri="http://schemas.microsoft.com/sharepoint/v3/contenttype/forms"/>
-  </ds:schemaRefs>
-</ds:datastoreItem>
 </file>
</xml_diff>